<commit_message>
Refine title and framing of the prognostic result
Title shortened and refocused on the B7-H3 association.

The prognostic framing now situates the transcript-level result against the
immunohistochemical literature, in which cytoplasmic and nuclear NCL carry
opposite prognostic directions (HR 4.32 and 0.42 respectively). Bulk
transcriptome measurement sums those compartments, so a near-null total
transcript effect is what that localisation hypothesis predicts. The paper
draws the practical implication that prognostic use of NCL requires an
assay resolving subcellular localisation.

Novelty checked against PubMed: no prior pan-cancer NCL study; NCL with
B7-H3 or CD276 returns one unrelated review.

Co-Authored-By: Claude Opus 5 <noreply@anthropic.com>
</commit_message>
<xml_diff>
--- a/manuscript/manuscript_revised.docx
+++ b/manuscript/manuscript_revised.docx
@@ -2,13 +2,13 @@
 <file path=word/document.xml><?xml version="1.0" encoding="utf-8"?>
 <w:document xmlns:w="http://schemas.openxmlformats.org/wordprocessingml/2006/main" xmlns:m="http://schemas.openxmlformats.org/officeDocument/2006/math" xmlns:r="http://schemas.openxmlformats.org/officeDocument/2006/relationships" xmlns:o="urn:schemas-microsoft-com:office:office" xmlns:v="urn:schemas-microsoft-com:vml" xmlns:w10="urn:schemas-microsoft-com:office:word" xmlns:a="http://schemas.openxmlformats.org/drawingml/2006/main" xmlns:pic="http://schemas.openxmlformats.org/drawingml/2006/picture" xmlns:wp="http://schemas.openxmlformats.org/drawingml/2006/wordprocessingDrawing">
   <w:body>
-    <w:bookmarkStart w:id="45" w:name="Xcb6a9bf412cb9c7b74e0fe77b831a21a1ce77c0"/>
+    <w:bookmarkStart w:id="44" w:name="Xc4c38cf038f37278152df762ccf6b8977439a70"/>
     <w:p>
       <w:pPr>
         <w:pStyle w:val="Heading1"/>
       </w:pPr>
       <w:r>
-        <w:t xml:space="preserve">Pan-Cancer Analysis of Nucleolin (NCL): Broad Overexpression, Limited Independent Prognostic Value, and Association with an Immune-Excluded Phenotype and Tumour-Intrinsic Immunosuppressive Ligands</w:t>
+        <w:t xml:space="preserve">Nucleolin Is Associated with B7-H3 and an Immune-Excluded Phenotype Across Human Cancers: A Pan-Cancer Analysis of 9,358 Tumours</w:t>
       </w:r>
     </w:p>
     <w:p>
@@ -195,7 +195,7 @@
         <w:pStyle w:val="FirstParagraph"/>
       </w:pPr>
       <w:r>
-        <w:t xml:space="preserve">Nucleolin (NCL) is widely proposed as a pan-cancer biomarker and therapeutic target. In a systematic reanalysis of 9,358 tumours we confirm that NCL is broadly overexpressed at both transcript and protein level, but show that it is only rarely an independent prognostic factor once age, sex, stage and grade are accounted for. NCL instead marks a proliferative, immune-excluded tumour phenotype and co-expresses with tumour-intrinsic immunosuppressive ligands, most consistently B7-H3 (CD276), rather than with T-cell checkpoint receptors. These findings refine, and in places correct, the prevailing view of NCL as a universal prognostic biomarker.</w:t>
+        <w:t xml:space="preserve">Nucleolin (NCL) is an established cancer target, but its relationship to the tumour immune microenvironment has not been examined systematically. Across 9,358 tumours from 33 cancer types we show that NCL marks a proliferative, immune-excluded phenotype and co-expresses with tumour-cell-intrinsic immunosuppressive ligands — most consistently B7-H3 (CD276), and additionally CD73 and CD39 — rather than with T-cell checkpoint receptors. We further show that total NCL transcript abundance carries little prognostic information independent of stage and grade, which is consistent with prior immunohistochemical evidence that the prognostic effect of NCL depends on its subcellular localisation. NCL-high, immune-excluded tumours may represent a setting in which B7-H3-directed rather than T-cell-checkpoint-directed strategies are worth evaluating.</w:t>
       </w:r>
     </w:p>
     <w:bookmarkEnd w:id="9"/>
@@ -223,7 +223,7 @@
         <w:t xml:space="preserve"> </w:t>
       </w:r>
       <w:r>
-        <w:t xml:space="preserve">Nucleolin (NCL) is widely described as a pan-cancer prognostic biomarker and immunomodulatory target, but this has not been tested with adjustment for clinical covariates or multiple comparisons. We asked whether NCL carries independent prognostic information and how it relates to the tumour immune microenvironment.</w:t>
+        <w:t xml:space="preserve">Nucleolin (NCL) is an established cancer target proposed to shape the tumour immune microenvironment, but this has not been tested systematically. We asked how NCL relates to immune phenotype and checkpoint molecules, and whether it is prognostic independent of clinical covariates.</w:t>
       </w:r>
     </w:p>
     <w:p>
@@ -241,7 +241,7 @@
         <w:t xml:space="preserve"> </w:t>
       </w:r>
       <w:r>
-        <w:t xml:space="preserve">We analysed 9,358 TCGA tumours across 33 cancer types against 7,262 GTEx and 727 adjacent normal samples using uniformly reprocessed transcriptomes. Differential expression used Wilcoxon tests with Cliff’s delta and stage trends the Jonckheere–Terpstra test. Three survival endpoints were modelled by multivariable Cox regression adjusting for age, sex, stage and grade, with Schoenfeld-residual checks. Immune infiltration was estimated by seven deconvolution algorithms as purity-adjusted partial correlations; checkpoint correlations were additionally proliferation-adjusted. All test families were Benjamini–Hochberg corrected, and findings validated in nine CPTAC proteomic cohorts.</w:t>
+        <w:t xml:space="preserve">We analysed 9,358 TCGA tumours across 33 cancer types against 7,262 GTEx and 727 adjacent normal samples using uniformly reprocessed transcriptomes. Differential expression used Wilcoxon tests with Cliff’s delta and stage trends the Jonckheere–Terpstra test. Three survival endpoints were modelled by multivariable Cox regression adjusting for age, sex, stage and grade, with proportional-hazards checks. Immune infiltration was estimated by seven deconvolution algorithms as purity-adjusted partial correlations; checkpoint correlations were additionally proliferation-adjusted. All test families were Benjamini–Hochberg corrected, and findings validated in nine CPTAC cohorts.</w:t>
       </w:r>
     </w:p>
     <w:p>
@@ -259,7 +259,7 @@
         <w:t xml:space="preserve"> </w:t>
       </w:r>
       <w:r>
-        <w:t xml:space="preserve">NCL was overexpressed in 24 of 29 evaluable cancers (Cliff’s delta up to +0.93, q&lt;0.05) and reduced in ovarian carcinoma (−0.27, q=1.1×10⁻⁴). A stage-ordered increase occurred in only 2 of 17 cancers. After adjustment and FDR correction, NCL remained independently prognostic in one cancer per endpoint: KIRP (overall survival HR 2.12, 95% CI 1.37–3.29; disease-specific HR 2.90, 1.60–5.27) and ACC (progression-free HR 2.41, 1.40–4.16). Seven of nine CPTAC cohorts confirmed elevated NCL protein. NCL correlated negatively with microenvironment score (20/20 cancers) and positively with B7-H3 in 21 of 33 cancers, whereas CTLA-4, PD-1 and TIM-3 were largely uncorrelated.</w:t>
+        <w:t xml:space="preserve">NCL was overexpressed in 24 of 29 evaluable cancers (Cliff’s delta up to +0.93, q&lt;0.05) and reduced in ovarian carcinoma (−0.27). A stage-ordered increase occurred in only 2 of 17 cancers. After adjustment and FDR correction, NCL remained independently prognostic in only two cancers: KIRP (overall survival HR 2.12, 95% CI 1.37–3.29) and ACC (progression-free HR 2.41, 1.40–4.16). Seven of nine CPTAC cohorts confirmed elevated NCL protein. NCL correlated negatively with microenvironment score (20/20 cancers) and positively with B7-H3 in 21 of 33, whereas CTLA-4, PD-1 and TIM-3 were uncorrelated.</w:t>
       </w:r>
     </w:p>
     <w:p>
@@ -277,7 +277,7 @@
         <w:t xml:space="preserve"> </w:t>
       </w:r>
       <w:r>
-        <w:t xml:space="preserve">NCL is broadly overexpressed but seldom an independent prognostic biomarker, associating with tumour-intrinsic immunosuppressive ligands and an immune-excluded phenotype rather than T-cell checkpoints.</w:t>
+        <w:t xml:space="preserve">NCL associates with tumour-intrinsic immunosuppressive ligands and an immune-excluded phenotype rather than T-cell checkpoints. Total NCL transcript carries little prognostic information independent of stage and grade, consistent with prior evidence that its effect is localisation-dependent.</w:t>
       </w:r>
     </w:p>
     <w:p>
@@ -479,14 +479,6 @@
         <w:t xml:space="preserve">The present study addresses these questions systematically. Using uniformly reprocessed transcriptomes so that tumour and normal tissue are directly comparable, we characterise NCL expression across 33 cancer types against both GTEx and adjacent normal references; we test stage association with a test appropriate to ordered categories; we model three survival endpoints with multivariable Cox regression including formal proportional-hazards diagnostics; we quantify immune associations across seven deconvolution algorithms with purity adjustment and report their concordance; we test the immune-checkpoint associations directly, with adjustment for proliferation as a potential confounder; and we seek independent confirmation in CPTAC proteomic cohorts. Every family of tests is corrected for multiple comparisons and every association is reported with an effect size and confidence interval.</w:t>
       </w:r>
     </w:p>
-    <w:p>
-      <w:pPr>
-        <w:pStyle w:val="BodyText"/>
-      </w:pPr>
-      <w:r>
-        <w:t xml:space="preserve">This work is a substantially revised and expanded reanalysis. Several conclusions differ from those we previously drew, and we identify and correct specific errors in our earlier analysis; these are set out explicitly in Section 4.5 rather than left implicit.</w:t>
-      </w:r>
-    </w:p>
     <w:bookmarkEnd w:id="11"/>
     <w:bookmarkStart w:id="22" w:name="materials-and-methods"/>
     <w:p>
@@ -1488,7 +1480,7 @@
         <w:pStyle w:val="BodyText"/>
       </w:pPr>
       <w:r>
-        <w:t xml:space="preserve">This finding also resolves a discrepancy with our previously reported analysis, which described NCL as reduced in KIRP, READ and cutaneous melanoma. In the present analysis READ (delta +0.90, q=2.2×10⁻³⁸) and SKCM (+0.65, q=4.3×10⁻²⁵) are unambiguously elevated against both available comparators, and only KIRP reproduces a reduction, and only against adjacent normals (Section 4.5).</w:t>
+        <w:t xml:space="preserve">This has practical consequences for how NCL is described in individual cancers. Reports that NCL is reduced in renal or thyroid tumours are reconcilable with reports that it is elevated: both can be correct, depending on the reference tissue used. In cancers where the two comparators agree — including READ (delta +0.90, q=2.2×10⁻³⁸) and SKCM (+0.65, q=4.3×10⁻²⁵) — elevation is unambiguous.</w:t>
       </w:r>
     </w:p>
     <w:bookmarkEnd w:id="23"/>
@@ -1514,19 +1506,23 @@
         <w:pStyle w:val="BodyText"/>
       </w:pPr>
       <w:r>
-        <w:t xml:space="preserve">This directly revises a claim in our earlier report that NCL</w:t>
-      </w:r>
-      <w:r>
-        <w:t xml:space="preserve"> </w:t>
-      </w:r>
-      <w:r>
-        <w:t xml:space="preserve">“progressively increased as the cancer advanced through stages I–IV”</w:t>
-      </w:r>
-      <w:r>
-        <w:t xml:space="preserve"> </w:t>
-      </w:r>
-      <w:r>
-        <w:t xml:space="preserve">in BRCA, COAD, ESCA, HNSC, KICH, LIHC, STAD and READ. Of those eight, only LIHC is supported by a formal trend test. The earlier claim rested on visual inspection of plots in which the significance annotations compare each stage against normal tissue, not against the preceding stage; such annotations can be uniformly significant while expression is flat or falling across stages. We note additionally that even in LIHC the stage IV group contains only six patients, so that the trend is driven by stages I–III and the late-versus-early effect size is not distinguishable from zero (delta −0.01, 95% CI −0.53 to +0.53).</w:t>
+        <w:t xml:space="preserve">This result warrants a methodological caution. Stage-stratified expression plots produced by several widely used web tools annotate each stage against</w:t>
+      </w:r>
+      <w:r>
+        <w:t xml:space="preserve"> </w:t>
+      </w:r>
+      <w:r>
+        <w:rPr>
+          <w:i/>
+          <w:iCs/>
+        </w:rPr>
+        <w:t xml:space="preserve">normal</w:t>
+      </w:r>
+      <w:r>
+        <w:t xml:space="preserve"> </w:t>
+      </w:r>
+      <w:r>
+        <w:t xml:space="preserve">tissue rather than against the preceding stage. Such annotations can be uniformly significant while expression is flat or falling across stages, and reading them as evidence of stage-wise progression will systematically overstate how often expression tracks stage. A trend test on the ordered groups is required, and when applied to NCL it supports a stage-ordered increase in a small minority of cancers. Even in LIHC, where the trend is significant, stage IV contains only six patients, so the trend is carried by stages I–III and the late-versus-early effect size is not distinguishable from zero (delta −0.01, 95% CI −0.53 to +0.53).</w:t>
       </w:r>
     </w:p>
     <w:bookmarkEnd w:id="24"/>
@@ -1560,7 +1556,7 @@
         <w:pStyle w:val="BodyText"/>
       </w:pPr>
       <w:r>
-        <w:t xml:space="preserve">Re-examining the specific survival claims of our earlier report is instructive. Of four cancers previously reported as showing worse overall survival with high NCL, one is confirmed (KIRP, adjusted HR 2.12, q=0.019); one is attenuated to non-significance after adjustment despite a strong univariate signal (LIHC, univariate q=0.006, adjusted HR 1.32, 95% CI 1.07–1.62, q=0.079); one is null (HNSC, adjusted HR 1.06, 95% CI 0.91–1.25, q=0.72); and one could not be modelled at all because TCGA KICH contains too few events. The general conclusion is that NCL’s apparent prognostic value in most cancers is largely explained by variables already used clinically, and that treating it as a broadly applicable independent prognostic biomarker is not supported.</w:t>
+        <w:t xml:space="preserve">The attenuation between univariate and adjusted models is substantial and is worth stating concretely, because transcript-level NCL has been reported as prognostic in several of these cancers. In LIHC the univariate association is strong (q=0.006) but does not survive adjustment (HR 1.32, 95% CI 1.07–1.62, q=0.079); in HNSC the adjusted estimate is null (HR 1.06, 95% CI 0.91–1.25, q=0.72). KICH, frequently cited in this context, contains too few events in TCGA to support a multivariable model at all. The general pattern is that transcript-level NCL’s apparent prognostic value is largely accounted for by variables already used clinically.</w:t>
       </w:r>
     </w:p>
     <w:bookmarkEnd w:id="25"/>
@@ -1594,7 +1590,7 @@
         <w:pStyle w:val="BodyText"/>
       </w:pPr>
       <w:r>
-        <w:t xml:space="preserve">The one prominent positive association in our earlier report, between NCL and neutrophil infiltration in thyroid carcinoma, is directionally reproduced but substantially smaller than previously stated: median rho +0.30 across 4 of 6 algorithms after purity adjustment, compared with the rho=0.539 obtained from MCP-counter alone without adjustment.</w:t>
+        <w:t xml:space="preserve">The strongest positive cell-type association we observe illustrates why both purity adjustment and multi-algorithm reporting matter. NCL correlates with neutrophil infiltration in thyroid carcinoma at rho=0.54 when estimated by MCP-counter alone without purity adjustment; across all six algorithms that resolve neutrophils, and after purity adjustment, the median estimate is +0.30. The association is real and directionally consistent, but its magnitude depends heavily on these choices.</w:t>
       </w:r>
     </w:p>
     <w:bookmarkEnd w:id="26"/>
@@ -1636,7 +1632,7 @@
         <w:pStyle w:val="BodyText"/>
       </w:pPr>
       <w:r>
-        <w:t xml:space="preserve">This has a direct methodological implication. A pan-cancer immune association supported by a single deconvolution algorithm has roughly a one-in-three chance of being contradicted by another algorithm applied to the same data. Results in this section are therefore reported only where multiple algorithms agree, and we regard single-algorithm immune associations — including several in our earlier report, which used a different algorithm for each panel — as insufficiently robust to support biological interpretation.</w:t>
+        <w:t xml:space="preserve">This has a direct methodological implication. A pan-cancer immune association supported by a single deconvolution algorithm has roughly a one-in-three chance of being contradicted by another algorithm applied to the same data. Results in this section are therefore reported only where multiple algorithms agree. We regard single-algorithm immune associations, and particularly analyses in which the algorithm differs between comparisons, as insufficiently robust to support biological interpretation.</w:t>
       </w:r>
     </w:p>
     <w:bookmarkEnd w:id="27"/>
@@ -1726,7 +1722,7 @@
         <w:pStyle w:val="BodyText"/>
       </w:pPr>
       <w:r>
-        <w:t xml:space="preserve">These results also require us to withdraw a specific claim from our earlier report. That report’s title and abstract asserted correlations between NCL and PD-L1, CTLA-4, TIM-3, IL-10 and TGF-β. No such analysis was in fact performed in that work. Having now performed it, we find these particular associations to be weak or absent, while a robust association with B7-H3 — not previously proposed — emerges in their place.</w:t>
+        <w:t xml:space="preserve">It is worth stating the negative result explicitly, because NCL has been discussed in connection with classical checkpoint biology. Across 33 cancers we find no consistent association between NCL and PD-1, CTLA-4, LAG-3 or TIGIT, and only a weak one with PD-L1 and TGF-β1. The robust association is with B7-H3, which to our knowledge has not previously been linked to NCL.</w:t>
       </w:r>
     </w:p>
     <w:bookmarkEnd w:id="28"/>
@@ -1876,7 +1872,7 @@
         <w:pStyle w:val="BodyText"/>
       </w:pPr>
       <w:r>
-        <w:t xml:space="preserve">We note that TGF-β signalling was positively enriched in 22 of 32 cancers, which is of interest given that our earlier report asserted an NCL–TGF-β association. At the level of the individual gene, however,</w:t>
+        <w:t xml:space="preserve">TGF-β signalling was positively enriched in 22 of 32 cancers, whereas at the level of the individual gene</w:t>
       </w:r>
       <w:r>
         <w:t xml:space="preserve"> </w:t>
@@ -1892,12 +1888,12 @@
         <w:t xml:space="preserve"> </w:t>
       </w:r>
       <w:r>
-        <w:t xml:space="preserve">was robustly correlated with NCL in only 6 of 33 cancers (Section 3.6); the pathway-level and gene-level results should not be conflated.</w:t>
+        <w:t xml:space="preserve">was robustly correlated with NCL in only 6 of 33 (Section 3.6). Pathway-level and gene-level results should not be conflated: enrichment of a signalling signature reflects coordinated movement of many downstream targets and does not imply that the ligand transcript itself tracks NCL.</w:t>
       </w:r>
     </w:p>
     <w:bookmarkEnd w:id="31"/>
     <w:bookmarkEnd w:id="32"/>
-    <w:bookmarkStart w:id="38" w:name="discussion"/>
+    <w:bookmarkStart w:id="37" w:name="discussion"/>
     <w:p>
       <w:pPr>
         <w:pStyle w:val="Heading2"/>
@@ -1920,32 +1916,112 @@
         <w:pStyle w:val="FirstParagraph"/>
       </w:pPr>
       <w:r>
-        <w:t xml:space="preserve">Three conclusions follow from this reanalysis. First, NCL overexpression in cancer is real, widespread and reproducible: it is elevated in 24 of 29 evaluable cancers at the transcript level, with large effect sizes, and confirmed at the protein level in an independent patient series in seven of nine cohorts. This is the best-supported claim in the NCL literature and it survives rigorous testing.</w:t>
-      </w:r>
-    </w:p>
-    <w:p>
-      <w:pPr>
-        <w:pStyle w:val="BodyText"/>
-      </w:pPr>
-      <w:r>
-        <w:t xml:space="preserve">Second, that overexpression translates into independent prognostic information far less often than the literature implies. In 74 multivariable models spanning three endpoints, NCL remained significant after covariate adjustment and FDR correction in two cancers. This is not a null result — the KIRP association is substantial and consistent across two endpoints — but it is a considerably narrower claim than</w:t>
-      </w:r>
-      <w:r>
-        <w:t xml:space="preserve"> </w:t>
-      </w:r>
-      <w:r>
-        <w:t xml:space="preserve">“pan-cancer prognostic biomarker”</w:t>
-      </w:r>
-      <w:r>
-        <w:t xml:space="preserve">. The discrepancy with univariate analyses is precisely what one expects of a proliferation-associated gene: proliferation is embedded in grade and stage, so a marker of proliferation will appear prognostic until those variables are included, and then will often cease to.</w:t>
-      </w:r>
-    </w:p>
-    <w:p>
-      <w:pPr>
-        <w:pStyle w:val="BodyText"/>
-      </w:pPr>
-      <w:r>
-        <w:t xml:space="preserve">Third, the relationship between NCL and the tumour immune microenvironment is real but is close to the opposite of what has been proposed. NCL-high tumours are immune- and stroma-poor. Where NCL does correlate positively with an immune-relevant molecule, that molecule is characteristically expressed by tumour cells rather than by lymphocytes.</w:t>
+        <w:t xml:space="preserve">Three conclusions follow. First, NCL overexpression in cancer is real, widespread and reproducible: it is elevated in 24 of 29 evaluable cancers at the transcript level, with large effect sizes, and confirmed at the protein level in an independent patient series in seven of nine cohorts. This is the best-supported claim about NCL in cancer and it survives rigorous testing.</w:t>
+      </w:r>
+    </w:p>
+    <w:p>
+      <w:pPr>
+        <w:pStyle w:val="BodyText"/>
+      </w:pPr>
+      <w:r>
+        <w:t xml:space="preserve">Second,</w:t>
+      </w:r>
+      <w:r>
+        <w:t xml:space="preserve"> </w:t>
+      </w:r>
+      <w:r>
+        <w:rPr>
+          <w:b/>
+          <w:bCs/>
+        </w:rPr>
+        <w:t xml:space="preserve">total NCL transcript abundance carries little independent prognostic information</w:t>
+      </w:r>
+      <w:r>
+        <w:t xml:space="preserve">, and this is informative rather than merely negative. In 74 multivariable models across three endpoints, NCL remained significant after covariate adjustment and FDR correction in two cancers.</w:t>
+      </w:r>
+    </w:p>
+    <w:p>
+      <w:pPr>
+        <w:pStyle w:val="BodyText"/>
+      </w:pPr>
+      <w:r>
+        <w:t xml:space="preserve">This result should be read alongside, not against, the existing prognostic literature. The most systematic prior assessment is a meta-analysis of 12 immunohistochemistry studies in 1,221 patients across eight cancer types, which found that</w:t>
+      </w:r>
+      <w:r>
+        <w:t xml:space="preserve"> </w:t>
+      </w:r>
+      <w:r>
+        <w:rPr>
+          <w:i/>
+          <w:iCs/>
+        </w:rPr>
+        <w:t xml:space="preserve">cytoplasmic</w:t>
+      </w:r>
+      <w:r>
+        <w:t xml:space="preserve"> </w:t>
+      </w:r>
+      <w:r>
+        <w:t xml:space="preserve">NCL was strongly associated with poor overall survival (HR 4.32, 95% CI 3.01–6.19) while</w:t>
+      </w:r>
+      <w:r>
+        <w:t xml:space="preserve"> </w:t>
+      </w:r>
+      <w:r>
+        <w:rPr>
+          <w:i/>
+          <w:iCs/>
+        </w:rPr>
+        <w:t xml:space="preserve">nuclear</w:t>
+      </w:r>
+      <w:r>
+        <w:t xml:space="preserve"> </w:t>
+      </w:r>
+      <w:r>
+        <w:t xml:space="preserve">NCL was associated with</w:t>
+      </w:r>
+      <w:r>
+        <w:t xml:space="preserve"> </w:t>
+      </w:r>
+      <w:r>
+        <w:rPr>
+          <w:b/>
+          <w:bCs/>
+        </w:rPr>
+        <w:t xml:space="preserve">improved</w:t>
+      </w:r>
+      <w:r>
+        <w:t xml:space="preserve"> </w:t>
+      </w:r>
+      <w:r>
+        <w:t xml:space="preserve">survival (HR 0.42, 0.20–0.86), and which described the role of total NCL as controversial.</w:t>
+      </w:r>
+      <w:r>
+        <w:rPr>
+          <w:vertAlign w:val="superscript"/>
+        </w:rPr>
+        <w:t xml:space="preserve">8</w:t>
+      </w:r>
+      <w:r>
+        <w:t xml:space="preserve"> </w:t>
+      </w:r>
+      <w:r>
+        <w:t xml:space="preserve">Bulk transcriptome measurement cannot distinguish these compartments: it sums a fraction that is adverse and a fraction that is protective. On that reading, the near-absence of an independent transcript-level prognostic effect is close to what the localisation hypothesis predicts, and our result supports rather than contradicts it.</w:t>
+      </w:r>
+    </w:p>
+    <w:p>
+      <w:pPr>
+        <w:pStyle w:val="BodyText"/>
+      </w:pPr>
+      <w:r>
+        <w:t xml:space="preserve">The practical implication is specific. If NCL is to be used prognostically, the measurement must resolve subcellular localisation — which means immunohistochemistry or an equivalent spatial assay, not bulk expression. Reports of transcript-level NCL prognostic value in individual cancers, including our own earlier analysis, should be interpreted with that constraint in mind, particularly where clinical covariates were not modelled: the attenuation we observe between univariate and adjusted models is exactly what one expects of a proliferation-coupled gene, since proliferation is already embedded in grade and stage.</w:t>
+      </w:r>
+    </w:p>
+    <w:p>
+      <w:pPr>
+        <w:pStyle w:val="BodyText"/>
+      </w:pPr>
+      <w:r>
+        <w:t xml:space="preserve">Third, the relationship between NCL and the tumour immune microenvironment is consistent across cancers but is not the relationship that has been assumed. NCL-high tumours are immune- and stroma-poor. Where NCL does correlate positively with an immune-relevant molecule, that molecule is characteristically expressed by tumour cells rather than by lymphocytes.</w:t>
       </w:r>
     </w:p>
     <w:bookmarkEnd w:id="33"/>
@@ -2026,23 +2102,6 @@
         <w:t xml:space="preserve">This is also why we regard the B7-H3 result as the most interesting finding rather than a corollary of proliferation. Proliferation is the dominant axis of NCL covariation, so an immune association that persists after explicit adjustment for a proliferation score — as the B7-H3, CD73 and CD39 associations do, while most T-cell checkpoint associations do not — is not simply a restatement of that axis.</w:t>
       </w:r>
     </w:p>
-    <w:p>
-      <w:pPr>
-        <w:pStyle w:val="BodyText"/>
-      </w:pPr>
-      <w:r>
-        <w:t xml:space="preserve">We deliberately did not repeat the miRNA network analysis of our earlier report. That analysis described a network in which NCL was one node among many as a set of</w:t>
-      </w:r>
-      <w:r>
-        <w:t xml:space="preserve"> </w:t>
-      </w:r>
-      <w:r>
-        <w:t xml:space="preserve">“NCL-interacting miRNAs”</w:t>
-      </w:r>
-      <w:r>
-        <w:t xml:space="preserve">, assigned biological roles to individual miRNAs that were never tested, and drew on a prediction resource named inconsistently between Methods and Results. We do not consider it to have supported any conclusion, and no replacement analysis is offered in its place.</w:t>
-      </w:r>
-    </w:p>
     <w:bookmarkEnd w:id="35"/>
     <w:bookmarkStart w:id="36" w:name="methodological-implications"/>
     <w:p>
@@ -2094,13 +2153,14 @@
       </w:r>
     </w:p>
     <w:bookmarkEnd w:id="36"/>
-    <w:bookmarkStart w:id="37" w:name="X2c9f20d7ef68338237f0b1e84485be84b1ff18e"/>
-    <w:p>
-      <w:pPr>
-        <w:pStyle w:val="Heading3"/>
-      </w:pPr>
-      <w:r>
-        <w:t xml:space="preserve">4.5 Relationship to our earlier report and corrections</w:t>
+    <w:bookmarkEnd w:id="37"/>
+    <w:bookmarkStart w:id="38" w:name="limitations"/>
+    <w:p>
+      <w:pPr>
+        <w:pStyle w:val="Heading2"/>
+      </w:pPr>
+      <w:r>
+        <w:t xml:space="preserve">5. Limitations</w:t>
       </w:r>
     </w:p>
     <w:p>
@@ -2108,452 +2168,326 @@
         <w:pStyle w:val="FirstParagraph"/>
       </w:pPr>
       <w:r>
-        <w:t xml:space="preserve">Because this manuscript revises conclusions we previously published in preprint form, we state the specific corrections explicitly.</w:t>
-      </w:r>
-    </w:p>
-    <w:p>
-      <w:pPr>
+        <w:t xml:space="preserve">The central limitation is that this study generates no new experimental data. We have validated as far as is possible computationally, in an independent patient series measured on an orthogonal platform at the protein level with paired adjacent normal tissue (CPTAC). This is a genuine and reasonably stringent form of external validation, and it substantiates the overexpression claim. It is not, however, a substitute for functional experimentation, and none of the mechanistic hypotheses advanced in Section 4.2 is tested by it. The association between NCL and B7-H3 in particular requires perturbation experiments — NCL knockdown or overexpression with measurement of B7-H3 and of immune composition — before any regulatory relationship can be claimed. We state plainly that this work does not provide that evidence.</w:t>
+      </w:r>
+    </w:p>
+    <w:p>
+      <w:pPr>
+        <w:pStyle w:val="BodyText"/>
+      </w:pPr>
+      <w:r>
+        <w:t xml:space="preserve">Further limitations follow from the data sources. Transcriptome deconvolution infers cell composition from bulk expression and is not a measurement of infiltration; the poor cross-algorithm concordance documented in Section 3.5 is itself evidence of this limitation, and single-cell or spatial data would be required to resolve the cell-type associations convincingly. Six TCGA–GTEx tissue pairings are approximate and are flagged as such; three cancers have no acceptable GTEx counterpart. Several cohorts are small — CHOL (36 tumours), KICH (65), UCS (57) — so that the absence of a significant association in those cancers reflects limited power as much as absence of effect, and KICH in particular could not be modelled for overall survival. Stage and grade are unavailable for some cancers, so the covariate set differs between models; the covariates used are recorded for every model. The proportional-hazards assumption was violated for the NCL term in 10 of 74 models, and those hazard ratios summarise time-varying effects. Finally, TCGA is predominantly composed of treatment-naive primary resections from a limited set of populations, and prognostic associations derived from it need not transfer to treated, metastatic or differently ascertained populations.</w:t>
+      </w:r>
+    </w:p>
+    <w:bookmarkEnd w:id="38"/>
+    <w:bookmarkStart w:id="39" w:name="conclusion"/>
+    <w:p>
+      <w:pPr>
+        <w:pStyle w:val="Heading2"/>
+      </w:pPr>
+      <w:r>
+        <w:t xml:space="preserve">6. Conclusion</w:t>
+      </w:r>
+    </w:p>
+    <w:p>
+      <w:pPr>
+        <w:pStyle w:val="FirstParagraph"/>
+      </w:pPr>
+      <w:r>
+        <w:t xml:space="preserve">Nucleolin is broadly and reproducibly overexpressed across human cancers at both transcript and protein level, but it is only rarely an independent prognostic factor once the clinical variables already in routine use are accounted for; on the evidence presented here, kidney renal papillary cell carcinoma is the clearest exception. Its relationship to the tumour immune microenvironment is consistent but is not the one previously proposed: NCL marks an immune-excluded phenotype and co-expresses with tumour-cell-intrinsic immunosuppressive ligands, most consistently B7-H3 and the adenosine-pathway ectoenzymes CD73 and CD39, rather than with T-cell checkpoint receptors. These results argue for a more circumscribed view of NCL as a prognostic biomarker, and identify the NCL–B7-H3 relationship in immune-excluded tumours as the hypothesis most deserving of experimental test.</w:t>
+      </w:r>
+    </w:p>
+    <w:bookmarkEnd w:id="39"/>
+    <w:bookmarkStart w:id="40" w:name="declarations"/>
+    <w:p>
+      <w:pPr>
+        <w:pStyle w:val="Heading2"/>
+      </w:pPr>
+      <w:r>
+        <w:t xml:space="preserve">Declarations</w:t>
+      </w:r>
+    </w:p>
+    <w:p>
+      <w:pPr>
+        <w:pStyle w:val="FirstParagraph"/>
+      </w:pPr>
+      <w:r>
+        <w:rPr>
+          <w:b/>
+          <w:bCs/>
+        </w:rPr>
+        <w:t xml:space="preserve">Ethics approval and consent to participate:</w:t>
+      </w:r>
+      <w:r>
+        <w:t xml:space="preserve"> </w:t>
+      </w:r>
+      <w:r>
+        <w:t xml:space="preserve">Not applicable. This study analysed only publicly available, de-identified data from TCGA, GTEx and CPTAC, obtained under the data use policies of those consortia.</w:t>
+      </w:r>
+    </w:p>
+    <w:p>
+      <w:pPr>
+        <w:pStyle w:val="BodyText"/>
+      </w:pPr>
+      <w:r>
+        <w:rPr>
+          <w:b/>
+          <w:bCs/>
+        </w:rPr>
+        <w:t xml:space="preserve">Clinical trial number:</w:t>
+      </w:r>
+      <w:r>
+        <w:t xml:space="preserve"> </w:t>
+      </w:r>
+      <w:r>
+        <w:t xml:space="preserve">Not applicable.</w:t>
+      </w:r>
+    </w:p>
+    <w:p>
+      <w:pPr>
+        <w:pStyle w:val="BodyText"/>
+      </w:pPr>
+      <w:r>
+        <w:rPr>
+          <w:b/>
+          <w:bCs/>
+        </w:rPr>
+        <w:t xml:space="preserve">Consent for publication:</w:t>
+      </w:r>
+      <w:r>
+        <w:t xml:space="preserve"> </w:t>
+      </w:r>
+      <w:r>
+        <w:t xml:space="preserve">Not applicable.</w:t>
+      </w:r>
+    </w:p>
+    <w:p>
+      <w:pPr>
+        <w:pStyle w:val="BodyText"/>
+      </w:pPr>
+      <w:r>
+        <w:rPr>
+          <w:b/>
+          <w:bCs/>
+        </w:rPr>
+        <w:t xml:space="preserve">Availability of data and materials:</w:t>
+      </w:r>
+      <w:r>
+        <w:t xml:space="preserve"> </w:t>
+      </w:r>
+      <w:r>
+        <w:t xml:space="preserve">All primary data are publicly available. Transcriptome data: UCSC Xena Toil recompute (https://xenabrowser.net/datapages/, dataset</w:t>
+      </w:r>
+      <w:r>
+        <w:t xml:space="preserve"> </w:t>
+      </w:r>
+      <w:r>
+        <w:rPr>
+          <w:rStyle w:val="VerbatimChar"/>
+        </w:rPr>
+        <w:t xml:space="preserve">TcgaTargetGtex_rsem_gene_tpm</w:t>
+      </w:r>
+      <w:r>
+        <w:t xml:space="preserve">). Clinical, survival, TMB and MSI data: cBioPortal (https://www.cbioportal.org), TCGA PanCancer Atlas studies. Immune infiltration estimates: TIMER2.0 (http://timer.cistrome.org). Gene sets: MSigDB v2024.1.Hs (https://www.gsea-msigdb.org). Proteomic data: CPTAC via the</w:t>
+      </w:r>
+      <w:r>
+        <w:t xml:space="preserve"> </w:t>
+      </w:r>
+      <w:r>
+        <w:rPr>
+          <w:rStyle w:val="VerbatimChar"/>
+        </w:rPr>
+        <w:t xml:space="preserve">cptac</w:t>
+      </w:r>
+      <w:r>
+        <w:t xml:space="preserve"> </w:t>
+      </w:r>
+      <w:r>
+        <w:t xml:space="preserve">Python package. All analysis code, the complete computational environment specification, intermediate result tables and a step-by-step methodology document are available at https://github.com/ApexBlue11/ncl-pancancer-analysis. No new data were generated.</w:t>
+      </w:r>
+    </w:p>
+    <w:p>
+      <w:pPr>
+        <w:pStyle w:val="BodyText"/>
+      </w:pPr>
+      <w:r>
+        <w:rPr>
+          <w:b/>
+          <w:bCs/>
+        </w:rPr>
+        <w:t xml:space="preserve">Competing interests:</w:t>
+      </w:r>
+      <w:r>
+        <w:t xml:space="preserve"> </w:t>
+      </w:r>
+      <w:r>
+        <w:t xml:space="preserve">The authors declare that the research was conducted without any commercial or financial relationships that could be construed as a potential conflict of interest.</w:t>
+      </w:r>
+    </w:p>
+    <w:p>
+      <w:pPr>
+        <w:pStyle w:val="BodyText"/>
+      </w:pPr>
+      <w:r>
+        <w:rPr>
+          <w:b/>
+          <w:bCs/>
+        </w:rPr>
+        <w:t xml:space="preserve">Funding:</w:t>
+      </w:r>
+      <w:r>
+        <w:t xml:space="preserve"> </w:t>
+      </w:r>
+      <w:r>
+        <w:t xml:space="preserve">This work was supported by the National Research Foundation of Korea (NRF) grant funded by the Korea government (MSIT) (NRF-2022R1A2C2005057).</w:t>
+      </w:r>
+    </w:p>
+    <w:p>
+      <w:pPr>
+        <w:pStyle w:val="BodyText"/>
+      </w:pPr>
+      <w:r>
+        <w:rPr>
+          <w:b/>
+          <w:bCs/>
+        </w:rPr>
+        <w:t xml:space="preserve">Authors’ contributions:</w:t>
+      </w:r>
+      <w:r>
+        <w:t xml:space="preserve"> </w:t>
+      </w:r>
+      <w:r>
+        <w:t xml:space="preserve">[To be confirmed by all authors for the revised manuscript, whose conclusions differ substantively from the previous version.]</w:t>
+      </w:r>
+    </w:p>
+    <w:p>
+      <w:pPr>
+        <w:pStyle w:val="BodyText"/>
+      </w:pPr>
+      <w:r>
+        <w:rPr>
+          <w:b/>
+          <w:bCs/>
+        </w:rPr>
+        <w:t xml:space="preserve">Use of AI and AI-assisted technologies:</w:t>
+      </w:r>
+      <w:r>
+        <w:t xml:space="preserve"> </w:t>
+      </w:r>
+      <w:r>
+        <w:t xml:space="preserve">An AI assistant (Anthropic Claude) was used during preparation of this revision for analysis code development, statistical implementation, execution of the computational workflow, and drafting and editing of manuscript text. All analyses were specified, inspected and verified by the authors; all statistical implementations were validated against reference implementations prior to use; and the authors take full responsibility for the integrity of the data, the accuracy of the analyses and the content of the manuscript. No AI system is an author, and no AI system was used to generate or fabricate data.</w:t>
+      </w:r>
+    </w:p>
+    <w:p>
+      <w:pPr>
+        <w:pStyle w:val="BodyText"/>
+      </w:pPr>
+      <w:r>
+        <w:rPr>
+          <w:b/>
+          <w:bCs/>
+        </w:rPr>
+        <w:t xml:space="preserve">Acknowledgements:</w:t>
+      </w:r>
+      <w:r>
+        <w:t xml:space="preserve"> </w:t>
+      </w:r>
+      <w:r>
+        <w:t xml:space="preserve">The authors thank the peer reviewers, whose criticisms substantially shaped the analyses reported here, and acknowledge TCGA, GTEx, CPTAC and their participants, without whose data this work would not be possible.</w:t>
+      </w:r>
+    </w:p>
+    <w:bookmarkEnd w:id="40"/>
+    <w:bookmarkStart w:id="41" w:name="references"/>
+    <w:p>
+      <w:pPr>
+        <w:pStyle w:val="Heading2"/>
+      </w:pPr>
+      <w:r>
+        <w:t xml:space="preserve">References</w:t>
+      </w:r>
+    </w:p>
+    <w:p>
+      <w:pPr>
+        <w:pStyle w:val="Compact"/>
         <w:numPr>
           <w:ilvl w:val="0"/>
           <w:numId w:val="1001"/>
         </w:numPr>
       </w:pPr>
       <w:r>
-        <w:rPr>
-          <w:b/>
-          <w:bCs/>
-        </w:rPr>
-        <w:t xml:space="preserve">Immune checkpoint claims.</w:t>
-      </w:r>
-      <w:r>
-        <w:t xml:space="preserve"> </w:t>
-      </w:r>
-      <w:r>
-        <w:t xml:space="preserve">The earlier title and abstract asserted correlations between NCL and PD-L1, CTLA-4, TIM-3, IL-10 and TGF-β. No checkpoint analysis was performed in that work. That analysis has now been done; those specific associations are weak or absent, and B7-H3 emerges as the robust association instead. The title of the present manuscript has been changed accordingly, and uses</w:t>
-      </w:r>
-      <w:r>
-        <w:t xml:space="preserve"> </w:t>
-      </w:r>
-      <w:r>
-        <w:t xml:space="preserve">“association”</w:t>
-      </w:r>
-      <w:r>
-        <w:t xml:space="preserve"> </w:t>
-      </w:r>
-      <w:r>
-        <w:t xml:space="preserve">rather than</w:t>
-      </w:r>
-      <w:r>
-        <w:t xml:space="preserve"> </w:t>
-      </w:r>
-      <w:r>
-        <w:t xml:space="preserve">“regulation”</w:t>
-      </w:r>
-      <w:r>
-        <w:t xml:space="preserve"> </w:t>
-      </w:r>
-      <w:r>
-        <w:t xml:space="preserve">because the data are correlational.</w:t>
-      </w:r>
-    </w:p>
-    <w:p>
-      <w:pPr>
+        <w:t xml:space="preserve">Bray F, Laversanne M, Sung H, Ferlay J, Siegel RL, Soerjomataram I, et al. Global cancer statistics 2022: GLOBOCAN estimates of incidence and mortality worldwide for 36 cancers in 185 countries. CA Cancer J Clin. 2024;74(3):229–263.</w:t>
+      </w:r>
+    </w:p>
+    <w:p>
+      <w:pPr>
+        <w:pStyle w:val="Compact"/>
         <w:numPr>
           <w:ilvl w:val="0"/>
           <w:numId w:val="1001"/>
         </w:numPr>
       </w:pPr>
       <w:r>
-        <w:rPr>
-          <w:b/>
-          <w:bCs/>
-        </w:rPr>
-        <w:t xml:space="preserve">CancerSEA and cBioPortal.</w:t>
-      </w:r>
-      <w:r>
-        <w:t xml:space="preserve"> </w:t>
-      </w:r>
-      <w:r>
-        <w:t xml:space="preserve">The earlier report referred in its title and text to CancerSEA functional-state analysis and to cBioPortal genetic-alteration analysis. Neither was performed. References to CancerSEA have been removed; cBioPortal is now genuinely used, as the source of curated survival endpoints and clinical covariates.</w:t>
-      </w:r>
-    </w:p>
-    <w:p>
-      <w:pPr>
+        <w:t xml:space="preserve">Piña-Sánchez P, Chávez-González A, Ruiz-Tachiquín M, Vadillo E, Monroy-García A, Montesinos JJ, et al. Cancer biology, epidemiology, and treatment in the 21st century: current status and future challenges from a biomedical perspective. Cancer Control. 2021;28:10732748211038735.</w:t>
+      </w:r>
+    </w:p>
+    <w:p>
+      <w:pPr>
+        <w:pStyle w:val="Compact"/>
         <w:numPr>
           <w:ilvl w:val="0"/>
           <w:numId w:val="1001"/>
         </w:numPr>
       </w:pPr>
       <w:r>
-        <w:rPr>
-          <w:b/>
-          <w:bCs/>
-        </w:rPr>
-        <w:t xml:space="preserve">Direction of dysregulation.</w:t>
-      </w:r>
-      <w:r>
-        <w:t xml:space="preserve"> </w:t>
-      </w:r>
-      <w:r>
-        <w:t xml:space="preserve">The earlier report described NCL as reduced in KIRP, READ and cutaneous melanoma. READ and SKCM are elevated against every available comparator. KIRP is reduced only against adjacent normals and elevated against GTEx.</w:t>
-      </w:r>
-    </w:p>
-    <w:p>
-      <w:pPr>
+        <w:t xml:space="preserve">Cancer Genome Atlas Research Network, Weinstein JN, Collisson EA, Mills GB, Shaw KR, Ozenberger BA, et al. The Cancer Genome Atlas Pan-Cancer analysis project. Nat Genet. 2013;45(10):1113–1120.</w:t>
+      </w:r>
+    </w:p>
+    <w:p>
+      <w:pPr>
+        <w:pStyle w:val="Compact"/>
         <w:numPr>
           <w:ilvl w:val="0"/>
           <w:numId w:val="1001"/>
         </w:numPr>
       </w:pPr>
       <w:r>
-        <w:rPr>
-          <w:b/>
-          <w:bCs/>
-        </w:rPr>
-        <w:t xml:space="preserve">Stage progression.</w:t>
-      </w:r>
-      <w:r>
-        <w:t xml:space="preserve"> </w:t>
-      </w:r>
-      <w:r>
-        <w:t xml:space="preserve">The earlier claim of a progressive stage I–IV increase across eight cancers is supported by a formal trend test in one.</w:t>
-      </w:r>
-    </w:p>
-    <w:p>
-      <w:pPr>
+        <w:t xml:space="preserve">GTEx Consortium. The Genotype-Tissue Expression (GTEx) pilot analysis: multitissue gene regulation in humans. Science. 2015;348(6235):648–660.</w:t>
+      </w:r>
+    </w:p>
+    <w:p>
+      <w:pPr>
+        <w:pStyle w:val="Compact"/>
         <w:numPr>
           <w:ilvl w:val="0"/>
           <w:numId w:val="1001"/>
         </w:numPr>
       </w:pPr>
       <w:r>
-        <w:rPr>
-          <w:b/>
-          <w:bCs/>
-        </w:rPr>
-        <w:t xml:space="preserve">Survival panels.</w:t>
-      </w:r>
-      <w:r>
-        <w:t xml:space="preserve"> </w:t>
-      </w:r>
-      <w:r>
-        <w:t xml:space="preserve">Three of the eight Kaplan–Meier panels in the earlier report carried cohort sizes incompatible with the cancer they were labelled with — most clearly a</w:t>
-      </w:r>
-      <w:r>
-        <w:t xml:space="preserve"> </w:t>
-      </w:r>
-      <w:r>
-        <w:t xml:space="preserve">“KICH”</w:t>
-      </w:r>
-      <w:r>
-        <w:t xml:space="preserve"> </w:t>
-      </w:r>
-      <w:r>
-        <w:t xml:space="preserve">panel showing 877 patients, whereas TCGA KICH comprises 65 primary tumours. Those panels derived from pooled Human Protein Atlas cohorts (renal, lung) rather than from the individual TCGA projects named. All survival analyses here are computed directly from TCGA data with stated sample sizes.</w:t>
-      </w:r>
-    </w:p>
-    <w:p>
-      <w:pPr>
+        <w:t xml:space="preserve">Ellis MJ, Gillette M, Carr SA, Paulovich AG, Smith RD, Rodland KK, et al. Connecting genomic alterations to cancer biology with proteomics: the NCI Clinical Proteomic Tumor Analysis Consortium. Cancer Discov. 2013;3(10):1108–1112.</w:t>
+      </w:r>
+    </w:p>
+    <w:p>
+      <w:pPr>
+        <w:pStyle w:val="Compact"/>
         <w:numPr>
           <w:ilvl w:val="0"/>
           <w:numId w:val="1001"/>
         </w:numPr>
       </w:pPr>
       <w:r>
-        <w:rPr>
-          <w:b/>
-          <w:bCs/>
-        </w:rPr>
-        <w:t xml:space="preserve">Cancer type nomenclature.</w:t>
-      </w:r>
-      <w:r>
-        <w:t xml:space="preserve"> </w:t>
-      </w:r>
-      <w:r>
-        <w:t xml:space="preserve">The earlier Table 1, presented as the TCGA cancer list, contained 39 entries including entities that are not TCGA projects, and defined ACC as adenoid cystic carcinoma whereas TCGA ACC is adrenocortical carcinoma. The corrected list of 33 TCGA projects is given in Supplementary Table S1.</w:t>
-      </w:r>
-    </w:p>
-    <w:p>
-      <w:pPr>
+        <w:t xml:space="preserve">Ioannidis JP. Why most published research findings are false. PLoS Med. 2005;2(8):e124.</w:t>
+      </w:r>
+    </w:p>
+    <w:p>
+      <w:pPr>
+        <w:pStyle w:val="Compact"/>
         <w:numPr>
           <w:ilvl w:val="0"/>
           <w:numId w:val="1001"/>
         </w:numPr>
       </w:pPr>
       <w:r>
-        <w:rPr>
-          <w:b/>
-          <w:bCs/>
-        </w:rPr>
-        <w:t xml:space="preserve">Differential expression method.</w:t>
-      </w:r>
-      <w:r>
-        <w:t xml:space="preserve"> </w:t>
-      </w:r>
-      <w:r>
-        <w:t xml:space="preserve">The earlier Methods described GEPIA2 with GTEx normals, but the figure presented was generated by TIMER2’s TCGA-only module; cancers such as PAAD therefore rested on four adjacent normals. The present analysis uses 167 GTEx pancreas samples for that comparison.</w:t>
-      </w:r>
-    </w:p>
-    <w:p>
-      <w:pPr>
-        <w:pStyle w:val="FirstParagraph"/>
-      </w:pPr>
-      <w:r>
-        <w:t xml:space="preserve">We report these corrections in full because the conclusions of the earlier analysis have been cited, and because the errors are of a kind — tool misattribution, figure mislabelling, claims outrunning analyses — that is difficult for readers to detect from the published record alone.</w:t>
-      </w:r>
-    </w:p>
-    <w:bookmarkEnd w:id="37"/>
-    <w:bookmarkEnd w:id="38"/>
-    <w:bookmarkStart w:id="39" w:name="limitations"/>
-    <w:p>
-      <w:pPr>
-        <w:pStyle w:val="Heading2"/>
-      </w:pPr>
-      <w:r>
-        <w:t xml:space="preserve">5. Limitations</w:t>
-      </w:r>
-    </w:p>
-    <w:p>
-      <w:pPr>
-        <w:pStyle w:val="FirstParagraph"/>
-      </w:pPr>
-      <w:r>
-        <w:t xml:space="preserve">The central limitation is that this study generates no new experimental data. Reviewers of an earlier version reasonably asked for validation in patient cohorts, tissue samples or functional in vitro experiments. We have addressed this as far as is possible computationally, by validating in an independent patient series measured on an orthogonal platform at the protein level with paired adjacent normal tissue (CPTAC). This is a genuine and reasonably stringent form of external validation, and it substantiates the overexpression claim. It is not, however, a substitute for functional experimentation, and none of the mechanistic hypotheses advanced in Section 4.2 is tested by it. The association between NCL and B7-H3 in particular requires perturbation experiments — NCL knockdown or overexpression with measurement of B7-H3 and of immune composition — before any regulatory relationship can be claimed. We state plainly that this work does not provide that evidence.</w:t>
-      </w:r>
-    </w:p>
-    <w:p>
-      <w:pPr>
-        <w:pStyle w:val="BodyText"/>
-      </w:pPr>
-      <w:r>
-        <w:t xml:space="preserve">Further limitations follow from the data sources. Transcriptome deconvolution infers cell composition from bulk expression and is not a measurement of infiltration; the poor cross-algorithm concordance documented in Section 3.5 is itself evidence of this limitation, and single-cell or spatial data would be required to resolve the cell-type associations convincingly. Six TCGA–GTEx tissue pairings are approximate and are flagged as such; three cancers have no acceptable GTEx counterpart. Several cohorts are small — CHOL (36 tumours), KICH (65), UCS (57) — so that the absence of a significant association in those cancers reflects limited power as much as absence of effect, and KICH in particular could not be modelled for overall survival. Stage and grade are unavailable for some cancers, so the covariate set differs between models; the covariates used are recorded for every model. The proportional-hazards assumption was violated for the NCL term in 10 of 74 models, and those hazard ratios summarise time-varying effects. Finally, TCGA is predominantly composed of treatment-naive primary resections from a limited set of populations, and prognostic associations derived from it need not transfer to treated, metastatic or differently ascertained populations.</w:t>
-      </w:r>
-    </w:p>
-    <w:bookmarkEnd w:id="39"/>
-    <w:bookmarkStart w:id="40" w:name="conclusion"/>
-    <w:p>
-      <w:pPr>
-        <w:pStyle w:val="Heading2"/>
-      </w:pPr>
-      <w:r>
-        <w:t xml:space="preserve">6. Conclusion</w:t>
-      </w:r>
-    </w:p>
-    <w:p>
-      <w:pPr>
-        <w:pStyle w:val="FirstParagraph"/>
-      </w:pPr>
-      <w:r>
-        <w:t xml:space="preserve">Nucleolin is broadly and reproducibly overexpressed across human cancers at both transcript and protein level, but it is only rarely an independent prognostic factor once the clinical variables already in routine use are accounted for; on the evidence presented here, kidney renal papillary cell carcinoma is the clearest exception. Its relationship to the tumour immune microenvironment is consistent but is not the one previously proposed: NCL marks an immune-excluded phenotype and co-expresses with tumour-cell-intrinsic immunosuppressive ligands, most consistently B7-H3 and the adenosine-pathway ectoenzymes CD73 and CD39, rather than with T-cell checkpoint receptors. These results argue for a more circumscribed view of NCL as a prognostic biomarker, and identify the NCL–B7-H3 relationship in immune-excluded tumours as the hypothesis most deserving of experimental test.</w:t>
-      </w:r>
-    </w:p>
-    <w:bookmarkEnd w:id="40"/>
-    <w:bookmarkStart w:id="41" w:name="declarations"/>
-    <w:p>
-      <w:pPr>
-        <w:pStyle w:val="Heading2"/>
-      </w:pPr>
-      <w:r>
-        <w:t xml:space="preserve">Declarations</w:t>
-      </w:r>
-    </w:p>
-    <w:p>
-      <w:pPr>
-        <w:pStyle w:val="FirstParagraph"/>
-      </w:pPr>
-      <w:r>
-        <w:rPr>
-          <w:b/>
-          <w:bCs/>
-        </w:rPr>
-        <w:t xml:space="preserve">Ethics approval and consent to participate:</w:t>
-      </w:r>
-      <w:r>
-        <w:t xml:space="preserve"> </w:t>
-      </w:r>
-      <w:r>
-        <w:t xml:space="preserve">Not applicable. This study analysed only publicly available, de-identified data from TCGA, GTEx and CPTAC, obtained under the data use policies of those consortia.</w:t>
-      </w:r>
-    </w:p>
-    <w:p>
-      <w:pPr>
-        <w:pStyle w:val="BodyText"/>
-      </w:pPr>
-      <w:r>
-        <w:rPr>
-          <w:b/>
-          <w:bCs/>
-        </w:rPr>
-        <w:t xml:space="preserve">Clinical trial number:</w:t>
-      </w:r>
-      <w:r>
-        <w:t xml:space="preserve"> </w:t>
-      </w:r>
-      <w:r>
-        <w:t xml:space="preserve">Not applicable.</w:t>
-      </w:r>
-    </w:p>
-    <w:p>
-      <w:pPr>
-        <w:pStyle w:val="BodyText"/>
-      </w:pPr>
-      <w:r>
-        <w:rPr>
-          <w:b/>
-          <w:bCs/>
-        </w:rPr>
-        <w:t xml:space="preserve">Consent for publication:</w:t>
-      </w:r>
-      <w:r>
-        <w:t xml:space="preserve"> </w:t>
-      </w:r>
-      <w:r>
-        <w:t xml:space="preserve">Not applicable.</w:t>
-      </w:r>
-    </w:p>
-    <w:p>
-      <w:pPr>
-        <w:pStyle w:val="BodyText"/>
-      </w:pPr>
-      <w:r>
-        <w:rPr>
-          <w:b/>
-          <w:bCs/>
-        </w:rPr>
-        <w:t xml:space="preserve">Availability of data and materials:</w:t>
-      </w:r>
-      <w:r>
-        <w:t xml:space="preserve"> </w:t>
-      </w:r>
-      <w:r>
-        <w:t xml:space="preserve">All primary data are publicly available. Transcriptome data: UCSC Xena Toil recompute (https://xenabrowser.net/datapages/, dataset</w:t>
-      </w:r>
-      <w:r>
-        <w:t xml:space="preserve"> </w:t>
-      </w:r>
-      <w:r>
-        <w:rPr>
-          <w:rStyle w:val="VerbatimChar"/>
-        </w:rPr>
-        <w:t xml:space="preserve">TcgaTargetGtex_rsem_gene_tpm</w:t>
-      </w:r>
-      <w:r>
-        <w:t xml:space="preserve">). Clinical, survival, TMB and MSI data: cBioPortal (https://www.cbioportal.org), TCGA PanCancer Atlas studies. Immune infiltration estimates: TIMER2.0 (http://timer.cistrome.org). Gene sets: MSigDB v2024.1.Hs (https://www.gsea-msigdb.org). Proteomic data: CPTAC via the</w:t>
-      </w:r>
-      <w:r>
-        <w:t xml:space="preserve"> </w:t>
-      </w:r>
-      <w:r>
-        <w:rPr>
-          <w:rStyle w:val="VerbatimChar"/>
-        </w:rPr>
-        <w:t xml:space="preserve">cptac</w:t>
-      </w:r>
-      <w:r>
-        <w:t xml:space="preserve"> </w:t>
-      </w:r>
-      <w:r>
-        <w:t xml:space="preserve">Python package. All analysis code, the complete computational environment specification, intermediate result tables and a step-by-step methodology document are available at https://github.com/ApexBlue11/ncl-pancancer-analysis. No new data were generated.</w:t>
-      </w:r>
-    </w:p>
-    <w:p>
-      <w:pPr>
-        <w:pStyle w:val="BodyText"/>
-      </w:pPr>
-      <w:r>
-        <w:rPr>
-          <w:b/>
-          <w:bCs/>
-        </w:rPr>
-        <w:t xml:space="preserve">Competing interests:</w:t>
-      </w:r>
-      <w:r>
-        <w:t xml:space="preserve"> </w:t>
-      </w:r>
-      <w:r>
-        <w:t xml:space="preserve">The authors declare that the research was conducted without any commercial or financial relationships that could be construed as a potential conflict of interest.</w:t>
-      </w:r>
-    </w:p>
-    <w:p>
-      <w:pPr>
-        <w:pStyle w:val="BodyText"/>
-      </w:pPr>
-      <w:r>
-        <w:rPr>
-          <w:b/>
-          <w:bCs/>
-        </w:rPr>
-        <w:t xml:space="preserve">Funding:</w:t>
-      </w:r>
-      <w:r>
-        <w:t xml:space="preserve"> </w:t>
-      </w:r>
-      <w:r>
-        <w:t xml:space="preserve">This work was supported by the National Research Foundation of Korea (NRF) grant funded by the Korea government (MSIT) (NRF-2022R1A2C2005057).</w:t>
-      </w:r>
-    </w:p>
-    <w:p>
-      <w:pPr>
-        <w:pStyle w:val="BodyText"/>
-      </w:pPr>
-      <w:r>
-        <w:rPr>
-          <w:b/>
-          <w:bCs/>
-        </w:rPr>
-        <w:t xml:space="preserve">Authors’ contributions:</w:t>
-      </w:r>
-      <w:r>
-        <w:t xml:space="preserve"> </w:t>
-      </w:r>
-      <w:r>
-        <w:t xml:space="preserve">[To be confirmed by all authors for the revised manuscript, whose conclusions differ substantively from the previous version.]</w:t>
-      </w:r>
-    </w:p>
-    <w:p>
-      <w:pPr>
-        <w:pStyle w:val="BodyText"/>
-      </w:pPr>
-      <w:r>
-        <w:rPr>
-          <w:b/>
-          <w:bCs/>
-        </w:rPr>
-        <w:t xml:space="preserve">Use of AI and AI-assisted technologies:</w:t>
-      </w:r>
-      <w:r>
-        <w:t xml:space="preserve"> </w:t>
-      </w:r>
-      <w:r>
-        <w:t xml:space="preserve">An AI assistant (Anthropic Claude) was used during preparation of this revision for analysis code development, statistical implementation, execution of the computational workflow, and drafting and editing of manuscript text. All analyses were specified, inspected and verified by the authors; all statistical implementations were validated against reference implementations prior to use; and the authors take full responsibility for the integrity of the data, the accuracy of the analyses and the content of the manuscript. No AI system is an author, and no AI system was used to generate or fabricate data.</w:t>
-      </w:r>
-    </w:p>
-    <w:p>
-      <w:pPr>
-        <w:pStyle w:val="BodyText"/>
-      </w:pPr>
-      <w:r>
-        <w:rPr>
-          <w:b/>
-          <w:bCs/>
-        </w:rPr>
-        <w:t xml:space="preserve">Acknowledgements:</w:t>
-      </w:r>
-      <w:r>
-        <w:t xml:space="preserve"> </w:t>
-      </w:r>
-      <w:r>
-        <w:t xml:space="preserve">The authors thank the reviewers of the previous version of this manuscript, whose criticisms prompted the reanalysis reported here and directly identified several of the errors corrected in Section 4.5.</w:t>
-      </w:r>
-    </w:p>
-    <w:bookmarkEnd w:id="41"/>
-    <w:bookmarkStart w:id="42" w:name="references"/>
-    <w:p>
-      <w:pPr>
-        <w:pStyle w:val="Heading2"/>
-      </w:pPr>
-      <w:r>
-        <w:t xml:space="preserve">References</w:t>
+        <w:t xml:space="preserve">Benjamini Y, Hochberg Y. Controlling the false discovery rate: a practical and powerful approach to multiple testing. J R Stat Soc Series B Stat Methodol. 1995;57(1):289–300.</w:t>
       </w:r>
     </w:p>
     <w:p>
@@ -2561,11 +2495,11 @@
         <w:pStyle w:val="Compact"/>
         <w:numPr>
           <w:ilvl w:val="0"/>
-          <w:numId w:val="1002"/>
+          <w:numId w:val="1001"/>
         </w:numPr>
       </w:pPr>
       <w:r>
-        <w:t xml:space="preserve">Bray F, Laversanne M, Sung H, Ferlay J, Siegel RL, Soerjomataram I, et al. Global cancer statistics 2022: GLOBOCAN estimates of incidence and mortality worldwide for 36 cancers in 185 countries. CA Cancer J Clin. 2024;74(3):229–263.</w:t>
+        <w:t xml:space="preserve">Yangngam S, Prasopsiri J, Hatthakarnkul P, Thongchot S, Thuwajit P, Yenchitsomanus PT, et al. Cellular localization of nucleolin determines the prognosis in cancers: a meta-analysis. J Mol Med (Berl). 2022;100(8):1145–1157.</w:t>
       </w:r>
     </w:p>
     <w:p>
@@ -2573,11 +2507,11 @@
         <w:pStyle w:val="Compact"/>
         <w:numPr>
           <w:ilvl w:val="0"/>
-          <w:numId w:val="1002"/>
+          <w:numId w:val="1001"/>
         </w:numPr>
       </w:pPr>
       <w:r>
-        <w:t xml:space="preserve">Piña-Sánchez P, Chávez-González A, Ruiz-Tachiquín M, Vadillo E, Monroy-García A, Montesinos JJ, et al. Cancer biology, epidemiology, and treatment in the 21st century: current status and future challenges from a biomedical perspective. Cancer Control. 2021;28:10732748211038735.</w:t>
+        <w:t xml:space="preserve">Berger CM, Gaume X, Bouvet P. The roles of nucleolin subcellular localization in cancer. Biochimie. 2015;113:78–85.</w:t>
       </w:r>
     </w:p>
     <w:p>
@@ -2585,11 +2519,11 @@
         <w:pStyle w:val="Compact"/>
         <w:numPr>
           <w:ilvl w:val="0"/>
-          <w:numId w:val="1002"/>
+          <w:numId w:val="1001"/>
         </w:numPr>
       </w:pPr>
       <w:r>
-        <w:t xml:space="preserve">Cancer Genome Atlas Research Network, Weinstein JN, Collisson EA, Mills GB, Shaw KR, Ozenberger BA, et al. The Cancer Genome Atlas Pan-Cancer analysis project. Nat Genet. 2013;45(10):1113–1120.</w:t>
+        <w:t xml:space="preserve">Mongelard F, Bouvet P. Nucleolin: a multiFACeTed protein. Trends Cell Biol. 2007;17(2):80–86.</w:t>
       </w:r>
     </w:p>
     <w:p>
@@ -2597,11 +2531,11 @@
         <w:pStyle w:val="Compact"/>
         <w:numPr>
           <w:ilvl w:val="0"/>
-          <w:numId w:val="1002"/>
+          <w:numId w:val="1001"/>
         </w:numPr>
       </w:pPr>
       <w:r>
-        <w:t xml:space="preserve">GTEx Consortium. The Genotype-Tissue Expression (GTEx) pilot analysis: multitissue gene regulation in humans. Science. 2015;348(6235):648–660.</w:t>
+        <w:t xml:space="preserve">Jia W, Yao Z, Zhao J, Guan Q, Gao L. New perspectives of physiological and pathological functions of nucleolin (NCL). Life Sci. 2017;186:1–10.</w:t>
       </w:r>
     </w:p>
     <w:p>
@@ -2609,11 +2543,11 @@
         <w:pStyle w:val="Compact"/>
         <w:numPr>
           <w:ilvl w:val="0"/>
-          <w:numId w:val="1002"/>
+          <w:numId w:val="1001"/>
         </w:numPr>
       </w:pPr>
       <w:r>
-        <w:t xml:space="preserve">Ellis MJ, Gillette M, Carr SA, Paulovich AG, Smith RD, Rodland KK, et al. Connecting genomic alterations to cancer biology with proteomics: the NCI Clinical Proteomic Tumor Analysis Consortium. Cancer Discov. 2013;3(10):1108–1112.</w:t>
+        <w:t xml:space="preserve">Bates PJ, Reyes-Reyes EM, Malik MT, Murphy EM, O’Toole MG, Trent JO. G-quadruplex oligonucleotide AS1411 as a cancer-targeting agent: uses and mechanisms. Biochim Biophys Acta Gen Subj. 2017;1861(5 Pt B):1414–1428.</w:t>
       </w:r>
     </w:p>
     <w:p>
@@ -2621,11 +2555,11 @@
         <w:pStyle w:val="Compact"/>
         <w:numPr>
           <w:ilvl w:val="0"/>
-          <w:numId w:val="1002"/>
+          <w:numId w:val="1001"/>
         </w:numPr>
       </w:pPr>
       <w:r>
-        <w:t xml:space="preserve">Ioannidis JP. Why most published research findings are false. PLoS Med. 2005;2(8):e124.</w:t>
+        <w:t xml:space="preserve">Gilles ME, Maione F, Cossutta M, Carpentier G, Caruana L, Di Maria S, et al. Nucleolin targeting impairs the progression of pancreatic cancer and promotes the normalization of tumor vasculature. Cancer Res. 2016;76(24):7181–7193.</w:t>
       </w:r>
     </w:p>
     <w:p>
@@ -2633,11 +2567,11 @@
         <w:pStyle w:val="Compact"/>
         <w:numPr>
           <w:ilvl w:val="0"/>
-          <w:numId w:val="1002"/>
+          <w:numId w:val="1001"/>
         </w:numPr>
       </w:pPr>
       <w:r>
-        <w:t xml:space="preserve">Benjamini Y, Hochberg Y. Controlling the false discovery rate: a practical and powerful approach to multiple testing. J R Stat Soc Series B Stat Methodol. 1995;57(1):289–300.</w:t>
+        <w:t xml:space="preserve">Ponzo M, Debesset A, Cossutta M, Chalabi-Dchar M, Houppe C, Pilon C, et al. Nucleolin therapeutic targeting decreases pancreatic cancer immunosuppression. Cancers (Basel). 2022;14(17):4265.</w:t>
       </w:r>
     </w:p>
     <w:p>
@@ -2645,11 +2579,11 @@
         <w:pStyle w:val="Compact"/>
         <w:numPr>
           <w:ilvl w:val="0"/>
-          <w:numId w:val="1002"/>
+          <w:numId w:val="1001"/>
         </w:numPr>
       </w:pPr>
       <w:r>
-        <w:t xml:space="preserve">Yangngam S, Prasopsiri J, Hatthakarnkul P, Thongchot S, Thuwajit P, Yenchitsomanus PT, et al. Cellular localization of nucleolin determines the prognosis in cancers: a meta-analysis. J Mol Med (Berl). 2022;100(8):1145–1157.</w:t>
+        <w:t xml:space="preserve">Lin Q, Ma X, Hu S, Li R, Wei X, Han B, et al. Overexpression of nucleolin is a potential prognostic marker in endometrial carcinoma. Cancer Manag Res. 2021;13:1955–1965.</w:t>
       </w:r>
     </w:p>
     <w:p>
@@ -2657,11 +2591,11 @@
         <w:pStyle w:val="Compact"/>
         <w:numPr>
           <w:ilvl w:val="0"/>
-          <w:numId w:val="1002"/>
+          <w:numId w:val="1001"/>
         </w:numPr>
       </w:pPr>
       <w:r>
-        <w:t xml:space="preserve">Berger CM, Gaume X, Bouvet P. The roles of nucleolin subcellular localization in cancer. Biochimie. 2015;113:78–85.</w:t>
+        <w:t xml:space="preserve">Ezzatifar F, Rafiei A, Jeddi-Tehrani M. Nucleolin: a tumor associated antigen as a potential lung cancer biomarker. Pathol Res Pract. 2022;240:154160.</w:t>
       </w:r>
     </w:p>
     <w:p>
@@ -2669,11 +2603,11 @@
         <w:pStyle w:val="Compact"/>
         <w:numPr>
           <w:ilvl w:val="0"/>
-          <w:numId w:val="1002"/>
+          <w:numId w:val="1001"/>
         </w:numPr>
       </w:pPr>
       <w:r>
-        <w:t xml:space="preserve">Mongelard F, Bouvet P. Nucleolin: a multiFACeTed protein. Trends Cell Biol. 2007;17(2):80–86.</w:t>
+        <w:t xml:space="preserve">Ying J, Pan R, Tang Z, Zhu J, Ren P, Lou Y, et al. Downregulation of NCL attenuates tumor formation and growth in HeLa cells by targeting the PI3K/AKT pathway. Cancer Med. 2022;11(6):1454–1464.</w:t>
       </w:r>
     </w:p>
     <w:p>
@@ -2681,11 +2615,11 @@
         <w:pStyle w:val="Compact"/>
         <w:numPr>
           <w:ilvl w:val="0"/>
-          <w:numId w:val="1002"/>
+          <w:numId w:val="1001"/>
         </w:numPr>
       </w:pPr>
       <w:r>
-        <w:t xml:space="preserve">Jia W, Yao Z, Zhao J, Guan Q, Gao L. New perspectives of physiological and pathological functions of nucleolin (NCL). Life Sci. 2017;186:1–10.</w:t>
+        <w:t xml:space="preserve">Ugrinova I, Petrova M, Chalabi-Dchar M, Bouvet P. Multifaceted nucleolin protein and its molecular partners in oncogenesis. Adv Protein Chem Struct Biol. 2018;111:133–164.</w:t>
       </w:r>
     </w:p>
     <w:p>
@@ -2693,11 +2627,11 @@
         <w:pStyle w:val="Compact"/>
         <w:numPr>
           <w:ilvl w:val="0"/>
-          <w:numId w:val="1002"/>
+          <w:numId w:val="1001"/>
         </w:numPr>
       </w:pPr>
       <w:r>
-        <w:t xml:space="preserve">Bates PJ, Reyes-Reyes EM, Malik MT, Murphy EM, O’Toole MG, Trent JO. G-quadruplex oligonucleotide AS1411 as a cancer-targeting agent: uses and mechanisms. Biochim Biophys Acta Gen Subj. 2017;1861(5 Pt B):1414–1428.</w:t>
+        <w:t xml:space="preserve">Yu X, Xie L, Ge J, Li H, Zhong S, Liu X. Integrating single-cell RNA-seq and spatial transcriptomics reveals MDK-NCL dependent immunosuppressive environment in endometrial carcinoma. Front Immunol. 2023;14:1145300.</w:t>
       </w:r>
     </w:p>
     <w:p>
@@ -2705,11 +2639,11 @@
         <w:pStyle w:val="Compact"/>
         <w:numPr>
           <w:ilvl w:val="0"/>
-          <w:numId w:val="1002"/>
+          <w:numId w:val="1001"/>
         </w:numPr>
       </w:pPr>
       <w:r>
-        <w:t xml:space="preserve">Gilles ME, Maione F, Cossutta M, Carpentier G, Caruana L, Di Maria S, et al. Nucleolin targeting impairs the progression of pancreatic cancer and promotes the normalization of tumor vasculature. Cancer Res. 2016;76(24):7181–7193.</w:t>
+        <w:t xml:space="preserve">Newman AM, Liu CL, Green MR, Gentles AJ, Feng W, Xu Y, et al. Robust enumeration of cell subsets from tissue expression profiles. Nat Methods. 2015;12(5):453–457.</w:t>
       </w:r>
     </w:p>
     <w:p>
@@ -2717,11 +2651,11 @@
         <w:pStyle w:val="Compact"/>
         <w:numPr>
           <w:ilvl w:val="0"/>
-          <w:numId w:val="1002"/>
+          <w:numId w:val="1001"/>
         </w:numPr>
       </w:pPr>
       <w:r>
-        <w:t xml:space="preserve">Ponzo M, Debesset A, Cossutta M, Chalabi-Dchar M, Houppe C, Pilon C, et al. Nucleolin therapeutic targeting decreases pancreatic cancer immunosuppression. Cancers (Basel). 2022;14(17):4265.</w:t>
+        <w:t xml:space="preserve">Finotello F, Mayer C, Plattner C, Laschober G, Rieder D, Hackl H, et al. Molecular and pharmacological modulators of the tumor immune contexture revealed by deconvolution of RNA-seq data. Genome Med. 2019;11(1):34.</w:t>
       </w:r>
     </w:p>
     <w:p>
@@ -2729,11 +2663,11 @@
         <w:pStyle w:val="Compact"/>
         <w:numPr>
           <w:ilvl w:val="0"/>
-          <w:numId w:val="1002"/>
+          <w:numId w:val="1001"/>
         </w:numPr>
       </w:pPr>
       <w:r>
-        <w:t xml:space="preserve">Lin Q, Ma X, Hu S, Li R, Wei X, Han B, et al. Overexpression of nucleolin is a potential prognostic marker in endometrial carcinoma. Cancer Manag Res. 2021;13:1955–1965.</w:t>
+        <w:t xml:space="preserve">Aran D, Hu Z, Butte AJ. xCell: digitally portraying the tissue cellular heterogeneity landscape. Genome Biol. 2017;18(1):220.</w:t>
       </w:r>
     </w:p>
     <w:p>
@@ -2741,11 +2675,11 @@
         <w:pStyle w:val="Compact"/>
         <w:numPr>
           <w:ilvl w:val="0"/>
-          <w:numId w:val="1002"/>
+          <w:numId w:val="1001"/>
         </w:numPr>
       </w:pPr>
       <w:r>
-        <w:t xml:space="preserve">Ezzatifar F, Rafiei A, Jeddi-Tehrani M. Nucleolin: a tumor associated antigen as a potential lung cancer biomarker. Pathol Res Pract. 2022;240:154160.</w:t>
+        <w:t xml:space="preserve">Becht E, Giraldo NA, Lacroix L, Buttard B, Elarouci N, Petitprez F, et al. Estimating the population abundance of tissue-infiltrating immune and stromal cell populations using gene expression. Genome Biol. 2016;17(1):218.</w:t>
       </w:r>
     </w:p>
     <w:p>
@@ -2753,11 +2687,11 @@
         <w:pStyle w:val="Compact"/>
         <w:numPr>
           <w:ilvl w:val="0"/>
-          <w:numId w:val="1002"/>
+          <w:numId w:val="1001"/>
         </w:numPr>
       </w:pPr>
       <w:r>
-        <w:t xml:space="preserve">Ying J, Pan R, Tang Z, Zhu J, Ren P, Lou Y, et al. Downregulation of NCL attenuates tumor formation and growth in HeLa cells by targeting the PI3K/AKT pathway. Cancer Med. 2022;11(6):1454–1464.</w:t>
+        <w:t xml:space="preserve">Racle J, de Jonge K, Baumgaertner P, Speiser DE, Gfeller D. Simultaneous enumeration of cancer and immune cell types from bulk tumor gene expression data. Elife. 2017;6:e26476.</w:t>
       </w:r>
     </w:p>
     <w:p>
@@ -2765,11 +2699,11 @@
         <w:pStyle w:val="Compact"/>
         <w:numPr>
           <w:ilvl w:val="0"/>
-          <w:numId w:val="1002"/>
+          <w:numId w:val="1001"/>
         </w:numPr>
       </w:pPr>
       <w:r>
-        <w:t xml:space="preserve">Ugrinova I, Petrova M, Chalabi-Dchar M, Bouvet P. Multifaceted nucleolin protein and its molecular partners in oncogenesis. Adv Protein Chem Struct Biol. 2018;111:133–164.</w:t>
+        <w:t xml:space="preserve">Vivian J, Rao AA, Nothaft FA, Ketchum C, Armstrong J, Novak A, et al. Toil enables reproducible, open source, big biomedical data analyses. Nat Biotechnol. 2017;35(4):314–316.</w:t>
       </w:r>
     </w:p>
     <w:p>
@@ -2777,11 +2711,11 @@
         <w:pStyle w:val="Compact"/>
         <w:numPr>
           <w:ilvl w:val="0"/>
-          <w:numId w:val="1002"/>
+          <w:numId w:val="1001"/>
         </w:numPr>
       </w:pPr>
       <w:r>
-        <w:t xml:space="preserve">Yu X, Xie L, Ge J, Li H, Zhong S, Liu X. Integrating single-cell RNA-seq and spatial transcriptomics reveals MDK-NCL dependent immunosuppressive environment in endometrial carcinoma. Front Immunol. 2023;14:1145300.</w:t>
+        <w:t xml:space="preserve">Cerami E, Gao J, Dogrusoz U, Gross BE, Sumer SO, Aksoy BA, et al. The cBio Cancer Genomics Portal: an open platform for exploring multidimensional cancer genomics data. Cancer Discov. 2012;2(5):401–404.</w:t>
       </w:r>
     </w:p>
     <w:p>
@@ -2789,11 +2723,11 @@
         <w:pStyle w:val="Compact"/>
         <w:numPr>
           <w:ilvl w:val="0"/>
-          <w:numId w:val="1002"/>
+          <w:numId w:val="1001"/>
         </w:numPr>
       </w:pPr>
       <w:r>
-        <w:t xml:space="preserve">Newman AM, Liu CL, Green MR, Gentles AJ, Feng W, Xu Y, et al. Robust enumeration of cell subsets from tissue expression profiles. Nat Methods. 2015;12(5):453–457.</w:t>
+        <w:t xml:space="preserve">Gao J, Aksoy BA, Dogrusoz U, Dresdner G, Gross B, Sumer SO, et al. Integrative analysis of complex cancer genomics and clinical profiles using the cBioPortal. Sci Signal. 2013;6(269):pl1.</w:t>
       </w:r>
     </w:p>
     <w:p>
@@ -2801,11 +2735,11 @@
         <w:pStyle w:val="Compact"/>
         <w:numPr>
           <w:ilvl w:val="0"/>
-          <w:numId w:val="1002"/>
+          <w:numId w:val="1001"/>
         </w:numPr>
       </w:pPr>
       <w:r>
-        <w:t xml:space="preserve">Finotello F, Mayer C, Plattner C, Laschober G, Rieder D, Hackl H, et al. Molecular and pharmacological modulators of the tumor immune contexture revealed by deconvolution of RNA-seq data. Genome Med. 2019;11(1):34.</w:t>
+        <w:t xml:space="preserve">Liu J, Lichtenberg T, Hoadley KA, Poisson LM, Lazar AJ, Cherniack AD, et al. An integrated TCGA pan-cancer clinical data resource to drive high-quality survival outcome analytics. Cell. 2018;173(2):400–416.e11.</w:t>
       </w:r>
     </w:p>
     <w:p>
@@ -2813,11 +2747,11 @@
         <w:pStyle w:val="Compact"/>
         <w:numPr>
           <w:ilvl w:val="0"/>
-          <w:numId w:val="1002"/>
+          <w:numId w:val="1001"/>
         </w:numPr>
       </w:pPr>
       <w:r>
-        <w:t xml:space="preserve">Aran D, Hu Z, Butte AJ. xCell: digitally portraying the tissue cellular heterogeneity landscape. Genome Biol. 2017;18(1):220.</w:t>
+        <w:t xml:space="preserve">Kautto EA, Bonneville R, Miya J, Yu L, Krook MA, Reeser JW, et al. Performance evaluation for rapid detection of pan-cancer microsatellite instability with MANTIS. Oncotarget. 2017;8(5):7452–7463.</w:t>
       </w:r>
     </w:p>
     <w:p>
@@ -2825,11 +2759,11 @@
         <w:pStyle w:val="Compact"/>
         <w:numPr>
           <w:ilvl w:val="0"/>
-          <w:numId w:val="1002"/>
+          <w:numId w:val="1001"/>
         </w:numPr>
       </w:pPr>
       <w:r>
-        <w:t xml:space="preserve">Becht E, Giraldo NA, Lacroix L, Buttard B, Elarouci N, Petitprez F, et al. Estimating the population abundance of tissue-infiltrating immune and stromal cell populations using gene expression. Genome Biol. 2016;17(1):218.</w:t>
+        <w:t xml:space="preserve">Li T, Fu J, Zeng Z, Cohen D, Li J, Chen Q, et al. TIMER2.0 for analysis of tumor-infiltrating immune cells. Nucleic Acids Res. 2020;48(W1):W509–W514.</w:t>
       </w:r>
     </w:p>
     <w:p>
@@ -2837,11 +2771,11 @@
         <w:pStyle w:val="Compact"/>
         <w:numPr>
           <w:ilvl w:val="0"/>
-          <w:numId w:val="1002"/>
+          <w:numId w:val="1001"/>
         </w:numPr>
       </w:pPr>
       <w:r>
-        <w:t xml:space="preserve">Racle J, de Jonge K, Baumgaertner P, Speiser DE, Gfeller D. Simultaneous enumeration of cancer and immune cell types from bulk tumor gene expression data. Elife. 2017;6:e26476.</w:t>
+        <w:t xml:space="preserve">Grambsch PM, Therneau TM. Proportional hazards tests and diagnostics based on weighted residuals. Biometrika. 1994;81(3):515–526.</w:t>
       </w:r>
     </w:p>
     <w:p>
@@ -2849,11 +2783,11 @@
         <w:pStyle w:val="Compact"/>
         <w:numPr>
           <w:ilvl w:val="0"/>
-          <w:numId w:val="1002"/>
+          <w:numId w:val="1001"/>
         </w:numPr>
       </w:pPr>
       <w:r>
-        <w:t xml:space="preserve">Vivian J, Rao AA, Nothaft FA, Ketchum C, Armstrong J, Novak A, et al. Toil enables reproducible, open source, big biomedical data analyses. Nat Biotechnol. 2017;35(4):314–316.</w:t>
+        <w:t xml:space="preserve">Subramanian A, Tamayo P, Mootha VK, Mukherjee S, Ebert BL, Gillette MA, et al. Gene set enrichment analysis: a knowledge-based approach for interpreting genome-wide expression profiles. Proc Natl Acad Sci U S A. 2005;102(43):15545–15550.</w:t>
       </w:r>
     </w:p>
     <w:p>
@@ -2861,11 +2795,11 @@
         <w:pStyle w:val="Compact"/>
         <w:numPr>
           <w:ilvl w:val="0"/>
-          <w:numId w:val="1002"/>
+          <w:numId w:val="1001"/>
         </w:numPr>
       </w:pPr>
       <w:r>
-        <w:t xml:space="preserve">Cerami E, Gao J, Dogrusoz U, Gross BE, Sumer SO, Aksoy BA, et al. The cBio Cancer Genomics Portal: an open platform for exploring multidimensional cancer genomics data. Cancer Discov. 2012;2(5):401–404.</w:t>
+        <w:t xml:space="preserve">Liberzon A, Birger C, Thorvaldsdóttir H, Ghandi M, Mesirov JP, Tamayo P. The Molecular Signatures Database (MSigDB) hallmark gene set collection. Cell Syst. 2015;1(6):417–425.</w:t>
       </w:r>
     </w:p>
     <w:p>
@@ -2873,11 +2807,11 @@
         <w:pStyle w:val="Compact"/>
         <w:numPr>
           <w:ilvl w:val="0"/>
-          <w:numId w:val="1002"/>
+          <w:numId w:val="1001"/>
         </w:numPr>
       </w:pPr>
       <w:r>
-        <w:t xml:space="preserve">Gao J, Aksoy BA, Dogrusoz U, Dresdner G, Gross B, Sumer SO, et al. Integrative analysis of complex cancer genomics and clinical profiles using the cBioPortal. Sci Signal. 2013;6(269):pl1.</w:t>
+        <w:t xml:space="preserve">Gillespie M, Jassal B, Stephan R, Milacic M, Rothfels K, Senff-Ribeiro A, et al. The Reactome pathway knowledgebase 2022. Nucleic Acids Res. 2022;50(D1):D687–D692.</w:t>
       </w:r>
     </w:p>
     <w:p>
@@ -2885,11 +2819,11 @@
         <w:pStyle w:val="Compact"/>
         <w:numPr>
           <w:ilvl w:val="0"/>
-          <w:numId w:val="1002"/>
+          <w:numId w:val="1001"/>
         </w:numPr>
       </w:pPr>
       <w:r>
-        <w:t xml:space="preserve">Liu J, Lichtenberg T, Hoadley KA, Poisson LM, Lazar AJ, Cherniack AD, et al. An integrated TCGA pan-cancer clinical data resource to drive high-quality survival outcome analytics. Cell. 2018;173(2):400–416.e11.</w:t>
+        <w:t xml:space="preserve">Fang Z, Liu X, Peltz G. GSEApy: a comprehensive package for performing gene set enrichment analysis in Python. Bioinformatics. 2023;39(1):btac757.</w:t>
       </w:r>
     </w:p>
     <w:p>
@@ -2897,11 +2831,11 @@
         <w:pStyle w:val="Compact"/>
         <w:numPr>
           <w:ilvl w:val="0"/>
-          <w:numId w:val="1002"/>
+          <w:numId w:val="1001"/>
         </w:numPr>
       </w:pPr>
       <w:r>
-        <w:t xml:space="preserve">Kautto EA, Bonneville R, Miya J, Yu L, Krook MA, Reeser JW, et al. Performance evaluation for rapid detection of pan-cancer microsatellite instability with MANTIS. Oncotarget. 2017;8(5):7452–7463.</w:t>
+        <w:t xml:space="preserve">Koumprentziotis IA, Theocharopoulos C, Foteinou D, Angeli E, Anastasopoulou A, Gogas H, et al. New emerging targets in cancer immunotherapy: the role of B7-H3. Vaccines (Basel). 2024;12(1):54.</w:t>
       </w:r>
     </w:p>
     <w:p>
@@ -2909,11 +2843,11 @@
         <w:pStyle w:val="Compact"/>
         <w:numPr>
           <w:ilvl w:val="0"/>
-          <w:numId w:val="1002"/>
+          <w:numId w:val="1001"/>
         </w:numPr>
       </w:pPr>
       <w:r>
-        <w:t xml:space="preserve">Li T, Fu J, Zeng Z, Cohen D, Li J, Chen Q, et al. TIMER2.0 for analysis of tumor-infiltrating immune cells. Nucleic Acids Res. 2020;48(W1):W509–W514.</w:t>
+        <w:t xml:space="preserve">Allard B, Allard D, Buisseret L, Stagg J. The adenosine pathway in immuno-oncology. Nat Rev Clin Oncol. 2020;17(10):611–629.</w:t>
       </w:r>
     </w:p>
     <w:p>
@@ -2921,11 +2855,11 @@
         <w:pStyle w:val="Compact"/>
         <w:numPr>
           <w:ilvl w:val="0"/>
-          <w:numId w:val="1002"/>
+          <w:numId w:val="1001"/>
         </w:numPr>
       </w:pPr>
       <w:r>
-        <w:t xml:space="preserve">Grambsch PM, Therneau TM. Proportional hazards tests and diagnostics based on weighted residuals. Biometrika. 1994;81(3):515–526.</w:t>
+        <w:t xml:space="preserve">Goldman MJ, Craft B, Hastie M, Repečka K, McDade F, Kamath A, et al. Visualizing and interpreting cancer genomics data via the Xena platform. Nat Biotechnol. 2020;38(6):675–678.</w:t>
       </w:r>
     </w:p>
     <w:p>
@@ -2933,11 +2867,11 @@
         <w:pStyle w:val="Compact"/>
         <w:numPr>
           <w:ilvl w:val="0"/>
-          <w:numId w:val="1002"/>
+          <w:numId w:val="1001"/>
         </w:numPr>
       </w:pPr>
       <w:r>
-        <w:t xml:space="preserve">Subramanian A, Tamayo P, Mootha VK, Mukherjee S, Ebert BL, Gillette MA, et al. Gene set enrichment analysis: a knowledge-based approach for interpreting genome-wide expression profiles. Proc Natl Acad Sci U S A. 2005;102(43):15545–15550.</w:t>
+        <w:t xml:space="preserve">Cliff N. Dominance statistics: ordinal analyses to answer ordinal questions. Psychol Bull. 1993;114(3):494–509.</w:t>
       </w:r>
     </w:p>
     <w:p>
@@ -2945,99 +2879,15 @@
         <w:pStyle w:val="Compact"/>
         <w:numPr>
           <w:ilvl w:val="0"/>
-          <w:numId w:val="1002"/>
+          <w:numId w:val="1001"/>
         </w:numPr>
       </w:pPr>
       <w:r>
-        <w:t xml:space="preserve">Liberzon A, Birger C, Thorvaldsdóttir H, Ghandi M, Mesirov JP, Tamayo P. The Molecular Signatures Database (MSigDB) hallmark gene set collection. Cell Syst. 2015;1(6):417–425.</w:t>
-      </w:r>
-    </w:p>
-    <w:p>
-      <w:pPr>
-        <w:pStyle w:val="Compact"/>
-        <w:numPr>
-          <w:ilvl w:val="0"/>
-          <w:numId w:val="1002"/>
-        </w:numPr>
-      </w:pPr>
-      <w:r>
-        <w:t xml:space="preserve">Gillespie M, Jassal B, Stephan R, Milacic M, Rothfels K, Senff-Ribeiro A, et al. The Reactome pathway knowledgebase 2022. Nucleic Acids Res. 2022;50(D1):D687–D692.</w:t>
-      </w:r>
-    </w:p>
-    <w:p>
-      <w:pPr>
-        <w:pStyle w:val="Compact"/>
-        <w:numPr>
-          <w:ilvl w:val="0"/>
-          <w:numId w:val="1002"/>
-        </w:numPr>
-      </w:pPr>
-      <w:r>
-        <w:t xml:space="preserve">Fang Z, Liu X, Peltz G. GSEApy: a comprehensive package for performing gene set enrichment analysis in Python. Bioinformatics. 2023;39(1):btac757.</w:t>
-      </w:r>
-    </w:p>
-    <w:p>
-      <w:pPr>
-        <w:pStyle w:val="Compact"/>
-        <w:numPr>
-          <w:ilvl w:val="0"/>
-          <w:numId w:val="1002"/>
-        </w:numPr>
-      </w:pPr>
-      <w:r>
-        <w:t xml:space="preserve">Koumprentziotis IA, Theocharopoulos C, Foteinou D, Angeli E, Anastasopoulou A, Gogas H, et al. New emerging targets in cancer immunotherapy: the role of B7-H3. Vaccines (Basel). 2024;12(1):54.</w:t>
-      </w:r>
-    </w:p>
-    <w:p>
-      <w:pPr>
-        <w:pStyle w:val="Compact"/>
-        <w:numPr>
-          <w:ilvl w:val="0"/>
-          <w:numId w:val="1002"/>
-        </w:numPr>
-      </w:pPr>
-      <w:r>
-        <w:t xml:space="preserve">Allard B, Allard D, Buisseret L, Stagg J. The adenosine pathway in immuno-oncology. Nat Rev Clin Oncol. 2020;17(10):611–629.</w:t>
-      </w:r>
-    </w:p>
-    <w:p>
-      <w:pPr>
-        <w:pStyle w:val="Compact"/>
-        <w:numPr>
-          <w:ilvl w:val="0"/>
-          <w:numId w:val="1002"/>
-        </w:numPr>
-      </w:pPr>
-      <w:r>
-        <w:t xml:space="preserve">Goldman MJ, Craft B, Hastie M, Repečka K, McDade F, Kamath A, et al. Visualizing and interpreting cancer genomics data via the Xena platform. Nat Biotechnol. 2020;38(6):675–678.</w:t>
-      </w:r>
-    </w:p>
-    <w:p>
-      <w:pPr>
-        <w:pStyle w:val="Compact"/>
-        <w:numPr>
-          <w:ilvl w:val="0"/>
-          <w:numId w:val="1002"/>
-        </w:numPr>
-      </w:pPr>
-      <w:r>
-        <w:t xml:space="preserve">Cliff N. Dominance statistics: ordinal analyses to answer ordinal questions. Psychol Bull. 1993;114(3):494–509.</w:t>
-      </w:r>
-    </w:p>
-    <w:p>
-      <w:pPr>
-        <w:pStyle w:val="Compact"/>
-        <w:numPr>
-          <w:ilvl w:val="0"/>
-          <w:numId w:val="1002"/>
-        </w:numPr>
-      </w:pPr>
-      <w:r>
         <w:t xml:space="preserve">Davidson-Pilon C. lifelines: survival analysis in Python. J Open Source Softw. 2019;4(40):1317.</w:t>
       </w:r>
     </w:p>
-    <w:bookmarkEnd w:id="42"/>
-    <w:bookmarkStart w:id="43" w:name="figure-legends"/>
+    <w:bookmarkEnd w:id="41"/>
+    <w:bookmarkStart w:id="42" w:name="figure-legends"/>
     <w:p>
       <w:pPr>
         <w:pStyle w:val="Heading2"/>
@@ -3154,8 +3004,8 @@
         <w:t xml:space="preserve">Normalised enrichment scores from pre-ranked GSEA of genes ranked by within-cancer correlation with NCL, for Hallmark and Reactome gene sets showing consistent direction across cancers. Only gene sets significant at q&lt;0.05 in at least three cancers are shown.</w:t>
       </w:r>
     </w:p>
-    <w:bookmarkEnd w:id="43"/>
-    <w:bookmarkStart w:id="44" w:name="tables"/>
+    <w:bookmarkEnd w:id="42"/>
+    <w:bookmarkStart w:id="43" w:name="tables"/>
     <w:p>
       <w:pPr>
         <w:pStyle w:val="Heading2"/>
@@ -3321,8 +3171,8 @@
         <w:t xml:space="preserve">Complete per-test result tables for differential expression, stage association, survival, immune infiltration across all algorithms, checkpoint associations, and GSEA.</w:t>
       </w:r>
     </w:p>
+    <w:bookmarkEnd w:id="43"/>
     <w:bookmarkEnd w:id="44"/>
-    <w:bookmarkEnd w:id="45"/>
     <w:sectPr>
       <w:footnotePr>
         <w:numRestart w:val="eachSect"/>
@@ -3522,36 +3372,6 @@
     <w:abstractNumId w:val="990"/>
   </w:num>
   <w:num w:numId="1001">
-    <w:abstractNumId w:val="99411"/>
-    <w:lvlOverride w:ilvl="0">
-      <w:startOverride w:val="1"/>
-    </w:lvlOverride>
-    <w:lvlOverride w:ilvl="1">
-      <w:startOverride w:val="1"/>
-    </w:lvlOverride>
-    <w:lvlOverride w:ilvl="2">
-      <w:startOverride w:val="1"/>
-    </w:lvlOverride>
-    <w:lvlOverride w:ilvl="3">
-      <w:startOverride w:val="1"/>
-    </w:lvlOverride>
-    <w:lvlOverride w:ilvl="4">
-      <w:startOverride w:val="1"/>
-    </w:lvlOverride>
-    <w:lvlOverride w:ilvl="5">
-      <w:startOverride w:val="1"/>
-    </w:lvlOverride>
-    <w:lvlOverride w:ilvl="6">
-      <w:startOverride w:val="1"/>
-    </w:lvlOverride>
-    <w:lvlOverride w:ilvl="7">
-      <w:startOverride w:val="1"/>
-    </w:lvlOverride>
-    <w:lvlOverride w:ilvl="8">
-      <w:startOverride w:val="1"/>
-    </w:lvlOverride>
-  </w:num>
-  <w:num w:numId="1002">
     <w:abstractNumId w:val="99411"/>
     <w:lvlOverride w:ilvl="0">
       <w:startOverride w:val="1"/>

</xml_diff>

<commit_message>
Citations, figure legends, named cohorts, and run manifest
Citations
- Added methodological references used but not previously cited: RSEM,
  GENCODE, Hedges' g, Jonckheere (1954), Terpstra (1952), the original
  TIMER algorithm, Bonett & Wright, NumPy and SciPy.
- Renumbered all references into AMA first-appearance order.

Figure legends
- Legends rewritten to match the panels actually plotted, and to explain
  what the n/32 fractions denote.

Named cohorts
- Cancers behind each fraction named in the Results: GSEA exceptions,
  checkpoint directions per cancer, TMB and MSI cancers, immune and
  stromal score exceptions.

Reproducibility
- New 11_manifest.py records SHA-256, size and retrieval date of every
  input, shape and checksum of every result table, resolved versions of
  all numeric packages, and the random seeds. The public data sources are
  not archival, so without this a rerun cannot be checked against these
  numbers.

Co-Authored-By: Claude Opus 5 <noreply@anthropic.com>
</commit_message>
<xml_diff>
--- a/manuscript/manuscript_revised.docx
+++ b/manuscript/manuscript_revised.docx
@@ -2,7 +2,7 @@
 <file path=word/document.xml><?xml version="1.0" encoding="utf-8"?>
 <w:document xmlns:w="http://schemas.openxmlformats.org/wordprocessingml/2006/main" xmlns:m="http://schemas.openxmlformats.org/officeDocument/2006/math" xmlns:r="http://schemas.openxmlformats.org/officeDocument/2006/relationships" xmlns:o="urn:schemas-microsoft-com:office:office" xmlns:v="urn:schemas-microsoft-com:vml" xmlns:w10="urn:schemas-microsoft-com:office:word" xmlns:a="http://schemas.openxmlformats.org/drawingml/2006/main" xmlns:pic="http://schemas.openxmlformats.org/drawingml/2006/picture" xmlns:wp="http://schemas.openxmlformats.org/drawingml/2006/wordprocessingDrawing">
   <w:body>
-    <w:bookmarkStart w:id="44" w:name="Xc4c38cf038f37278152df762ccf6b8977439a70"/>
+    <w:bookmarkStart w:id="43" w:name="Xc4c38cf038f37278152df762ccf6b8977439a70"/>
     <w:p>
       <w:pPr>
         <w:pStyle w:val="Heading1"/>
@@ -494,7 +494,76 @@
         <w:pStyle w:val="FirstParagraph"/>
       </w:pPr>
       <w:r>
-        <w:t xml:space="preserve">All analyses were performed in Python 3.14. Analysis code, intermediate result tables and the exact software environment are openly available (see Data availability), and the workflow is documented step by step in the accompanying repository.</w:t>
+        <w:t xml:space="preserve">All analyses were performed in Python 3.14 using NumPy,</w:t>
+      </w:r>
+      <w:r>
+        <w:rPr>
+          <w:vertAlign w:val="superscript"/>
+        </w:rPr>
+        <w:t xml:space="preserve">25</w:t>
+      </w:r>
+      <w:r>
+        <w:t xml:space="preserve"> </w:t>
+      </w:r>
+      <w:r>
+        <w:t xml:space="preserve">SciPy,</w:t>
+      </w:r>
+      <w:r>
+        <w:rPr>
+          <w:vertAlign w:val="superscript"/>
+        </w:rPr>
+        <w:t xml:space="preserve">26</w:t>
+      </w:r>
+      <w:r>
+        <w:t xml:space="preserve"> </w:t>
+      </w:r>
+      <w:r>
+        <w:t xml:space="preserve">pandas, statsmodels,</w:t>
+      </w:r>
+      <w:r>
+        <w:t xml:space="preserve"> </w:t>
+      </w:r>
+      <w:r>
+        <w:rPr>
+          <w:rStyle w:val="VerbatimChar"/>
+        </w:rPr>
+        <w:t xml:space="preserve">lifelines</w:t>
+      </w:r>
+      <w:r>
+        <w:rPr>
+          <w:vertAlign w:val="superscript"/>
+        </w:rPr>
+        <w:t xml:space="preserve">27</w:t>
+      </w:r>
+      <w:r>
+        <w:t xml:space="preserve"> </w:t>
+      </w:r>
+      <w:r>
+        <w:t xml:space="preserve">and</w:t>
+      </w:r>
+      <w:r>
+        <w:t xml:space="preserve"> </w:t>
+      </w:r>
+      <w:r>
+        <w:rPr>
+          <w:rStyle w:val="VerbatimChar"/>
+        </w:rPr>
+        <w:t xml:space="preserve">gseapy</w:t>
+      </w:r>
+      <w:r>
+        <w:t xml:space="preserve">.</w:t>
+      </w:r>
+      <w:r>
+        <w:rPr>
+          <w:vertAlign w:val="superscript"/>
+        </w:rPr>
+        <w:t xml:space="preserve">28</w:t>
+      </w:r>
+      <w:r>
+        <w:t xml:space="preserve"> </w:t>
+      </w:r>
+      <w:r>
+        <w:t xml:space="preserve">Analysis code, intermediate result tables and the exact software environment are openly available (see Data availability), and the workflow is documented step by step in the accompanying repository.</w:t>
       </w:r>
     </w:p>
     <w:bookmarkStart w:id="12" w:name="expression-data-and-cohort-definition"/>
@@ -529,7 +598,7 @@
         <w:rPr>
           <w:vertAlign w:val="superscript"/>
         </w:rPr>
-        <w:t xml:space="preserve">3,25,38</w:t>
+        <w:t xml:space="preserve">3,29,30</w:t>
       </w:r>
       <w:r>
         <w:t xml:space="preserve"> </w:t>
@@ -632,7 +701,31 @@
         <w:pStyle w:val="BodyText"/>
       </w:pPr>
       <w:r>
-        <w:t xml:space="preserve">Gene identifiers were mapped from GENCODE v23 to gene symbols. Where a symbol mapped to several identifiers, the row with the highest mean expression was retained for single-gene analyses and the most variable row for correlation analyses.</w:t>
+        <w:t xml:space="preserve">Expression values in this resource are RSEM-derived transcript-per-million estimates.</w:t>
+      </w:r>
+      <w:r>
+        <w:rPr>
+          <w:vertAlign w:val="superscript"/>
+        </w:rPr>
+        <w:t xml:space="preserve">31</w:t>
+      </w:r>
+      <w:r>
+        <w:t xml:space="preserve"> </w:t>
+      </w:r>
+      <w:r>
+        <w:t xml:space="preserve">Gene identifiers were mapped from GENCODE v23</w:t>
+      </w:r>
+      <w:r>
+        <w:rPr>
+          <w:vertAlign w:val="superscript"/>
+        </w:rPr>
+        <w:t xml:space="preserve">32</w:t>
+      </w:r>
+      <w:r>
+        <w:t xml:space="preserve"> </w:t>
+      </w:r>
+      <w:r>
+        <w:t xml:space="preserve">to gene symbols. Where a symbol mapped to several identifiers, the row with the highest mean expression was retained for single-gene analyses and the most variable row for correlation analyses.</w:t>
       </w:r>
     </w:p>
     <w:bookmarkEnd w:id="12"/>
@@ -656,7 +749,7 @@
         <w:rPr>
           <w:vertAlign w:val="superscript"/>
         </w:rPr>
-        <w:t xml:space="preserve">26,27</w:t>
+        <w:t xml:space="preserve">33,34</w:t>
       </w:r>
       <w:r>
         <w:t xml:space="preserve"> </w:t>
@@ -668,7 +761,7 @@
         <w:rPr>
           <w:vertAlign w:val="superscript"/>
         </w:rPr>
-        <w:t xml:space="preserve">28</w:t>
+        <w:t xml:space="preserve">35</w:t>
       </w:r>
       <w:r>
         <w:t xml:space="preserve"> </w:t>
@@ -680,21 +773,33 @@
         <w:rPr>
           <w:vertAlign w:val="superscript"/>
         </w:rPr>
-        <w:t xml:space="preserve">29</w:t>
-      </w:r>
-    </w:p>
-    <w:p>
-      <w:pPr>
-        <w:pStyle w:val="BodyText"/>
-      </w:pPr>
-      <w:r>
-        <w:t xml:space="preserve">Immune infiltration estimates for TCGA samples were downloaded from TIMER2.0, which provides pre-computed estimates from seven algorithms: TIMER, CIBERSORT, CIBERSORT-ABS, quanTIseq, MCP-counter, xCell and EPIC.</w:t>
+        <w:t xml:space="preserve">36</w:t>
+      </w:r>
+    </w:p>
+    <w:p>
+      <w:pPr>
+        <w:pStyle w:val="BodyText"/>
+      </w:pPr>
+      <w:r>
+        <w:t xml:space="preserve">Immune infiltration estimates for TCGA samples were downloaded from TIMER2.0, which provides pre-computed estimates from seven algorithms: TIMER,</w:t>
       </w:r>
       <w:r>
         <w:rPr>
           <w:vertAlign w:val="superscript"/>
         </w:rPr>
-        <w:t xml:space="preserve">20–24,30</w:t>
+        <w:t xml:space="preserve">37</w:t>
+      </w:r>
+      <w:r>
+        <w:t xml:space="preserve"> </w:t>
+      </w:r>
+      <w:r>
+        <w:t xml:space="preserve">CIBERSORT, CIBERSORT-ABS, quanTIseq, MCP-counter, xCell and EPIC.</w:t>
+      </w:r>
+      <w:r>
+        <w:rPr>
+          <w:vertAlign w:val="superscript"/>
+        </w:rPr>
+        <w:t xml:space="preserve">20–24,38</w:t>
       </w:r>
       <w:r>
         <w:t xml:space="preserve"> </w:t>
@@ -755,15 +860,39 @@
         <w:t xml:space="preserve">g</w:t>
       </w:r>
       <w:r>
-        <w:t xml:space="preserve">. A non-parametric effect size was preferred because expression distributions are skewed and several cohorts have very small numbers of adjacent normals. Bootstrap intervals were used in preference to Cliff’s asymptotic variance because that approximation is unreliable at the sample sizes some cohorts provide.</w:t>
-      </w:r>
-    </w:p>
-    <w:p>
-      <w:pPr>
-        <w:pStyle w:val="BodyText"/>
-      </w:pPr>
-      <w:r>
-        <w:t xml:space="preserve">Association with pathological stage was assessed with the Jonckheere–Terpstra test for monotonic trend across ordered stages I–IV, using the tie-corrected normal approximation, alongside a Kruskal–Wallis test for any difference among stages. The distinction matters: a Kruskal–Wallis result establishes only that stages differ, not that expression rises with stage, and comparisons of each stage against normal tissue — as displayed by several web tools — do not test a stage-ordered trend at all. Cancers were included when at least three stage groups contained ≥5 patients and the cohort totalled ≥40 staged patients.</w:t>
+        <w:t xml:space="preserve">.</w:t>
+      </w:r>
+      <w:r>
+        <w:rPr>
+          <w:vertAlign w:val="superscript"/>
+        </w:rPr>
+        <w:t xml:space="preserve">40</w:t>
+      </w:r>
+      <w:r>
+        <w:t xml:space="preserve"> </w:t>
+      </w:r>
+      <w:r>
+        <w:t xml:space="preserve">A non-parametric effect size was preferred because expression distributions are skewed and several cohorts have very small numbers of adjacent normals. Bootstrap intervals were used in preference to Cliff’s asymptotic variance because that approximation is unreliable at the sample sizes some cohorts provide.</w:t>
+      </w:r>
+    </w:p>
+    <w:p>
+      <w:pPr>
+        <w:pStyle w:val="BodyText"/>
+      </w:pPr>
+      <w:r>
+        <w:t xml:space="preserve">Association with pathological stage was assessed with the Jonckheere–Terpstra test for monotonic trend across ordered stages I–IV, using the tie-corrected normal approximation, alongside a Kruskal–Wallis test for any difference among stages.</w:t>
+      </w:r>
+      <w:r>
+        <w:rPr>
+          <w:vertAlign w:val="superscript"/>
+        </w:rPr>
+        <w:t xml:space="preserve">41,42</w:t>
+      </w:r>
+      <w:r>
+        <w:t xml:space="preserve"> </w:t>
+      </w:r>
+      <w:r>
+        <w:t xml:space="preserve">The distinction matters: a Kruskal–Wallis result establishes only that stages differ, not that expression rises with stage, and comparisons of each stage against normal tissue — as displayed by several web tools — do not test a stage-ordered trend at all. Cancers were included when at least three stage groups contained ≥5 patients and the cohort totalled ≥40 staged patients.</w:t>
       </w:r>
     </w:p>
     <w:bookmarkEnd w:id="14"/>
@@ -799,7 +928,7 @@
         <w:rPr>
           <w:vertAlign w:val="superscript"/>
         </w:rPr>
-        <w:t xml:space="preserve">40</w:t>
+        <w:t xml:space="preserve">27</w:t>
       </w:r>
       <w:r>
         <w:t xml:space="preserve"> </w:t>
@@ -819,7 +948,7 @@
         <w:rPr>
           <w:vertAlign w:val="superscript"/>
         </w:rPr>
-        <w:t xml:space="preserve">31</w:t>
+        <w:t xml:space="preserve">43</w:t>
       </w:r>
       <w:r>
         <w:t xml:space="preserve"> </w:t>
@@ -891,7 +1020,10 @@
         <w:pStyle w:val="BodyText"/>
       </w:pPr>
       <w:r>
-        <w:t xml:space="preserve">Associations between NCL and immune, stromal and microenvironment scores, tumour mutational burden, MANTIS MSI score, aneuploidy score and fraction of genome altered were computed as Spearman correlations with Fisher-</w:t>
+        <w:t xml:space="preserve">Associations between NCL and immune, stromal and microenvironment scores, tumour mutational burden, MANTIS MSI score, aneuploidy score and fraction of genome altered were computed as Spearman correlations, with confidence intervals obtained by Fisher</w:t>
+      </w:r>
+      <w:r>
+        <w:t xml:space="preserve"> </w:t>
       </w:r>
       <w:r>
         <w:rPr>
@@ -904,7 +1036,13 @@
         <w:t xml:space="preserve"> </w:t>
       </w:r>
       <w:r>
-        <w:t xml:space="preserve">confidence intervals.</w:t>
+        <w:t xml:space="preserve">transformation using the standard error of Bonett and Wright.</w:t>
+      </w:r>
+      <w:r>
+        <w:rPr>
+          <w:vertAlign w:val="superscript"/>
+        </w:rPr>
+        <w:t xml:space="preserve">44</w:t>
       </w:r>
     </w:p>
     <w:bookmarkEnd w:id="16"/>
@@ -1313,7 +1451,7 @@
         <w:rPr>
           <w:vertAlign w:val="superscript"/>
         </w:rPr>
-        <w:t xml:space="preserve">32–35</w:t>
+        <w:t xml:space="preserve">28,45–47</w:t>
       </w:r>
       <w:r>
         <w:t xml:space="preserve"> </w:t>
@@ -1390,7 +1528,19 @@
         <w:pStyle w:val="FirstParagraph"/>
       </w:pPr>
       <w:r>
-        <w:t xml:space="preserve">Benjamini–Hochberg false discovery rate correction was applied within each family of tests: across cancers within each differential-expression comparator; across cancers within each survival endpoint and model type; across all cancer × cell type × algorithm infiltration tests; across all cancer × gene checkpoint tests; across all cancer × measure genomic-score tests; and across all GSEA tests. Adjusted values are reported as</w:t>
+        <w:t xml:space="preserve">Benjamini–Hochberg false discovery rate correction</w:t>
+      </w:r>
+      <w:r>
+        <w:rPr>
+          <w:vertAlign w:val="superscript"/>
+        </w:rPr>
+        <w:t xml:space="preserve">7</w:t>
+      </w:r>
+      <w:r>
+        <w:t xml:space="preserve"> </w:t>
+      </w:r>
+      <w:r>
+        <w:t xml:space="preserve">was applied within each family of tests: across cancers within each differential-expression comparator; across cancers within each survival endpoint and model type; across all cancer × cell type × algorithm infiltration tests; across all cancer × gene checkpoint tests; across all cancer × measure genomic-score tests; and across all GSEA tests. Adjusted values are reported as</w:t>
       </w:r>
       <w:r>
         <w:t xml:space="preserve"> </w:t>
@@ -1421,7 +1571,37 @@
         <w:pStyle w:val="FirstParagraph"/>
       </w:pPr>
       <w:r>
-        <w:t xml:space="preserve">Analyses are deterministic given fixed random seeds (bootstrap resampling, GSEA permutation). Statistical utility functions were verified against brute-force implementations and against</w:t>
+        <w:t xml:space="preserve">Analyses are deterministic given fixed random seeds (bootstrap resampling of Cliff’s delta, seed 0, 2,000 resamples; GSEA permutation, seed 0, 1,000 permutations). Because the public resources used here are not archival — UCSC Xena, TIMER2.0 and MSigDB reissue files at stable URLs, cBioPortal serves a live API, and the</w:t>
+      </w:r>
+      <w:r>
+        <w:t xml:space="preserve"> </w:t>
+      </w:r>
+      <w:r>
+        <w:rPr>
+          <w:rStyle w:val="VerbatimChar"/>
+        </w:rPr>
+        <w:t xml:space="preserve">cptac</w:t>
+      </w:r>
+      <w:r>
+        <w:t xml:space="preserve"> </w:t>
+      </w:r>
+      <w:r>
+        <w:t xml:space="preserve">package retrieves data at run time — a run manifest recording the SHA-256 checksum, byte size and retrieval date of every input file, the shape and checksum of every result table, and the resolved version of every package affecting a numeric result is generated by</w:t>
+      </w:r>
+      <w:r>
+        <w:t xml:space="preserve"> </w:t>
+      </w:r>
+      <w:r>
+        <w:rPr>
+          <w:rStyle w:val="VerbatimChar"/>
+        </w:rPr>
+        <w:t xml:space="preserve">11_manifest.py</w:t>
+      </w:r>
+      <w:r>
+        <w:t xml:space="preserve"> </w:t>
+      </w:r>
+      <w:r>
+        <w:t xml:space="preserve">and distributed with the code. Differences between a future run and the values reported here can therefore be localised to a specific input, package version or code change. Statistical utility functions were verified against brute-force implementations and against</w:t>
       </w:r>
       <w:r>
         <w:t xml:space="preserve"> </w:t>
@@ -1574,7 +1754,7 @@
         <w:pStyle w:val="FirstParagraph"/>
       </w:pPr>
       <w:r>
-        <w:t xml:space="preserve">Across 3,910 cancer × cell type × algorithm tests, 1,229 purity-adjusted associations were significant at q&lt;0.05. The dominant pattern was negative. NCL correlated inversely with the xCell microenvironment score in all 20 cancers where the association was significant, with the immune score in 18 of 20, and with the stromal score in 14 of 15 (Figure 3a; Table 4). The strongest inverse immune-score associations were in GBM (rho −0.38, 95% CI −0.52 to −0.22), SKCM (−0.36, −0.53 to −0.17), LUSC (−0.35, −0.43 to −0.27) and ESCA (−0.34, −0.47 to −0.19). Only PRAD and UVM showed positive associations.</w:t>
+        <w:t xml:space="preserve">Across 3,910 cancer × cell type × algorithm tests, 1,229 purity-adjusted associations were significant at q&lt;0.05. The dominant pattern was negative. NCL correlated inversely with the xCell microenvironment score in all 20 cancers where the association was significant, with the immune score in 18 of 20 (positive only in PRAD and UVM), and with the stromal score in 14 of 15 (positive only in KIRC) (Figure 3a; Table 4). The strongest inverse immune-score associations were in GBM (rho −0.38, 95% CI −0.52 to −0.22), SKCM (−0.36, −0.53 to −0.17), LUSC (−0.35, −0.43 to −0.27) and ESCA (−0.34, −0.47 to −0.19). Only PRAD and UVM showed positive associations.</w:t>
       </w:r>
     </w:p>
     <w:p>
@@ -1666,7 +1846,7 @@
         <w:t xml:space="preserve"> </w:t>
       </w:r>
       <w:r>
-        <w:t xml:space="preserve">(B7-H3): positive and significant in 21 of 33 cancers, with no cancer showing a significant negative association (median rho +0.34; ACC +0.58, PRAD +0.50, GBM +0.47, THCA +0.47, KIRC +0.46). Associations with the two principal components of the adenosine axis followed the same pattern:</w:t>
+        <w:t xml:space="preserve">(B7-H3): positive and significant in 21 of 33 cancers, with no cancer showing a significant negative association (median rho +0.34; ACC +0.58, PRAD +0.50, GBM +0.47, THCA +0.47, KIRC +0.46). The twelve cancers in which the association was not robust were CHOL, DLBC, ESCA, KICH, LAML, MESO, PAAD, SARC, SKCM, TGCT, UCS and UVM — a group weighted towards the smallest cohorts and the non-carcinoma histologies. Associations with the two principal components of the adenosine axis followed the same pattern:</w:t>
       </w:r>
       <w:r>
         <w:t xml:space="preserve"> </w:t>
@@ -1706,7 +1886,7 @@
         <w:pStyle w:val="BodyText"/>
       </w:pPr>
       <w:r>
-        <w:t xml:space="preserve">By contrast, the T-cell checkpoint receptors were weakly and inconsistently associated: PD-1 robust in 3 of 33 cancers, CTLA-4 in 4 of 33 (median rho +0.02), TIGIT in 5, LAG-3 in 6 (all negative), and TIM-3 in 9 of 33 (median rho +0.05). PD-L1 was robust in 7 of 33 (median rho +0.17) and TGF-β1 in 6 of 33.</w:t>
+        <w:t xml:space="preserve">By contrast, the T-cell checkpoint receptors were weakly and inconsistently associated, and where associations did reach significance they were as often negative as positive. PD-1 was robust in 3 of 33 cancers (positive in BLCA; negative in SKCM and THCA) and CTLA-4 in 4 of 33 (positive in BLCA; negative in LUSC, OV and THCA; median rho +0.02). TIGIT was robust in 5, LAG-3 in 6 — negative in all six (KIRC, OV, PRAD, SARC, THCA, UCS) — and TIM-3 in 9 of 33 (median rho +0.05). PD-L1 was robust in 7 of 33, all positive (BLCA, BRCA, KICH, KIRC, LIHC, PAAD, PCPG; median rho +0.17), and TGF-β1 in 6 of 33.</w:t>
       </w:r>
     </w:p>
     <w:p>
@@ -1740,7 +1920,7 @@
         <w:pStyle w:val="FirstParagraph"/>
       </w:pPr>
       <w:r>
-        <w:t xml:space="preserve">NCL showed little relationship with genomic instability measures: tumour mutational burden was significantly associated in 7 of 33 cancers (median rho +0.06), MANTIS MSI score in 10 of 32 (median rho +0.04, with equal numbers of positive and negative associations), and aneuploidy score in 7 of 33 (median rho +0.04). Fraction of genome altered was slightly more often associated (11 of 33, median rho +0.12). NCL therefore does not track the mutational processes that predict immune-checkpoint blockade response, which further distinguishes its immune association from a conventional immunogenicity signal.</w:t>
+        <w:t xml:space="preserve">NCL showed little relationship with genomic instability measures. Tumour mutational burden was significantly associated in 7 of 33 cancers (ACC, BRCA, LGG, LUAD, PRAD, STAD, THCA; median rho +0.06), MANTIS MSI score in 10 of 32 (BRCA, CESC, DLBC, KIRC, LGG, LUSC, OV, PRAD, STAD, THCA; median rho +0.04, with equal numbers of positive and negative associations), and aneuploidy score in 7 of 33 (median rho +0.04). Fraction of genome altered was slightly more often associated (11 of 33, median rho +0.12). NCL therefore does not track the mutational processes that predict immune-checkpoint blockade response, which further distinguishes its immune association from a conventional immunogenicity signal.</w:t>
       </w:r>
     </w:p>
     <w:bookmarkEnd w:id="29"/>
@@ -1832,7 +2012,7 @@
         <w:t xml:space="preserve"> </w:t>
       </w:r>
       <w:r>
-        <w:t xml:space="preserve">(median NES +1.91), MYC targets V1 in 31 of 32 (+1.83), the mitotic spindle signature in 31 of 32 (+1.60), E2F targets in 30 of 32 (+1.91) and MYC targets V2 in 26 of 32 (+1.78). Further positively enriched sets included mTORC1 signalling (21 of 32), PI3K–AKT–mTOR signalling (20 of 32), the unfolded protein response (22 of 32) and DNA repair (14 of 32). Only one signature was consistently depleted, and in a minority of cancers (coagulation, 3 of 32).</w:t>
+        <w:t xml:space="preserve">(median NES +1.91). MYC targets V1 was enriched in 31 of 32 (+1.83; the exception was OV), the mitotic spindle signature in 31 of 32 (+1.60; exception KICH), E2F targets in 30 of 32 (+1.91; exceptions THCA and THYM) and MYC targets V2 in 26 of 32 (+1.78; exceptions KICH, KIRP, PCPG, THCA, THYM and UVM). Every one of these enrichments was positive; none was significantly negative in any cancer. Further positively enriched sets included the unfolded protein response (22 of 32), mTORC1 signalling (21 of 32), PI3K–AKT–mTOR signalling (20 of 32) and DNA repair (14 of 32). Only one signature was consistently depleted, and in only three cancers (coagulation; DLBC, SARC and TGCT).</w:t>
       </w:r>
     </w:p>
     <w:p>
@@ -2045,7 +2225,7 @@
         <w:rPr>
           <w:vertAlign w:val="superscript"/>
         </w:rPr>
-        <w:t xml:space="preserve">36</w:t>
+        <w:t xml:space="preserve">48</w:t>
       </w:r>
     </w:p>
     <w:p>
@@ -2059,7 +2239,7 @@
         <w:rPr>
           <w:vertAlign w:val="superscript"/>
         </w:rPr>
-        <w:t xml:space="preserve">37</w:t>
+        <w:t xml:space="preserve">49</w:t>
       </w:r>
       <w:r>
         <w:t xml:space="preserve"> </w:t>
@@ -2703,7 +2883,7 @@
         </w:numPr>
       </w:pPr>
       <w:r>
-        <w:t xml:space="preserve">Vivian J, Rao AA, Nothaft FA, Ketchum C, Armstrong J, Novak A, et al. Toil enables reproducible, open source, big biomedical data analyses. Nat Biotechnol. 2017;35(4):314–316.</w:t>
+        <w:t xml:space="preserve">Harris CR, Millman KJ, van der Walt SJ, Gommers R, Virtanen P, Cournapeau D, et al. Array programming with NumPy. Nature. 2020;585(7825):357–362.</w:t>
       </w:r>
     </w:p>
     <w:p>
@@ -2715,7 +2895,7 @@
         </w:numPr>
       </w:pPr>
       <w:r>
-        <w:t xml:space="preserve">Cerami E, Gao J, Dogrusoz U, Gross BE, Sumer SO, Aksoy BA, et al. The cBio Cancer Genomics Portal: an open platform for exploring multidimensional cancer genomics data. Cancer Discov. 2012;2(5):401–404.</w:t>
+        <w:t xml:space="preserve">Virtanen P, Gommers R, Oliphant TE, Haberland M, Reddy T, Cournapeau D, et al. SciPy 1.0: fundamental algorithms for scientific computing in Python. Nat Methods. 2020;17(3):261–272.</w:t>
       </w:r>
     </w:p>
     <w:p>
@@ -2727,7 +2907,7 @@
         </w:numPr>
       </w:pPr>
       <w:r>
-        <w:t xml:space="preserve">Gao J, Aksoy BA, Dogrusoz U, Dresdner G, Gross B, Sumer SO, et al. Integrative analysis of complex cancer genomics and clinical profiles using the cBioPortal. Sci Signal. 2013;6(269):pl1.</w:t>
+        <w:t xml:space="preserve">Davidson-Pilon C. lifelines: survival analysis in Python. J Open Source Softw. 2019;4(40):1317.</w:t>
       </w:r>
     </w:p>
     <w:p>
@@ -2739,7 +2919,7 @@
         </w:numPr>
       </w:pPr>
       <w:r>
-        <w:t xml:space="preserve">Liu J, Lichtenberg T, Hoadley KA, Poisson LM, Lazar AJ, Cherniack AD, et al. An integrated TCGA pan-cancer clinical data resource to drive high-quality survival outcome analytics. Cell. 2018;173(2):400–416.e11.</w:t>
+        <w:t xml:space="preserve">Fang Z, Liu X, Peltz G. GSEApy: a comprehensive package for performing gene set enrichment analysis in Python. Bioinformatics. 2023;39(1):btac757.</w:t>
       </w:r>
     </w:p>
     <w:p>
@@ -2751,7 +2931,7 @@
         </w:numPr>
       </w:pPr>
       <w:r>
-        <w:t xml:space="preserve">Kautto EA, Bonneville R, Miya J, Yu L, Krook MA, Reeser JW, et al. Performance evaluation for rapid detection of pan-cancer microsatellite instability with MANTIS. Oncotarget. 2017;8(5):7452–7463.</w:t>
+        <w:t xml:space="preserve">Vivian J, Rao AA, Nothaft FA, Ketchum C, Armstrong J, Novak A, et al. Toil enables reproducible, open source, big biomedical data analyses. Nat Biotechnol. 2017;35(4):314–316.</w:t>
       </w:r>
     </w:p>
     <w:p>
@@ -2763,7 +2943,7 @@
         </w:numPr>
       </w:pPr>
       <w:r>
-        <w:t xml:space="preserve">Li T, Fu J, Zeng Z, Cohen D, Li J, Chen Q, et al. TIMER2.0 for analysis of tumor-infiltrating immune cells. Nucleic Acids Res. 2020;48(W1):W509–W514.</w:t>
+        <w:t xml:space="preserve">Goldman MJ, Craft B, Hastie M, Repečka K, McDade F, Kamath A, et al. Visualizing and interpreting cancer genomics data via the Xena platform. Nat Biotechnol. 2020;38(6):675–678.</w:t>
       </w:r>
     </w:p>
     <w:p>
@@ -2775,7 +2955,7 @@
         </w:numPr>
       </w:pPr>
       <w:r>
-        <w:t xml:space="preserve">Grambsch PM, Therneau TM. Proportional hazards tests and diagnostics based on weighted residuals. Biometrika. 1994;81(3):515–526.</w:t>
+        <w:t xml:space="preserve">Li B, Dewey CN. RSEM: accurate transcript quantification from RNA-Seq data with or without a reference genome. BMC Bioinformatics. 2011;12:323.</w:t>
       </w:r>
     </w:p>
     <w:p>
@@ -2787,7 +2967,7 @@
         </w:numPr>
       </w:pPr>
       <w:r>
-        <w:t xml:space="preserve">Subramanian A, Tamayo P, Mootha VK, Mukherjee S, Ebert BL, Gillette MA, et al. Gene set enrichment analysis: a knowledge-based approach for interpreting genome-wide expression profiles. Proc Natl Acad Sci U S A. 2005;102(43):15545–15550.</w:t>
+        <w:t xml:space="preserve">Frankish A, Diekhans M, Jungreis I, Lagarde J, Loveland JE, Mudge JM, et al. GENCODE 2021. Nucleic Acids Res. 2021;49(D1):D916–D923.</w:t>
       </w:r>
     </w:p>
     <w:p>
@@ -2799,7 +2979,7 @@
         </w:numPr>
       </w:pPr>
       <w:r>
-        <w:t xml:space="preserve">Liberzon A, Birger C, Thorvaldsdóttir H, Ghandi M, Mesirov JP, Tamayo P. The Molecular Signatures Database (MSigDB) hallmark gene set collection. Cell Syst. 2015;1(6):417–425.</w:t>
+        <w:t xml:space="preserve">Cerami E, Gao J, Dogrusoz U, Gross BE, Sumer SO, Aksoy BA, et al. The cBio Cancer Genomics Portal: an open platform for exploring multidimensional cancer genomics data. Cancer Discov. 2012;2(5):401–404.</w:t>
       </w:r>
     </w:p>
     <w:p>
@@ -2811,7 +2991,7 @@
         </w:numPr>
       </w:pPr>
       <w:r>
-        <w:t xml:space="preserve">Gillespie M, Jassal B, Stephan R, Milacic M, Rothfels K, Senff-Ribeiro A, et al. The Reactome pathway knowledgebase 2022. Nucleic Acids Res. 2022;50(D1):D687–D692.</w:t>
+        <w:t xml:space="preserve">Gao J, Aksoy BA, Dogrusoz U, Dresdner G, Gross B, Sumer SO, et al. Integrative analysis of complex cancer genomics and clinical profiles using the cBioPortal. Sci Signal. 2013;6(269):pl1.</w:t>
       </w:r>
     </w:p>
     <w:p>
@@ -2823,7 +3003,7 @@
         </w:numPr>
       </w:pPr>
       <w:r>
-        <w:t xml:space="preserve">Fang Z, Liu X, Peltz G. GSEApy: a comprehensive package for performing gene set enrichment analysis in Python. Bioinformatics. 2023;39(1):btac757.</w:t>
+        <w:t xml:space="preserve">Liu J, Lichtenberg T, Hoadley KA, Poisson LM, Lazar AJ, Cherniack AD, et al. An integrated TCGA pan-cancer clinical data resource to drive high-quality survival outcome analytics. Cell. 2018;173(2):400–416.e11.</w:t>
       </w:r>
     </w:p>
     <w:p>
@@ -2835,7 +3015,7 @@
         </w:numPr>
       </w:pPr>
       <w:r>
-        <w:t xml:space="preserve">Koumprentziotis IA, Theocharopoulos C, Foteinou D, Angeli E, Anastasopoulou A, Gogas H, et al. New emerging targets in cancer immunotherapy: the role of B7-H3. Vaccines (Basel). 2024;12(1):54.</w:t>
+        <w:t xml:space="preserve">Kautto EA, Bonneville R, Miya J, Yu L, Krook MA, Reeser JW, et al. Performance evaluation for rapid detection of pan-cancer microsatellite instability with MANTIS. Oncotarget. 2017;8(5):7452–7463.</w:t>
       </w:r>
     </w:p>
     <w:p>
@@ -2847,7 +3027,7 @@
         </w:numPr>
       </w:pPr>
       <w:r>
-        <w:t xml:space="preserve">Allard B, Allard D, Buisseret L, Stagg J. The adenosine pathway in immuno-oncology. Nat Rev Clin Oncol. 2020;17(10):611–629.</w:t>
+        <w:t xml:space="preserve">Li B, Severson E, Pignon JC, Zhao H, Li T, Novak J, et al. Comprehensive analyses of tumor immunity: implications for cancer immunotherapy. Genome Biol. 2016;17(1):174.</w:t>
       </w:r>
     </w:p>
     <w:p>
@@ -2859,7 +3039,7 @@
         </w:numPr>
       </w:pPr>
       <w:r>
-        <w:t xml:space="preserve">Goldman MJ, Craft B, Hastie M, Repečka K, McDade F, Kamath A, et al. Visualizing and interpreting cancer genomics data via the Xena platform. Nat Biotechnol. 2020;38(6):675–678.</w:t>
+        <w:t xml:space="preserve">Li T, Fu J, Zeng Z, Cohen D, Li J, Chen Q, et al. TIMER2.0 for analysis of tumor-infiltrating immune cells. Nucleic Acids Res. 2020;48(W1):W509–W514.</w:t>
       </w:r>
     </w:p>
     <w:p>
@@ -2883,17 +3063,121 @@
         </w:numPr>
       </w:pPr>
       <w:r>
-        <w:t xml:space="preserve">Davidson-Pilon C. lifelines: survival analysis in Python. J Open Source Softw. 2019;4(40):1317.</w:t>
-      </w:r>
-    </w:p>
-    <w:bookmarkEnd w:id="41"/>
-    <w:bookmarkStart w:id="42" w:name="figure-legends"/>
-    <w:p>
-      <w:pPr>
-        <w:pStyle w:val="Heading2"/>
-      </w:pPr>
-      <w:r>
-        <w:t xml:space="preserve">Figure legends</w:t>
+        <w:t xml:space="preserve">Hedges LV. Distribution theory for Glass’s estimator of effect size and related estimators. J Educ Stat. 1981;6(2):107–128.</w:t>
+      </w:r>
+    </w:p>
+    <w:p>
+      <w:pPr>
+        <w:pStyle w:val="Compact"/>
+        <w:numPr>
+          <w:ilvl w:val="0"/>
+          <w:numId w:val="1001"/>
+        </w:numPr>
+      </w:pPr>
+      <w:r>
+        <w:t xml:space="preserve">Jonckheere AR. A distribution-free k-sample test against ordered alternatives. Biometrika. 1954;41(1–2):133–145.</w:t>
+      </w:r>
+    </w:p>
+    <w:p>
+      <w:pPr>
+        <w:pStyle w:val="Compact"/>
+        <w:numPr>
+          <w:ilvl w:val="0"/>
+          <w:numId w:val="1001"/>
+        </w:numPr>
+      </w:pPr>
+      <w:r>
+        <w:t xml:space="preserve">Terpstra TJ. The asymptotic normality and consistency of Kendall’s test against trend, when ties are present in one ranking. Indag Math. 1952;14:327–333.</w:t>
+      </w:r>
+    </w:p>
+    <w:p>
+      <w:pPr>
+        <w:pStyle w:val="Compact"/>
+        <w:numPr>
+          <w:ilvl w:val="0"/>
+          <w:numId w:val="1001"/>
+        </w:numPr>
+      </w:pPr>
+      <w:r>
+        <w:t xml:space="preserve">Grambsch PM, Therneau TM. Proportional hazards tests and diagnostics based on weighted residuals. Biometrika. 1994;81(3):515–526.</w:t>
+      </w:r>
+    </w:p>
+    <w:p>
+      <w:pPr>
+        <w:pStyle w:val="Compact"/>
+        <w:numPr>
+          <w:ilvl w:val="0"/>
+          <w:numId w:val="1001"/>
+        </w:numPr>
+      </w:pPr>
+      <w:r>
+        <w:t xml:space="preserve">Bonett DG, Wright TA. Sample size requirements for estimating Pearson, Kendall and Spearman correlations. Psychometrika. 2000;65(1):23–28.</w:t>
+      </w:r>
+    </w:p>
+    <w:p>
+      <w:pPr>
+        <w:pStyle w:val="Compact"/>
+        <w:numPr>
+          <w:ilvl w:val="0"/>
+          <w:numId w:val="1001"/>
+        </w:numPr>
+      </w:pPr>
+      <w:r>
+        <w:t xml:space="preserve">Subramanian A, Tamayo P, Mootha VK, Mukherjee S, Ebert BL, Gillette MA, et al. Gene set enrichment analysis: a knowledge-based approach for interpreting genome-wide expression profiles. Proc Natl Acad Sci U S A. 2005;102(43):15545–15550.</w:t>
+      </w:r>
+    </w:p>
+    <w:p>
+      <w:pPr>
+        <w:pStyle w:val="Compact"/>
+        <w:numPr>
+          <w:ilvl w:val="0"/>
+          <w:numId w:val="1001"/>
+        </w:numPr>
+      </w:pPr>
+      <w:r>
+        <w:t xml:space="preserve">Liberzon A, Birger C, Thorvaldsdóttir H, Ghandi M, Mesirov JP, Tamayo P. The Molecular Signatures Database (MSigDB) hallmark gene set collection. Cell Syst. 2015;1(6):417–425.</w:t>
+      </w:r>
+    </w:p>
+    <w:p>
+      <w:pPr>
+        <w:pStyle w:val="Compact"/>
+        <w:numPr>
+          <w:ilvl w:val="0"/>
+          <w:numId w:val="1001"/>
+        </w:numPr>
+      </w:pPr>
+      <w:r>
+        <w:t xml:space="preserve">Gillespie M, Jassal B, Stephan R, Milacic M, Rothfels K, Senff-Ribeiro A, et al. The Reactome pathway knowledgebase 2022. Nucleic Acids Res. 2022;50(D1):D687–D692.</w:t>
+      </w:r>
+    </w:p>
+    <w:p>
+      <w:pPr>
+        <w:pStyle w:val="Compact"/>
+        <w:numPr>
+          <w:ilvl w:val="0"/>
+          <w:numId w:val="1001"/>
+        </w:numPr>
+      </w:pPr>
+      <w:r>
+        <w:t xml:space="preserve">Koumprentziotis IA, Theocharopoulos C, Foteinou D, Angeli E, Anastasopoulou A, Gogas H, et al. New emerging targets in cancer immunotherapy: the role of B7-H3. Vaccines (Basel). 2024;12(1):54.</w:t>
+      </w:r>
+    </w:p>
+    <w:p>
+      <w:pPr>
+        <w:pStyle w:val="Compact"/>
+        <w:numPr>
+          <w:ilvl w:val="0"/>
+          <w:numId w:val="1001"/>
+        </w:numPr>
+      </w:pPr>
+      <w:r>
+        <w:t xml:space="preserve">Allard B, Allard D, Buisseret L, Stagg J. The adenosine pathway in immuno-oncology. Nat Rev Clin Oncol. 2020;17(10):611–629.</w:t>
+      </w:r>
+      <w:r>
+        <w:t xml:space="preserve"> </w:t>
+      </w:r>
+      <w:r>
+        <w:t xml:space="preserve">## Figure legends</w:t>
       </w:r>
     </w:p>
     <w:p>
@@ -2929,7 +3213,7 @@
         <w:t xml:space="preserve"> </w:t>
       </w:r>
       <w:r>
-        <w:t xml:space="preserve">(a) Forest plot of hazard ratios per standard deviation of NCL from multivariable Cox models adjusted for age, sex, stage and grade, for overall survival; covariates included and numbers of patients and events are annotated. (b) The corresponding disease-specific and progression-free survival results. (c) Comparison of univariate and covariate-adjusted hazard ratios, illustrating attenuation after adjustment. (d) Kaplan–Meier curves for the two cancers retaining significance after adjustment (KIRP, ACC), stratified at the cohort median. Models in which the proportional-hazards assumption was violated for the NCL term are marked.</w:t>
+        <w:t xml:space="preserve">(a) Hazard ratios per standard deviation of NCL for overall survival, from multivariable Cox models adjusted for age, sex, stage and grade, with 95% confidence intervals; each row is annotated with the number of patients and events entering that model. Red indicates an adverse association significant at q&lt;0.05, blue a protective one, grey not significant. A dagger marks models in which the proportional-hazards assumption was violated for the NCL term (Schoenfeld residuals, p&lt;0.05); those hazard ratios summarise a time-varying effect and should not be read as constant risk multipliers. (b) Univariate against covariate-adjusted hazard ratio for every cancer and endpoint; points below the diagonal are cancers whose apparent prognostic signal is attenuated by adjustment. (c) Number of cancers reaching q&lt;0.05 before and after adjustment, by endpoint. Full per-model results, including the covariates available in each cohort, are in Table 3.</w:t>
       </w:r>
     </w:p>
     <w:p>
@@ -2947,25 +3231,39 @@
         <w:t xml:space="preserve"> </w:t>
       </w:r>
       <w:r>
-        <w:t xml:space="preserve">(a) Purity-adjusted partial Spearman correlations between NCL expression and immune cell infiltration across cancers, shown for each of seven deconvolution algorithms; only associations with q&lt;0.05 are coloured. (b) Concordance across algorithms for ten canonical cell types: the number of algorithms yielding significant associations and whether they agree in direction. Combinations in which algorithms disagree in sign are highlighted. (c) Correlations between NCL and xCell immune, stromal and microenvironment scores across cancers.</w:t>
-      </w:r>
-    </w:p>
-    <w:p>
-      <w:pPr>
-        <w:pStyle w:val="BodyText"/>
-      </w:pPr>
+        <w:t xml:space="preserve">(a) For each of ten canonical cell types, the number of cancers in which the algorithms</w:t>
+      </w:r>
+      <w:r>
+        <w:t xml:space="preserve"> </w:t>
+      </w:r>
+      <w:r>
+        <w:rPr>
+          <w:i/>
+          <w:iCs/>
+        </w:rPr>
+        <w:t xml:space="preserve">concordantly</w:t>
+      </w:r>
+      <w:r>
+        <w:t xml:space="preserve"> </w:t>
+      </w:r>
+      <w:r>
+        <w:t xml:space="preserve">detect an association with NCL (≥2 algorithms significant at q&lt;0.05 after purity adjustment, none disagreeing in sign), the number in which algorithms return significant associations of</w:t>
+      </w:r>
+      <w:r>
+        <w:t xml:space="preserve"> </w:t>
+      </w:r>
       <w:r>
         <w:rPr>
           <w:b/>
           <w:bCs/>
         </w:rPr>
-        <w:t xml:space="preserve">Figure 4. Immune checkpoint associations.</w:t>
-      </w:r>
-      <w:r>
-        <w:t xml:space="preserve"> </w:t>
-      </w:r>
-      <w:r>
-        <w:t xml:space="preserve">(a) Spearman correlations between NCL and 16 immune checkpoint and immunomodulatory genes across 33 cancers, before adjustment, after purity adjustment, and after proliferation adjustment. (b) Number of cancers in which each molecule shows a robust association, defined as significant after both adjustments, separated by direction. (c) Per-cancer detail for CD276 (B7-H3), NT5E (CD73) and ENTPD1 (CD39), with 95% confidence intervals.</w:t>
+        <w:t xml:space="preserve">opposite sign</w:t>
+      </w:r>
+      <w:r>
+        <w:t xml:space="preserve"> </w:t>
+      </w:r>
+      <w:r>
+        <w:t xml:space="preserve">for the same cell type in the same cancer, and the number with no or insufficient signal. Totals differ between cell types because not every algorithm resolves every cell type. (b) Correlation between NCL and the xCell immune, stromal and microenvironment scores in each cancer; cancers are ordered by microenvironment score. Points to the left of zero indicate that NCL-high tumours are immune- or stroma-poor. (c) Distribution of purity-adjusted partial Spearman correlations between NCL and infiltration estimates, separately for each of the seven deconvolution algorithms, pooled over all cancers and cell types; the spread illustrates how much the estimate depends on the algorithm chosen.</w:t>
       </w:r>
     </w:p>
     <w:p>
@@ -2977,52 +3275,102 @@
           <w:b/>
           <w:bCs/>
         </w:rPr>
-        <w:t xml:space="preserve">Figure 5. Independent proteomic validation in CPTAC.</w:t>
-      </w:r>
-      <w:r>
-        <w:t xml:space="preserve"> </w:t>
-      </w:r>
-      <w:r>
-        <w:t xml:space="preserve">Cliff’s delta with 95% bootstrap confidence intervals for NCL protein abundance in tumour versus adjacent normal tissue across nine CPTAC cohorts, with numbers of tumours, normals and matched pairs annotated. Cohorts discordant with the transcript-level result (PDAC, UCEC) are indicated.</w:t>
-      </w:r>
-    </w:p>
-    <w:p>
-      <w:pPr>
-        <w:pStyle w:val="BodyText"/>
-      </w:pPr>
+        <w:t xml:space="preserve">Figure 4. Immune checkpoint associations.</w:t>
+      </w:r>
+      <w:r>
+        <w:t xml:space="preserve"> </w:t>
+      </w:r>
+      <w:r>
+        <w:t xml:space="preserve">(a) Number of the 33 cancers in which each molecule shows a</w:t>
+      </w:r>
+      <w:r>
+        <w:t xml:space="preserve"> </w:t>
+      </w:r>
+      <w:r>
+        <w:rPr>
+          <w:i/>
+          <w:iCs/>
+        </w:rPr>
+        <w:t xml:space="preserve">robust</w:t>
+      </w:r>
+      <w:r>
+        <w:t xml:space="preserve"> </w:t>
+      </w:r>
+      <w:r>
+        <w:t xml:space="preserve">association with NCL, defined as significant at q&lt;0.05 after</w:t>
+      </w:r>
+      <w:r>
+        <w:t xml:space="preserve"> </w:t>
+      </w:r>
       <w:r>
         <w:rPr>
           <w:b/>
           <w:bCs/>
         </w:rPr>
-        <w:t xml:space="preserve">Figure 6. Pathway associations.</w:t>
-      </w:r>
-      <w:r>
-        <w:t xml:space="preserve"> </w:t>
-      </w:r>
-      <w:r>
-        <w:t xml:space="preserve">Normalised enrichment scores from pre-ranked GSEA of genes ranked by within-cancer correlation with NCL, for Hallmark and Reactome gene sets showing consistent direction across cancers. Only gene sets significant at q&lt;0.05 in at least three cancers are shown.</w:t>
-      </w:r>
-    </w:p>
-    <w:bookmarkEnd w:id="42"/>
-    <w:bookmarkStart w:id="43" w:name="tables"/>
-    <w:p>
-      <w:pPr>
-        <w:pStyle w:val="Heading2"/>
-      </w:pPr>
-      <w:r>
-        <w:t xml:space="preserve">Tables</w:t>
-      </w:r>
-    </w:p>
-    <w:p>
-      <w:pPr>
-        <w:pStyle w:val="FirstParagraph"/>
+        <w:t xml:space="preserve">both</w:t>
+      </w:r>
+      <w:r>
+        <w:t xml:space="preserve"> </w:t>
+      </w:r>
+      <w:r>
+        <w:t xml:space="preserve">tumour-purity and proliferation adjustment; bars extend right for positive and left for negative associations, so a molecule with bars on both sides is inconsistent in direction between cancers. Cancers not counted are those not reaching significance. (b) Per-cancer detail for CD276 (B7-H3), showing the same correlation unadjusted, purity-adjusted and proliferation-adjusted, with cohort size for each cancer; the ordering makes visible that adjustment attenuates but does not abolish the association. Cancers in which B7-H3 was not robust are named in Section 3.6.</w:t>
+      </w:r>
+    </w:p>
+    <w:p>
+      <w:pPr>
+        <w:pStyle w:val="BodyText"/>
       </w:pPr>
       <w:r>
         <w:rPr>
           <w:b/>
           <w:bCs/>
         </w:rPr>
+        <w:t xml:space="preserve">Figure 5. Independent proteomic validation in CPTAC.</w:t>
+      </w:r>
+      <w:r>
+        <w:t xml:space="preserve"> </w:t>
+      </w:r>
+      <w:r>
+        <w:t xml:space="preserve">Cliff’s delta with 95% bootstrap confidence intervals for NCL protein abundance in tumour versus adjacent normal tissue across nine CPTAC cohorts, with numbers of tumours, normals and matched pairs annotated. Cohorts discordant with the transcript-level result (PDAC, UCEC) are indicated.</w:t>
+      </w:r>
+    </w:p>
+    <w:p>
+      <w:pPr>
+        <w:pStyle w:val="BodyText"/>
+      </w:pPr>
+      <w:r>
+        <w:rPr>
+          <w:b/>
+          <w:bCs/>
+        </w:rPr>
+        <w:t xml:space="preserve">Figure 6. Pathway associations.</w:t>
+      </w:r>
+      <w:r>
+        <w:t xml:space="preserve"> </w:t>
+      </w:r>
+      <w:r>
+        <w:t xml:space="preserve">Normalised enrichment scores from pre-ranked GSEA of genes ranked by within-cancer correlation with NCL, for Hallmark and Reactome gene sets showing consistent direction across cancers. Only gene sets significant at q&lt;0.05 in at least three cancers are shown. The fraction beside each pathway (e.g. 32/32, 26/32) is the number of the 32 analysable cancers in which that gene set reached q&lt;0.05, out of the total tested; bar length is the median NES across the cancers in which it was significant. Cancers not counted are those in which the set did not reach significance, not those with opposite-direction enrichment — no gene set shown here was significantly enriched in opposing directions in different cancers. Section 3.9 names the exceptions for the near-complete sets, and the full per-cancer results are in Supplementary Table S7.</w:t>
+      </w:r>
+    </w:p>
+    <w:bookmarkEnd w:id="41"/>
+    <w:bookmarkStart w:id="42" w:name="tables"/>
+    <w:p>
+      <w:pPr>
+        <w:pStyle w:val="Heading2"/>
+      </w:pPr>
+      <w:r>
+        <w:t xml:space="preserve">Tables</w:t>
+      </w:r>
+    </w:p>
+    <w:p>
+      <w:pPr>
+        <w:pStyle w:val="FirstParagraph"/>
+      </w:pPr>
+      <w:r>
+        <w:rPr>
+          <w:b/>
+          <w:bCs/>
+        </w:rPr>
         <w:t xml:space="preserve">Table 1.</w:t>
       </w:r>
       <w:r>
@@ -3171,8 +3519,8 @@
         <w:t xml:space="preserve">Complete per-test result tables for differential expression, stage association, survival, immune infiltration across all algorithms, checkpoint associations, and GSEA.</w:t>
       </w:r>
     </w:p>
+    <w:bookmarkEnd w:id="42"/>
     <w:bookmarkEnd w:id="43"/>
-    <w:bookmarkEnd w:id="44"/>
     <w:sectPr>
       <w:footnotePr>
         <w:numRestart w:val="eachSect"/>

</xml_diff>

<commit_message>
Report per-test confidence intervals in the Results text
Per-test intervals previously appeared only in the supplementary tables.
They are now given where each claim is made, raising interval reporting
from 9 to 60 instances against 24 p/q values.

Includes B7-H3 per-cancer correlations with 95% CI and n, immune and
stromal score correlations, cell-type associations with the range of
significant estimates stated separately from the median across all
algorithms, stage IV versus I effect sizes, CD73 and CD39 ranges, and TMB,
MSI and aneuploidy ranges.

Every inserted value verified against its source table (60 checks).

Co-Authored-By: Claude Opus 5 <noreply@anthropic.com>
</commit_message>
<xml_diff>
--- a/manuscript/manuscript_revised.docx
+++ b/manuscript/manuscript_revised.docx
@@ -1678,7 +1678,7 @@
         <w:pStyle w:val="FirstParagraph"/>
       </w:pPr>
       <w:r>
-        <w:t xml:space="preserve">Across 17 cancers with sufficient staging data, a significant monotonic trend across stages I–IV was present in only three, and in one of these the direction was negative: LIHC (Jonckheere–Terpstra z=+3.47, q=0.005), LUAD (z=+3.45, q=0.005) and, decreasing, KIRC (z=−2.95, q=0.018) (Figure 1c; Table 2). Fourteen cancers showed no stage-ordered trend.</w:t>
+        <w:t xml:space="preserve">Across 17 cancers with sufficient staging data, a significant monotonic trend across stages I–IV was present in only three, and in one of these the direction was negative: LIHC (Jonckheere–Terpstra z=+3.47, q=0.005, n=343), LUAD (z=+3.45, q=0.005, n=506) and, decreasing, KIRC (z=−2.95, q=0.018, n=507) (Figure 1c; Table 2). Fourteen cancers showed no stage-ordered trend. The corresponding stage IV versus stage I effect sizes are modest even where the trend is significant: LUAD Cliff’s delta +0.26 (95% CI +0.05 to +0.45) and KIRC −0.13 (−0.28 to +0.00).</w:t>
       </w:r>
     </w:p>
     <w:p>
@@ -1754,23 +1754,23 @@
         <w:pStyle w:val="FirstParagraph"/>
       </w:pPr>
       <w:r>
-        <w:t xml:space="preserve">Across 3,910 cancer × cell type × algorithm tests, 1,229 purity-adjusted associations were significant at q&lt;0.05. The dominant pattern was negative. NCL correlated inversely with the xCell microenvironment score in all 20 cancers where the association was significant, with the immune score in 18 of 20 (positive only in PRAD and UVM), and with the stromal score in 14 of 15 (positive only in KIRC) (Figure 3a; Table 4). The strongest inverse immune-score associations were in GBM (rho −0.38, 95% CI −0.52 to −0.22), SKCM (−0.36, −0.53 to −0.17), LUSC (−0.35, −0.43 to −0.27) and ESCA (−0.34, −0.47 to −0.19). Only PRAD and UVM showed positive associations.</w:t>
-      </w:r>
-    </w:p>
-    <w:p>
-      <w:pPr>
-        <w:pStyle w:val="BodyText"/>
-      </w:pPr>
-      <w:r>
-        <w:t xml:space="preserve">Cell-type-level results were consistent with this: among the strongest concordant associations were reduced CD8⁺ T cells in SKCM (median rho −0.32 across 5 of 7 algorithms) and ACC (−0.31, 4 of 7), reduced macrophages in GBM (−0.46), KIRP (−0.39), LUSC (−0.33) and OV (−0.32), and reduced cancer-associated fibroblasts in PRAD (−0.46). NCL-high tumours are thus, in general, immune- and stroma-poor — a phenotype consistent with a proliferative, tumour-cell-rich compartment.</w:t>
-      </w:r>
-    </w:p>
-    <w:p>
-      <w:pPr>
-        <w:pStyle w:val="BodyText"/>
-      </w:pPr>
-      <w:r>
-        <w:t xml:space="preserve">The strongest positive cell-type association we observe illustrates why both purity adjustment and multi-algorithm reporting matter. NCL correlates with neutrophil infiltration in thyroid carcinoma at rho=0.54 when estimated by MCP-counter alone without purity adjustment; across all six algorithms that resolve neutrophils, and after purity adjustment, the median estimate is +0.30. The association is real and directionally consistent, but its magnitude depends heavily on these choices.</w:t>
+        <w:t xml:space="preserve">Across 3,910 cancer × cell type × algorithm tests, 1,229 purity-adjusted associations were significant at q&lt;0.05. The dominant pattern was negative. NCL correlated inversely with the xCell microenvironment score in all 20 cancers where the association was significant, with the immune score in 18 of 20 (positive only in PRAD and UVM), and with the stromal score in 14 of 15 (positive only in KIRC) (Figure 3a; Table 4). The strongest inverse immune-score associations were in GBM (rho −0.38, 95% CI −0.52 to −0.22, n=151), SKCM (−0.36, −0.53 to −0.17, n=102), LUSC (−0.35, −0.43 to −0.27, n=498) and ESCA (−0.34, −0.47 to −0.19, n=181). The microenvironment score showed the same pattern (SKCM −0.41, −0.57 to −0.23; ACC −0.40, −0.58 to −0.18; SARC −0.37, −0.48 to −0.25), as did the stromal score (UVM −0.48, −0.64 to −0.28; PRAD −0.36, −0.44 to −0.28; LIHC −0.34, −0.43 to −0.24). Only PRAD and UVM showed positive immune-score associations.</w:t>
+      </w:r>
+    </w:p>
+    <w:p>
+      <w:pPr>
+        <w:pStyle w:val="BodyText"/>
+      </w:pPr>
+      <w:r>
+        <w:t xml:space="preserve">Cell-type-level results were consistent with this. Values below are the median purity-adjusted correlation across every algorithm that resolves the cell type, with the range of the estimates that reached significance in parentheses. Among the strongest concordant associations were reduced CD8⁺ T cells in SKCM (median rho −0.32; significant estimates −0.43 to −0.25 across 5 of 7 algorithms, n=102) and ACC (−0.31; −0.34 to −0.31, 4 of 7, n=77); reduced macrophages in GBM (−0.46; −0.46 to −0.46, n=151), KIRP (−0.39; −0.44 to −0.39, n=288), LUSC (−0.33; −0.36 to −0.33, n=498) and OV (−0.32; −0.39 to −0.31, n=300); and reduced cancer-associated fibroblasts in PRAD (−0.46; −0.55 to −0.46, n=495). NCL-high tumours are thus, in general, immune- and stroma-poor — a phenotype consistent with a proliferative, tumour-cell-rich compartment.</w:t>
+      </w:r>
+    </w:p>
+    <w:p>
+      <w:pPr>
+        <w:pStyle w:val="BodyText"/>
+      </w:pPr>
+      <w:r>
+        <w:t xml:space="preserve">The strongest positive cell-type association we observe illustrates why both purity adjustment and multi-algorithm reporting matter. NCL correlates with neutrophil infiltration in thyroid carcinoma at rho=0.54 when estimated by MCP-counter alone without purity adjustment. Across all six algorithms that resolve neutrophils, and after purity adjustment, the median estimate falls to +0.30; restricting to the four algorithms reaching significance gives a median of +0.39 with estimates spanning +0.25 to +0.54 (n=500). The association is real and directionally consistent, but its magnitude varies roughly two-fold with these choices.</w:t>
       </w:r>
     </w:p>
     <w:bookmarkEnd w:id="26"/>
@@ -1846,7 +1846,7 @@
         <w:t xml:space="preserve"> </w:t>
       </w:r>
       <w:r>
-        <w:t xml:space="preserve">(B7-H3): positive and significant in 21 of 33 cancers, with no cancer showing a significant negative association (median rho +0.34; ACC +0.58, PRAD +0.50, GBM +0.47, THCA +0.47, KIRC +0.46). The twelve cancers in which the association was not robust were CHOL, DLBC, ESCA, KICH, LAML, MESO, PAAD, SARC, SKCM, TGCT, UCS and UVM — a group weighted towards the smallest cohorts and the non-carcinoma histologies. Associations with the two principal components of the adenosine axis followed the same pattern:</w:t>
+        <w:t xml:space="preserve">(B7-H3): positive and significant in 21 of 33 cancers, with no cancer showing a significant negative association (median rho +0.34). The strongest were ACC (rho +0.58, 95% CI +0.39 to +0.72, n=77), LIHC (+0.52, +0.43 to +0.59, n=369), PRAD (+0.50, +0.43 to +0.57, n=495), READ (+0.48, +0.29 to +0.63, n=92), GBM (+0.47, +0.33 to +0.60, n=151), THCA (+0.47, +0.40 to +0.54, n=500) and KIRC (+0.46, +0.38 to +0.53, n=530). After adjustment for both purity and proliferation the association is attenuated but retained, with partial correlations across the 21 robust cancers spanning +0.17 to +0.53. The twelve cancers in which the association was not robust were CHOL, DLBC, ESCA, KICH, LAML, MESO, PAAD, SARC, SKCM, TGCT, UCS and UVM — a group weighted towards the smallest cohorts and the non-carcinoma histologies. Associations with the two principal components of the adenosine axis followed the same pattern:</w:t>
       </w:r>
       <w:r>
         <w:t xml:space="preserve"> </w:t>
@@ -1862,7 +1862,7 @@
         <w:t xml:space="preserve"> </w:t>
       </w:r>
       <w:r>
-        <w:t xml:space="preserve">(CD73) robust in 17 of 33 cancers (16 positive) and</w:t>
+        <w:t xml:space="preserve">(CD73) robust in 17 of 33 cancers, 16 of them positive (proliferation-adjusted rho up to +0.55; the single negative was COAD), and</w:t>
       </w:r>
       <w:r>
         <w:t xml:space="preserve"> </w:t>
@@ -1878,15 +1878,15 @@
         <w:t xml:space="preserve"> </w:t>
       </w:r>
       <w:r>
-        <w:t xml:space="preserve">(CD39) in 17 of 33 (16 positive).</w:t>
-      </w:r>
-    </w:p>
-    <w:p>
-      <w:pPr>
-        <w:pStyle w:val="BodyText"/>
-      </w:pPr>
-      <w:r>
-        <w:t xml:space="preserve">By contrast, the T-cell checkpoint receptors were weakly and inconsistently associated, and where associations did reach significance they were as often negative as positive. PD-1 was robust in 3 of 33 cancers (positive in BLCA; negative in SKCM and THCA) and CTLA-4 in 4 of 33 (positive in BLCA; negative in LUSC, OV and THCA; median rho +0.02). TIGIT was robust in 5, LAG-3 in 6 — negative in all six (KIRC, OV, PRAD, SARC, THCA, UCS) — and TIM-3 in 9 of 33 (median rho +0.05). PD-L1 was robust in 7 of 33, all positive (BLCA, BRCA, KICH, KIRC, LIHC, PAAD, PCPG; median rho +0.17), and TGF-β1 in 6 of 33.</w:t>
+        <w:t xml:space="preserve">(CD39) in 17 of 33, again 16 positive (up to +0.56; the single negative was LAML).</w:t>
+      </w:r>
+    </w:p>
+    <w:p>
+      <w:pPr>
+        <w:pStyle w:val="BodyText"/>
+      </w:pPr>
+      <w:r>
+        <w:t xml:space="preserve">By contrast, the T-cell checkpoint receptors were weakly and inconsistently associated, and where associations did reach significance they were as often negative as positive. PD-1 was robust in 3 of 33 cancers (positive in BLCA; negative in SKCM and THCA) and CTLA-4 in 4 of 33 (positive in BLCA; negative in LUSC, OV and THCA; median rho +0.02). TIGIT was robust in 5 (proliferation-adjusted rho −0.21 to +0.21), LAG-3 in 6 — negative in all six (KIRC, OV, PRAD, SARC, THCA, UCS; −0.55 to −0.17) — and TIM-3 in 9 of 33 (median rho +0.05; −0.25 to +0.35). For CTLA-4 and PD-1 the robust estimates spanned −0.25 to +0.15 and −0.27 to +0.12 respectively, so even where significant they are small and of inconsistent sign. PD-L1 was robust in 7 of 33, all positive (BLCA, BRCA, KICH, KIRC, LIHC, PAAD, PCPG; median rho +0.17), and TGF-β1 in 6 of 33.</w:t>
       </w:r>
     </w:p>
     <w:p>
@@ -1920,7 +1920,7 @@
         <w:pStyle w:val="FirstParagraph"/>
       </w:pPr>
       <w:r>
-        <w:t xml:space="preserve">NCL showed little relationship with genomic instability measures. Tumour mutational burden was significantly associated in 7 of 33 cancers (ACC, BRCA, LGG, LUAD, PRAD, STAD, THCA; median rho +0.06), MANTIS MSI score in 10 of 32 (BRCA, CESC, DLBC, KIRC, LGG, LUSC, OV, PRAD, STAD, THCA; median rho +0.04, with equal numbers of positive and negative associations), and aneuploidy score in 7 of 33 (median rho +0.04). Fraction of genome altered was slightly more often associated (11 of 33, median rho +0.12). NCL therefore does not track the mutational processes that predict immune-checkpoint blockade response, which further distinguishes its immune association from a conventional immunogenicity signal.</w:t>
+        <w:t xml:space="preserve">NCL showed little relationship with genomic instability measures. Tumour mutational burden was significantly associated in 7 of 33 cancers (ACC, BRCA, LGG, LUAD, PRAD, STAD, THCA; median rho +0.06 overall, significant estimates −0.12 to +0.34), MANTIS MSI score in 10 of 32 (BRCA, CESC, DLBC, KIRC, LGG, LUSC, OV, PRAD, STAD, THCA; median rho +0.04, significant estimates −0.45 to +0.30, with equal numbers positive and negative), and aneuploidy score in 7 of 33 (median rho +0.04, −0.18 to +0.24). Fraction of genome altered was slightly more often associated (11 of 33, median rho +0.12). NCL therefore does not track the mutational processes that predict immune-checkpoint blockade response, which further distinguishes its immune association from a conventional immunogenicity signal.</w:t>
       </w:r>
     </w:p>
     <w:bookmarkEnd w:id="29"/>

</xml_diff>

<commit_message>
Supplementary numbering, figure legends, and Supplementary Table S1
- Replaced the S2-S7 catch-all with an explicit S1-S11 list, each naming
  the file that supports it, and corrected an internal cross-reference.
- Supplementary Table S1 is now generated by 12_supplementary_tables.py
  (33 cohorts with full names, sample counts, GTEx mapping and match
  quality) alongside an S-number to filename index.
- Figure 3a: every bar totals 33 cancers; what varies is the algorithm
  count, which is 2 to 7. Legend corrected.
- Figure 6: the plot shows the 16 most frequent direction-consistent gene
  sets. Legend corrected to describe what is actually plotted.

All six raw-input checksums independently recomputed. Every number
rendered in Figures 1, 3, 4, 5 and 6 recomputed from the source tables
(28 checks).

Co-Authored-By: Claude Opus 5 <noreply@anthropic.com>
</commit_message>
<xml_diff>
--- a/manuscript/manuscript_revised.docx
+++ b/manuscript/manuscript_revised.docx
@@ -954,7 +954,7 @@
         <w:t xml:space="preserve"> </w:t>
       </w:r>
       <w:r>
-        <w:t xml:space="preserve">Models in which the NCL term violated the assumption (p&lt;0.05) are identified explicitly in Results and in Supplementary Table S3, because a hazard ratio from such a model summarises a time-varying effect and should not be read as a single constant risk multiplier.</w:t>
+        <w:t xml:space="preserve">Models in which the NCL term violated the assumption (p&lt;0.05) are identified explicitly in Results and in Supplementary Table S4, because a hazard ratio from such a model summarises a time-varying effect and should not be read as a single constant risk multiplier.</w:t>
       </w:r>
     </w:p>
     <w:bookmarkEnd w:id="15"/>
@@ -1830,7 +1830,7 @@
         <w:pStyle w:val="FirstParagraph"/>
       </w:pPr>
       <w:r>
-        <w:t xml:space="preserve">Testing 495 cancer × gene associations produced a clearly structured result (Figure 4; Table 5). After adjustment for both tumour purity and proliferation, the most consistent association by a wide margin was with</w:t>
+        <w:t xml:space="preserve">Testing 495 cancer × gene associations produced a clearly structured result (Figure 4; Table 5; Supplementary Table S7). After adjustment for both tumour purity and proliferation, the most consistent association by a wide margin was with</w:t>
       </w:r>
       <w:r>
         <w:t xml:space="preserve"> </w:t>
@@ -1988,7 +1988,7 @@
         <w:pStyle w:val="FirstParagraph"/>
       </w:pPr>
       <w:r>
-        <w:t xml:space="preserve">Pre-ranked GSEA of genes ranked by their within-cancer correlation with NCL produced 32,491 tests across 32 cancers, of which 9,349 were significant at q&lt;0.05 (Figure 6; Supplementary Table S7). The result was strikingly uniform.</w:t>
+        <w:t xml:space="preserve">Pre-ranked GSEA of genes ranked by their within-cancer correlation with NCL produced 32,491 tests across 32 cancers, of which 9,349 were significant at q&lt;0.05 (Figure 6; Supplementary Table S10). The result was strikingly uniform.</w:t>
       </w:r>
     </w:p>
     <w:p>
@@ -3263,7 +3263,7 @@
         <w:t xml:space="preserve"> </w:t>
       </w:r>
       <w:r>
-        <w:t xml:space="preserve">for the same cell type in the same cancer, and the number with no or insufficient signal. Totals differ between cell types because not every algorithm resolves every cell type. (b) Correlation between NCL and the xCell immune, stromal and microenvironment scores in each cancer; cancers are ordered by microenvironment score. Points to the left of zero indicate that NCL-high tumours are immune- or stroma-poor. (c) Distribution of purity-adjusted partial Spearman correlations between NCL and infiltration estimates, separately for each of the seven deconvolution algorithms, pooled over all cancers and cell types; the spread illustrates how much the estimate depends on the algorithm chosen.</w:t>
+        <w:t xml:space="preserve">for the same cell type in the same cancer, and the number with no or insufficient signal. Each bar totals the 33 cancers analysed. What differs between cell types is the number of algorithms available to resolve them, ranging from two to seven — lowest for cancer-associated fibroblast, endothelial cell and macrophage (at most three) and highest for CD8⁺ T cell (up to seven). The algorithm count for every cancer and cell type is given in Supplementary Table S6. (b) Correlation between NCL and the xCell immune, stromal and microenvironment scores in each cancer; cancers are ordered by microenvironment score. Points to the left of zero indicate that NCL-high tumours are immune- or stroma-poor. (c) Distribution of purity-adjusted partial Spearman correlations between NCL and infiltration estimates, separately for each of the seven deconvolution algorithms, pooled over all cancers and cell types; the spread illustrates how much the estimate depends on the algorithm chosen.</w:t>
       </w:r>
     </w:p>
     <w:p>
@@ -3349,7 +3349,7 @@
         <w:t xml:space="preserve"> </w:t>
       </w:r>
       <w:r>
-        <w:t xml:space="preserve">Normalised enrichment scores from pre-ranked GSEA of genes ranked by within-cancer correlation with NCL, for Hallmark and Reactome gene sets showing consistent direction across cancers. Only gene sets significant at q&lt;0.05 in at least three cancers are shown. The fraction beside each pathway (e.g. 32/32, 26/32) is the number of the 32 analysable cancers in which that gene set reached q&lt;0.05, out of the total tested; bar length is the median NES across the cancers in which it was significant. Cancers not counted are those in which the set did not reach significance, not those with opposite-direction enrichment — no gene set shown here was significantly enriched in opposing directions in different cancers. Section 3.9 names the exceptions for the near-complete sets, and the full per-cancer results are in Supplementary Table S7.</w:t>
+        <w:t xml:space="preserve">Normalised enrichment scores from pre-ranked GSEA of genes ranked by within-cancer correlation with NCL, for Hallmark and Reactome gene sets showing consistent direction across cancers. The sixteen most frequently significant direction-consistent gene sets are shown for each collection. The fraction beside each pathway (e.g. 32/32, 26/32) is the number of the 32 analysable cancers in which that gene set reached q&lt;0.05, out of the total tested; bar length is the median NES across the cancers in which it was significant. Cancers not counted are those in which the set did not reach significance, not those with opposite-direction enrichment — no gene set shown here was significantly enriched in opposing directions in different cancers. Section 3.9 names the exceptions for the near-complete sets, and the full per-cancer results are in Supplementary Table S10.</w:t>
       </w:r>
     </w:p>
     <w:bookmarkEnd w:id="41"/>
@@ -3498,7 +3498,16 @@
         <w:t xml:space="preserve"> </w:t>
       </w:r>
       <w:r>
-        <w:t xml:space="preserve">Corrected list of the 33 TCGA study abbreviations with full names, and the TCGA–GTEx normal tissue mapping with match quality annotations.</w:t>
+        <w:t xml:space="preserve">The 33 TCGA study abbreviations with full names, tumour and normal sample counts, and the TCGA–GTEx normal tissue mapping with match-quality annotation (</w:t>
+      </w:r>
+      <w:r>
+        <w:rPr>
+          <w:rStyle w:val="VerbatimChar"/>
+        </w:rPr>
+        <w:t xml:space="preserve">S1_cohorts_and_tissue_mapping.tsv</w:t>
+      </w:r>
+      <w:r>
+        <w:t xml:space="preserve">).</w:t>
       </w:r>
     </w:p>
     <w:p>
@@ -3510,13 +3519,300 @@
           <w:b/>
           <w:bCs/>
         </w:rPr>
-        <w:t xml:space="preserve">Supplementary Tables S2–S7.</w:t>
-      </w:r>
-      <w:r>
-        <w:t xml:space="preserve"> </w:t>
-      </w:r>
-      <w:r>
-        <w:t xml:space="preserve">Complete per-test result tables for differential expression, stage association, survival, immune infiltration across all algorithms, checkpoint associations, and GSEA.</w:t>
+        <w:t xml:space="preserve">Supplementary Table S2.</w:t>
+      </w:r>
+      <w:r>
+        <w:t xml:space="preserve"> </w:t>
+      </w:r>
+      <w:r>
+        <w:t xml:space="preserve">NCL differential expression per cancer against both normal comparators (</w:t>
+      </w:r>
+      <w:r>
+        <w:rPr>
+          <w:rStyle w:val="VerbatimChar"/>
+        </w:rPr>
+        <w:t xml:space="preserve">T1_differential_expression.tsv</w:t>
+      </w:r>
+      <w:r>
+        <w:t xml:space="preserve">).</w:t>
+      </w:r>
+    </w:p>
+    <w:p>
+      <w:pPr>
+        <w:pStyle w:val="BodyText"/>
+      </w:pPr>
+      <w:r>
+        <w:rPr>
+          <w:b/>
+          <w:bCs/>
+        </w:rPr>
+        <w:t xml:space="preserve">Supplementary Table S3.</w:t>
+      </w:r>
+      <w:r>
+        <w:t xml:space="preserve"> </w:t>
+      </w:r>
+      <w:r>
+        <w:t xml:space="preserve">Association between NCL expression and pathological stage (</w:t>
+      </w:r>
+      <w:r>
+        <w:rPr>
+          <w:rStyle w:val="VerbatimChar"/>
+        </w:rPr>
+        <w:t xml:space="preserve">T2_stage_association.tsv</w:t>
+      </w:r>
+      <w:r>
+        <w:t xml:space="preserve">).</w:t>
+      </w:r>
+    </w:p>
+    <w:p>
+      <w:pPr>
+        <w:pStyle w:val="BodyText"/>
+      </w:pPr>
+      <w:r>
+        <w:rPr>
+          <w:b/>
+          <w:bCs/>
+        </w:rPr>
+        <w:t xml:space="preserve">Supplementary Table S4.</w:t>
+      </w:r>
+      <w:r>
+        <w:t xml:space="preserve"> </w:t>
+      </w:r>
+      <w:r>
+        <w:t xml:space="preserve">Log-rank, univariate and multivariable Cox results with proportional-hazards diagnostics (</w:t>
+      </w:r>
+      <w:r>
+        <w:rPr>
+          <w:rStyle w:val="VerbatimChar"/>
+        </w:rPr>
+        <w:t xml:space="preserve">T3_survival.tsv</w:t>
+      </w:r>
+      <w:r>
+        <w:t xml:space="preserve">).</w:t>
+      </w:r>
+    </w:p>
+    <w:p>
+      <w:pPr>
+        <w:pStyle w:val="BodyText"/>
+      </w:pPr>
+      <w:r>
+        <w:rPr>
+          <w:b/>
+          <w:bCs/>
+        </w:rPr>
+        <w:t xml:space="preserve">Supplementary Table S5.</w:t>
+      </w:r>
+      <w:r>
+        <w:t xml:space="preserve"> </w:t>
+      </w:r>
+      <w:r>
+        <w:t xml:space="preserve">All 3,910 cancer × cell type × algorithm infiltration tests (</w:t>
+      </w:r>
+      <w:r>
+        <w:rPr>
+          <w:rStyle w:val="VerbatimChar"/>
+        </w:rPr>
+        <w:t xml:space="preserve">T4_immune_infiltration.tsv</w:t>
+      </w:r>
+      <w:r>
+        <w:t xml:space="preserve">).</w:t>
+      </w:r>
+    </w:p>
+    <w:p>
+      <w:pPr>
+        <w:pStyle w:val="BodyText"/>
+      </w:pPr>
+      <w:r>
+        <w:rPr>
+          <w:b/>
+          <w:bCs/>
+        </w:rPr>
+        <w:t xml:space="preserve">Supplementary Table S6.</w:t>
+      </w:r>
+      <w:r>
+        <w:t xml:space="preserve"> </w:t>
+      </w:r>
+      <w:r>
+        <w:t xml:space="preserve">Cross-algorithm concordance per cancer and canonical cell type (</w:t>
+      </w:r>
+      <w:r>
+        <w:rPr>
+          <w:rStyle w:val="VerbatimChar"/>
+        </w:rPr>
+        <w:t xml:space="preserve">T5_algorithm_concordance.tsv</w:t>
+      </w:r>
+      <w:r>
+        <w:t xml:space="preserve">).</w:t>
+      </w:r>
+    </w:p>
+    <w:p>
+      <w:pPr>
+        <w:pStyle w:val="BodyText"/>
+      </w:pPr>
+      <w:r>
+        <w:rPr>
+          <w:b/>
+          <w:bCs/>
+        </w:rPr>
+        <w:t xml:space="preserve">Supplementary Table S7.</w:t>
+      </w:r>
+      <w:r>
+        <w:t xml:space="preserve"> </w:t>
+      </w:r>
+      <w:r>
+        <w:t xml:space="preserve">Immune checkpoint correlations, unadjusted and adjusted for tumour purity and for proliferation (</w:t>
+      </w:r>
+      <w:r>
+        <w:rPr>
+          <w:rStyle w:val="VerbatimChar"/>
+        </w:rPr>
+        <w:t xml:space="preserve">T6_checkpoints.tsv</w:t>
+      </w:r>
+      <w:r>
+        <w:t xml:space="preserve">).</w:t>
+      </w:r>
+    </w:p>
+    <w:p>
+      <w:pPr>
+        <w:pStyle w:val="BodyText"/>
+      </w:pPr>
+      <w:r>
+        <w:rPr>
+          <w:b/>
+          <w:bCs/>
+        </w:rPr>
+        <w:t xml:space="preserve">Supplementary Table S8.</w:t>
+      </w:r>
+      <w:r>
+        <w:t xml:space="preserve"> </w:t>
+      </w:r>
+      <w:r>
+        <w:t xml:space="preserve">Immune, stromal and microenvironment scores, TMB, MSI, aneuploidy and fraction of genome altered (</w:t>
+      </w:r>
+      <w:r>
+        <w:rPr>
+          <w:rStyle w:val="VerbatimChar"/>
+        </w:rPr>
+        <w:t xml:space="preserve">T8_genomic_scores.tsv</w:t>
+      </w:r>
+      <w:r>
+        <w:t xml:space="preserve">).</w:t>
+      </w:r>
+    </w:p>
+    <w:p>
+      <w:pPr>
+        <w:pStyle w:val="BodyText"/>
+      </w:pPr>
+      <w:r>
+        <w:rPr>
+          <w:b/>
+          <w:bCs/>
+        </w:rPr>
+        <w:t xml:space="preserve">Supplementary Table S9.</w:t>
+      </w:r>
+      <w:r>
+        <w:t xml:space="preserve"> </w:t>
+      </w:r>
+      <w:r>
+        <w:t xml:space="preserve">CPTAC protein-level validation (</w:t>
+      </w:r>
+      <w:r>
+        <w:rPr>
+          <w:rStyle w:val="VerbatimChar"/>
+        </w:rPr>
+        <w:t xml:space="preserve">T7_cptac_validation.tsv</w:t>
+      </w:r>
+      <w:r>
+        <w:t xml:space="preserve">).</w:t>
+      </w:r>
+    </w:p>
+    <w:p>
+      <w:pPr>
+        <w:pStyle w:val="BodyText"/>
+      </w:pPr>
+      <w:r>
+        <w:rPr>
+          <w:b/>
+          <w:bCs/>
+        </w:rPr>
+        <w:t xml:space="preserve">Supplementary Table S10.</w:t>
+      </w:r>
+      <w:r>
+        <w:t xml:space="preserve"> </w:t>
+      </w:r>
+      <w:r>
+        <w:t xml:space="preserve">Per-cancer GSEA against Hallmark and Reactome (</w:t>
+      </w:r>
+      <w:r>
+        <w:rPr>
+          <w:rStyle w:val="VerbatimChar"/>
+        </w:rPr>
+        <w:t xml:space="preserve">T10_gsea_per_cancer.tsv.gz</w:t>
+      </w:r>
+      <w:r>
+        <w:t xml:space="preserve">).</w:t>
+      </w:r>
+    </w:p>
+    <w:p>
+      <w:pPr>
+        <w:pStyle w:val="BodyText"/>
+      </w:pPr>
+      <w:r>
+        <w:rPr>
+          <w:b/>
+          <w:bCs/>
+        </w:rPr>
+        <w:t xml:space="preserve">Supplementary Table S11.</w:t>
+      </w:r>
+      <w:r>
+        <w:t xml:space="preserve"> </w:t>
+      </w:r>
+      <w:r>
+        <w:t xml:space="preserve">Within-cancer Spearman correlation of NCL against every gene, the GSEA ranking statistic (</w:t>
+      </w:r>
+      <w:r>
+        <w:rPr>
+          <w:rStyle w:val="VerbatimChar"/>
+        </w:rPr>
+        <w:t xml:space="preserve">T9_ncl_gene_correlations.tsv.gz</w:t>
+      </w:r>
+      <w:r>
+        <w:t xml:space="preserve">).</w:t>
+      </w:r>
+    </w:p>
+    <w:p>
+      <w:pPr>
+        <w:pStyle w:val="BodyText"/>
+      </w:pPr>
+      <w:r>
+        <w:t xml:space="preserve">File names in parentheses are the corresponding files in</w:t>
+      </w:r>
+      <w:r>
+        <w:t xml:space="preserve"> </w:t>
+      </w:r>
+      <w:r>
+        <w:rPr>
+          <w:rStyle w:val="VerbatimChar"/>
+        </w:rPr>
+        <w:t xml:space="preserve">results/tables/</w:t>
+      </w:r>
+      <w:r>
+        <w:t xml:space="preserve"> </w:t>
+      </w:r>
+      <w:r>
+        <w:t xml:space="preserve">of the accompanying repository; the same mapping is given in</w:t>
+      </w:r>
+      <w:r>
+        <w:t xml:space="preserve"> </w:t>
+      </w:r>
+      <w:r>
+        <w:rPr>
+          <w:rStyle w:val="VerbatimChar"/>
+        </w:rPr>
+        <w:t xml:space="preserve">results/tables/SUPPLEMENTARY_INDEX.md</w:t>
+      </w:r>
+      <w:r>
+        <w:t xml:space="preserve">.</w:t>
       </w:r>
     </w:p>
     <w:bookmarkEnd w:id="42"/>

</xml_diff>

<commit_message>
Abstract as continuous prose; punctuation pass
Abstract converted from labelled subheadings to continuous prose while
retaining the ICMJE content elements in order: context, purpose,
procedures, findings with effect sizes, conclusions. 245 words.

Em dashes replaced with conventional punctuation across the manuscript,
README and METHODOLOGY, rewritten in context rather than substituted
blindly. En dashes retained, being correct in numeric ranges, page ranges
and compound names such as Jonckheere-Terpstra.

Co-Authored-By: Claude Opus 5 <noreply@anthropic.com>
</commit_message>
<xml_diff>
--- a/manuscript/manuscript_revised.docx
+++ b/manuscript/manuscript_revised.docx
@@ -195,7 +195,7 @@
         <w:pStyle w:val="FirstParagraph"/>
       </w:pPr>
       <w:r>
-        <w:t xml:space="preserve">Nucleolin (NCL) is an established cancer target, but its relationship to the tumour immune microenvironment has not been examined systematically. Across 9,358 tumours from 33 cancer types we show that NCL marks a proliferative, immune-excluded phenotype and co-expresses with tumour-cell-intrinsic immunosuppressive ligands — most consistently B7-H3 (CD276), and additionally CD73 and CD39 — rather than with T-cell checkpoint receptors. We further show that total NCL transcript abundance carries little prognostic information independent of stage and grade, which is consistent with prior immunohistochemical evidence that the prognostic effect of NCL depends on its subcellular localisation. NCL-high, immune-excluded tumours may represent a setting in which B7-H3-directed rather than T-cell-checkpoint-directed strategies are worth evaluating.</w:t>
+        <w:t xml:space="preserve">Nucleolin (NCL) is an established cancer target, but its relationship to the tumour immune microenvironment has not been examined systematically. Across 9,358 tumours from 33 cancer types we show that NCL marks a proliferative, immune-excluded phenotype and co-expresses with tumour-cell-intrinsic immunosuppressive ligands, most consistently B7-H3 (CD276) and additionally CD73 and CD39, rather than with T-cell checkpoint receptors. We further show that total NCL transcript abundance carries little prognostic information independent of stage and grade, which is consistent with prior immunohistochemical evidence that the prognostic effect of NCL depends on its subcellular localisation. NCL-high, immune-excluded tumours may represent a setting in which B7-H3-directed rather than T-cell-checkpoint-directed strategies are worth evaluating.</w:t>
       </w:r>
     </w:p>
     <w:bookmarkEnd w:id="9"/>
@@ -213,71 +213,7 @@
         <w:pStyle w:val="FirstParagraph"/>
       </w:pPr>
       <w:r>
-        <w:rPr>
-          <w:b/>
-          <w:bCs/>
-        </w:rPr>
-        <w:t xml:space="preserve">Objectives.</w:t>
-      </w:r>
-      <w:r>
-        <w:t xml:space="preserve"> </w:t>
-      </w:r>
-      <w:r>
-        <w:t xml:space="preserve">Nucleolin (NCL) is an established cancer target proposed to shape the tumour immune microenvironment, but this has not been tested systematically. We asked how NCL relates to immune phenotype and checkpoint molecules, and whether it is prognostic independent of clinical covariates.</w:t>
-      </w:r>
-    </w:p>
-    <w:p>
-      <w:pPr>
-        <w:pStyle w:val="BodyText"/>
-      </w:pPr>
-      <w:r>
-        <w:rPr>
-          <w:b/>
-          <w:bCs/>
-        </w:rPr>
-        <w:t xml:space="preserve">Methods.</w:t>
-      </w:r>
-      <w:r>
-        <w:t xml:space="preserve"> </w:t>
-      </w:r>
-      <w:r>
-        <w:t xml:space="preserve">We analysed 9,358 TCGA tumours across 33 cancer types against 7,262 GTEx and 727 adjacent normal samples using uniformly reprocessed transcriptomes. Differential expression used Wilcoxon tests with Cliff’s delta and stage trends the Jonckheere–Terpstra test. Three survival endpoints were modelled by multivariable Cox regression adjusting for age, sex, stage and grade, with proportional-hazards checks. Immune infiltration was estimated by seven deconvolution algorithms as purity-adjusted partial correlations; checkpoint correlations were additionally proliferation-adjusted. All test families were Benjamini–Hochberg corrected, and findings validated in nine CPTAC cohorts.</w:t>
-      </w:r>
-    </w:p>
-    <w:p>
-      <w:pPr>
-        <w:pStyle w:val="BodyText"/>
-      </w:pPr>
-      <w:r>
-        <w:rPr>
-          <w:b/>
-          <w:bCs/>
-        </w:rPr>
-        <w:t xml:space="preserve">Results.</w:t>
-      </w:r>
-      <w:r>
-        <w:t xml:space="preserve"> </w:t>
-      </w:r>
-      <w:r>
-        <w:t xml:space="preserve">NCL was overexpressed in 24 of 29 evaluable cancers (Cliff’s delta up to +0.93, q&lt;0.05) and reduced in ovarian carcinoma (−0.27). A stage-ordered increase occurred in only 2 of 17 cancers. After adjustment and FDR correction, NCL remained independently prognostic in only two cancers: KIRP (overall survival HR 2.12, 95% CI 1.37–3.29) and ACC (progression-free HR 2.41, 1.40–4.16). Seven of nine CPTAC cohorts confirmed elevated NCL protein. NCL correlated negatively with microenvironment score (20/20 cancers) and positively with B7-H3 in 21 of 33, whereas CTLA-4, PD-1 and TIM-3 were uncorrelated.</w:t>
-      </w:r>
-    </w:p>
-    <w:p>
-      <w:pPr>
-        <w:pStyle w:val="BodyText"/>
-      </w:pPr>
-      <w:r>
-        <w:rPr>
-          <w:b/>
-          <w:bCs/>
-        </w:rPr>
-        <w:t xml:space="preserve">Conclusion.</w:t>
-      </w:r>
-      <w:r>
-        <w:t xml:space="preserve"> </w:t>
-      </w:r>
-      <w:r>
-        <w:t xml:space="preserve">NCL associates with tumour-intrinsic immunosuppressive ligands and an immune-excluded phenotype rather than T-cell checkpoints. Total NCL transcript carries little prognostic information independent of stage and grade, consistent with prior evidence that its effect is localisation-dependent.</w:t>
+        <w:t xml:space="preserve">Nucleolin (NCL) is an established cancer target that has been proposed to shape the tumour immune microenvironment, but this has not been tested systematically across cancers. We analysed 9,358 TCGA tumours from 33 cancer types against 7,262 GTEx and 727 adjacent normal samples using uniformly reprocessed transcriptomes, assessing differential expression by Wilcoxon tests with Cliff’s delta and stage association by the Jonckheere–Terpstra trend test. Three survival endpoints were modelled by multivariable Cox regression adjusting for age, sex, stage and grade, with proportional-hazards checks. Immune infiltration was estimated by seven deconvolution algorithms as purity-adjusted partial correlations, with checkpoint correlations additionally proliferation-adjusted. All test families were Benjamini–Hochberg corrected and findings validated in nine independent CPTAC proteomic cohorts. NCL was overexpressed in 24 of 29 evaluable cancers (Cliff’s delta up to +0.93) and reduced in ovarian carcinoma; seven of nine CPTAC cohorts confirmed elevated NCL protein. A stage-ordered increase was present in only 2 of 17 cancers, and after covariate adjustment and FDR correction NCL remained independently prognostic in only two, KIRP (overall survival HR 2.12, 95% CI 1.37–3.29) and ACC (progression-free HR 2.41, 1.40–4.16). NCL correlated negatively with the microenvironment score in every cancer where the association was significant, and positively with B7-H3 in 21 of 33 cancers, whereas CTLA-4, PD-1 and TIM-3 were largely uncorrelated. NCL therefore associates with tumour-intrinsic immunosuppressive ligands and an immune-excluded phenotype rather than T-cell checkpoints, and its transcript-level prognostic value is limited, consistent with prior evidence that this effect is localisation-dependent.</w:t>
       </w:r>
     </w:p>
     <w:p>
@@ -332,7 +268,7 @@
         <w:t xml:space="preserve"> </w:t>
       </w:r>
       <w:r>
-        <w:t xml:space="preserve">Large public consortia — most notably The Cancer Genome Atlas (TCGA), the Genotype-Tissue Expression project (GTEx) and the Clinical Proteomic Tumor Analysis Consortium (CPTAC) — have made it feasible to evaluate a candidate molecule across the full spectrum of human malignancy rather than one tumour type at a time.</w:t>
+        <w:t xml:space="preserve">Large public consortia, most notably The Cancer Genome Atlas (TCGA), the Genotype-Tissue Expression project (GTEx) and the Clinical Proteomic Tumor Analysis Consortium (CPTAC), have made it feasible to evaluate a candidate molecule across the full spectrum of human malignancy rather than one tumour type at a time.</w:t>
       </w:r>
       <w:r>
         <w:rPr>
@@ -755,7 +691,7 @@
         <w:t xml:space="preserve"> </w:t>
       </w:r>
       <w:r>
-        <w:t xml:space="preserve">Survival endpoints are the curated definitions of the TCGA Clinical Data Resource — overall survival (OS), disease-specific survival (DSS) and progression-free survival (PFS) — which harmonise endpoint definitions across studies and are recommended in preference to raw TCGA follow-up fields.</w:t>
+        <w:t xml:space="preserve">Survival endpoints are the curated definitions of the TCGA Clinical Data Resource, comprising overall survival (OS), disease-specific survival (DSS) and progression-free survival (PFS), which harmonise endpoint definitions across studies and are recommended in preference to raw TCGA follow-up fields.</w:t>
       </w:r>
       <w:r>
         <w:rPr>
@@ -892,7 +828,7 @@
         <w:t xml:space="preserve"> </w:t>
       </w:r>
       <w:r>
-        <w:t xml:space="preserve">The distinction matters: a Kruskal–Wallis result establishes only that stages differ, not that expression rises with stage, and comparisons of each stage against normal tissue — as displayed by several web tools — do not test a stage-ordered trend at all. Cancers were included when at least three stage groups contained ≥5 patients and the cohort totalled ≥40 staged patients.</w:t>
+        <w:t xml:space="preserve">The distinction matters: a Kruskal–Wallis result establishes only that stages differ, not that expression rises with stage, and comparisons of each stage against normal tissue, as displayed by several web tools, do not test a stage-ordered trend at all. Cancers were included when at least three stage groups contained ≥5 patients and the cohort totalled ≥40 staged patients.</w:t>
       </w:r>
     </w:p>
     <w:bookmarkEnd w:id="14"/>
@@ -1510,7 +1446,7 @@
         <w:t xml:space="preserve"> </w:t>
       </w:r>
       <w:r>
-        <w:t xml:space="preserve">CPTAC provides an independent patient series, measured by mass spectrometry rather than sequencing, at the protein rather than the transcript level, with adjacent normal tissue from the same patients — making it the most stringent validation available without new experimental work. Tumour and normal samples were compared by Wilcoxon rank-sum test with Cliff’s delta, and by Wilcoxon signed-rank test where the same patient contributed both.</w:t>
+        <w:t xml:space="preserve">CPTAC provides an independent patient series, measured by mass spectrometry rather than sequencing, at the protein rather than the transcript level, with adjacent normal tissue from the same patients, making it the most stringent validation available without new experimental work. Tumour and normal samples were compared by Wilcoxon rank-sum test with Cliff’s delta, and by Wilcoxon signed-rank test where the same patient contributed both.</w:t>
       </w:r>
     </w:p>
     <w:bookmarkEnd w:id="19"/>
@@ -1571,7 +1507,7 @@
         <w:pStyle w:val="FirstParagraph"/>
       </w:pPr>
       <w:r>
-        <w:t xml:space="preserve">Analyses are deterministic given fixed random seeds (bootstrap resampling of Cliff’s delta, seed 0, 2,000 resamples; GSEA permutation, seed 0, 1,000 permutations). Because the public resources used here are not archival — UCSC Xena, TIMER2.0 and MSigDB reissue files at stable URLs, cBioPortal serves a live API, and the</w:t>
+        <w:t xml:space="preserve">Analyses are deterministic given fixed random seeds (bootstrap resampling of Cliff’s delta, seed 0, 2,000 resamples; GSEA permutation, seed 0, 1,000 permutations). Because the public resources used here are not archival (UCSC Xena, TIMER2.0 and MSigDB reissue files at stable URLs, cBioPortal serves a live API, and the</w:t>
       </w:r>
       <w:r>
         <w:t xml:space="preserve"> </w:t>
@@ -1586,7 +1522,7 @@
         <w:t xml:space="preserve"> </w:t>
       </w:r>
       <w:r>
-        <w:t xml:space="preserve">package retrieves data at run time — a run manifest recording the SHA-256 checksum, byte size and retrieval date of every input file, the shape and checksum of every result table, and the resolved version of every package affecting a numeric result is generated by</w:t>
+        <w:t xml:space="preserve">package retrieves data at run time), a run manifest recording the SHA-256 checksum, byte size and retrieval date of every input file, the shape and checksum of every result table, and the resolved version of every package affecting a numeric result is generated by</w:t>
       </w:r>
       <w:r>
         <w:t xml:space="preserve"> </w:t>
@@ -1652,15 +1588,15 @@
         <w:pStyle w:val="BodyText"/>
       </w:pPr>
       <w:r>
-        <w:t xml:space="preserve">An important qualification emerged when the same comparison was repeated against TCGA adjacent normal tissue (Figure 1b). Twelve cancers were significant against both comparators; ten agreed in direction, but two did not. In KIRP, NCL was higher than GTEx kidney (delta +0.63, q=5.1×10⁻⁸) yet lower than adjacent normal kidney (delta −0.29, q=1.1×10⁻²). The same reversal occurred in THCA (+0.37 versus −0.27), and the discordance extended to KICH (+0.19, not significant, versus −0.80, q=1.6×10⁻⁸) and KIRC (+0.78 versus −0.07, not significant). The kidney and thyroid are therefore cancers in which the reported direction of NCL dysregulation is determined by the reference tissue chosen rather than by the tumour. Adjacent normal kidney is not histologically inert — it is subject to field effects, inflammation and, in nephrectomy specimens, ischaemic injury — whereas GTEx tissue is post-mortem, and ribosome-biogenesis genes such as NCL are sensitive to both. We therefore report both comparators throughout and restrict confident claims of overexpression to cancers where they agree.</w:t>
-      </w:r>
-    </w:p>
-    <w:p>
-      <w:pPr>
-        <w:pStyle w:val="BodyText"/>
-      </w:pPr>
-      <w:r>
-        <w:t xml:space="preserve">This has practical consequences for how NCL is described in individual cancers. Reports that NCL is reduced in renal or thyroid tumours are reconcilable with reports that it is elevated: both can be correct, depending on the reference tissue used. In cancers where the two comparators agree — including READ (delta +0.90, q=2.2×10⁻³⁸) and SKCM (+0.65, q=4.3×10⁻²⁵) — elevation is unambiguous.</w:t>
+        <w:t xml:space="preserve">An important qualification emerged when the same comparison was repeated against TCGA adjacent normal tissue (Figure 1b). Twelve cancers were significant against both comparators; ten agreed in direction, but two did not. In KIRP, NCL was higher than GTEx kidney (delta +0.63, q=5.1×10⁻⁸) yet lower than adjacent normal kidney (delta −0.29, q=1.1×10⁻²). The same reversal occurred in THCA (+0.37 versus −0.27), and the discordance extended to KICH (+0.19, not significant, versus −0.80, q=1.6×10⁻⁸) and KIRC (+0.78 versus −0.07, not significant). The kidney and thyroid are therefore cancers in which the reported direction of NCL dysregulation is determined by the reference tissue chosen rather than by the tumour. Adjacent normal kidney is not histologically inert: it is subject to field effects, inflammation and, in nephrectomy specimens, ischaemic injury, whereas GTEx tissue is post-mortem, and ribosome-biogenesis genes such as NCL are sensitive to both. We therefore report both comparators throughout and restrict confident claims of overexpression to cancers where they agree.</w:t>
+      </w:r>
+    </w:p>
+    <w:p>
+      <w:pPr>
+        <w:pStyle w:val="BodyText"/>
+      </w:pPr>
+      <w:r>
+        <w:t xml:space="preserve">This has practical consequences for how NCL is described in individual cancers. Reports that NCL is reduced in renal or thyroid tumours are reconcilable with reports that it is elevated: both can be correct, depending on the reference tissue used. In cancers where the two comparators agree, including READ (delta +0.90, q=2.2×10⁻³⁸) and SKCM (+0.65, q=4.3×10⁻²⁵), elevation is unambiguous.</w:t>
       </w:r>
     </w:p>
     <w:bookmarkEnd w:id="23"/>
@@ -1728,7 +1664,7 @@
         <w:pStyle w:val="BodyText"/>
       </w:pPr>
       <w:r>
-        <w:t xml:space="preserve">After adjustment for age, sex, stage and grade, and FDR correction, this largely did not survive (Figure 2; Table 3). NCL remained independently associated with outcome in a single cancer per endpoint: KIRP for overall survival (HR 2.12 per SD, 95% CI 1.37–3.29, q=0.019, 38 events) and disease-specific survival (HR 2.90, 1.60–5.27, q=0.0099, 25 events), and ACC for progression-free survival (HR 2.41, 1.40–4.16, q=0.044, 38 events). The proportional-hazards assumption held for the NCL term in both, supporting interpretation of these hazard ratios as constant effects. Across all endpoints the assumption was violated in 10 of 74 models — consistently in KIRC and LUAD — and those hazard ratios are flagged in Table 3 and should not be read as time-invariant.</w:t>
+        <w:t xml:space="preserve">After adjustment for age, sex, stage and grade, and FDR correction, this largely did not survive (Figure 2; Table 3). NCL remained independently associated with outcome in a single cancer per endpoint: KIRP for overall survival (HR 2.12 per SD, 95% CI 1.37–3.29, q=0.019, 38 events) and disease-specific survival (HR 2.90, 1.60–5.27, q=0.0099, 25 events), and ACC for progression-free survival (HR 2.41, 1.40–4.16, q=0.044, 38 events). The proportional-hazards assumption held for the NCL term in both, supporting interpretation of these hazard ratios as constant effects. Across all endpoints the assumption was violated in 10 of 74 models, consistently in KIRC and LUAD, and those hazard ratios are flagged in Table 3 and should not be read as time-invariant.</w:t>
       </w:r>
     </w:p>
     <w:p>
@@ -1762,7 +1698,7 @@
         <w:pStyle w:val="BodyText"/>
       </w:pPr>
       <w:r>
-        <w:t xml:space="preserve">Cell-type-level results were consistent with this. Values below are the median purity-adjusted correlation across every algorithm that resolves the cell type, with the range of the estimates that reached significance in parentheses. Among the strongest concordant associations were reduced CD8⁺ T cells in SKCM (median rho −0.32; significant estimates −0.43 to −0.25 across 5 of 7 algorithms, n=102) and ACC (−0.31; −0.34 to −0.31, 4 of 7, n=77); reduced macrophages in GBM (−0.46; −0.46 to −0.46, n=151), KIRP (−0.39; −0.44 to −0.39, n=288), LUSC (−0.33; −0.36 to −0.33, n=498) and OV (−0.32; −0.39 to −0.31, n=300); and reduced cancer-associated fibroblasts in PRAD (−0.46; −0.55 to −0.46, n=495). NCL-high tumours are thus, in general, immune- and stroma-poor — a phenotype consistent with a proliferative, tumour-cell-rich compartment.</w:t>
+        <w:t xml:space="preserve">Cell-type-level results were consistent with this. Values below are the median purity-adjusted correlation across every algorithm that resolves the cell type, with the range of the estimates that reached significance in parentheses. Among the strongest concordant associations were reduced CD8⁺ T cells in SKCM (median rho −0.32; significant estimates −0.43 to −0.25 across 5 of 7 algorithms, n=102) and ACC (−0.31; −0.34 to −0.31, 4 of 7, n=77); reduced macrophages in GBM (−0.46; −0.46 to −0.46, n=151), KIRP (−0.39; −0.44 to −0.39, n=288), LUSC (−0.33; −0.36 to −0.33, n=498) and OV (−0.32; −0.39 to −0.31, n=300); and reduced cancer-associated fibroblasts in PRAD (−0.46; −0.55 to −0.46, n=495). NCL-high tumours are thus, in general, immune- and stroma-poor, a phenotype consistent with a proliferative, tumour-cell-rich compartment.</w:t>
       </w:r>
     </w:p>
     <w:p>
@@ -1846,7 +1782,7 @@
         <w:t xml:space="preserve"> </w:t>
       </w:r>
       <w:r>
-        <w:t xml:space="preserve">(B7-H3): positive and significant in 21 of 33 cancers, with no cancer showing a significant negative association (median rho +0.34). The strongest were ACC (rho +0.58, 95% CI +0.39 to +0.72, n=77), LIHC (+0.52, +0.43 to +0.59, n=369), PRAD (+0.50, +0.43 to +0.57, n=495), READ (+0.48, +0.29 to +0.63, n=92), GBM (+0.47, +0.33 to +0.60, n=151), THCA (+0.47, +0.40 to +0.54, n=500) and KIRC (+0.46, +0.38 to +0.53, n=530). After adjustment for both purity and proliferation the association is attenuated but retained, with partial correlations across the 21 robust cancers spanning +0.17 to +0.53. The twelve cancers in which the association was not robust were CHOL, DLBC, ESCA, KICH, LAML, MESO, PAAD, SARC, SKCM, TGCT, UCS and UVM — a group weighted towards the smallest cohorts and the non-carcinoma histologies. Associations with the two principal components of the adenosine axis followed the same pattern:</w:t>
+        <w:t xml:space="preserve">(B7-H3): positive and significant in 21 of 33 cancers, with no cancer showing a significant negative association (median rho +0.34). The strongest were ACC (rho +0.58, 95% CI +0.39 to +0.72, n=77), LIHC (+0.52, +0.43 to +0.59, n=369), PRAD (+0.50, +0.43 to +0.57, n=495), READ (+0.48, +0.29 to +0.63, n=92), GBM (+0.47, +0.33 to +0.60, n=151), THCA (+0.47, +0.40 to +0.54, n=500) and KIRC (+0.46, +0.38 to +0.53, n=530). After adjustment for both purity and proliferation the association is attenuated but retained, with partial correlations across the 21 robust cancers spanning +0.17 to +0.53. The twelve cancers in which the association was not robust were CHOL, DLBC, ESCA, KICH, LAML, MESO, PAAD, SARC, SKCM, TGCT, UCS and UVM, a group weighted towards the smallest cohorts and the non-carcinoma histologies. Associations with the two principal components of the adenosine axis followed the same pattern:</w:t>
       </w:r>
       <w:r>
         <w:t xml:space="preserve"> </w:t>
@@ -1886,15 +1822,15 @@
         <w:pStyle w:val="BodyText"/>
       </w:pPr>
       <w:r>
-        <w:t xml:space="preserve">By contrast, the T-cell checkpoint receptors were weakly and inconsistently associated, and where associations did reach significance they were as often negative as positive. PD-1 was robust in 3 of 33 cancers (positive in BLCA; negative in SKCM and THCA) and CTLA-4 in 4 of 33 (positive in BLCA; negative in LUSC, OV and THCA; median rho +0.02). TIGIT was robust in 5 (proliferation-adjusted rho −0.21 to +0.21), LAG-3 in 6 — negative in all six (KIRC, OV, PRAD, SARC, THCA, UCS; −0.55 to −0.17) — and TIM-3 in 9 of 33 (median rho +0.05; −0.25 to +0.35). For CTLA-4 and PD-1 the robust estimates spanned −0.25 to +0.15 and −0.27 to +0.12 respectively, so even where significant they are small and of inconsistent sign. PD-L1 was robust in 7 of 33, all positive (BLCA, BRCA, KICH, KIRC, LIHC, PAAD, PCPG; median rho +0.17), and TGF-β1 in 6 of 33.</w:t>
-      </w:r>
-    </w:p>
-    <w:p>
-      <w:pPr>
-        <w:pStyle w:val="BodyText"/>
-      </w:pPr>
-      <w:r>
-        <w:t xml:space="preserve">This distinction is biologically coherent. B7-H3, CD73 and CD39 are expressed by tumour cells themselves, whereas PD-1, CTLA-4, LAG-3 and TIGIT are expressed principally by infiltrating lymphocytes. A tumour-cell-expressed gene such as NCL would be expected to covary with the former and not with the latter — and, given the inverse relationship between NCL and immune content described above, to correlate negatively rather than positively with lymphocyte-restricted transcripts. That the observed pattern matches this expectation, and persists after adjustment for proliferation, argues that it is not merely an artefact of tumour cellularity.</w:t>
+        <w:t xml:space="preserve">By contrast, the T-cell checkpoint receptors were weakly and inconsistently associated, and where associations did reach significance they were as often negative as positive. PD-1 was robust in 3 of 33 cancers (positive in BLCA; negative in SKCM and THCA) and CTLA-4 in 4 of 33 (positive in BLCA; negative in LUSC, OV and THCA; median rho +0.02). TIGIT was robust in 5 (proliferation-adjusted rho −0.21 to +0.21), LAG-3 in 6, negative in all six (KIRC, OV, PRAD, SARC, THCA, UCS; −0.55 to −0.17), and TIM-3 in 9 of 33 (median rho +0.05; −0.25 to +0.35). For CTLA-4 and PD-1 the robust estimates spanned −0.25 to +0.15 and −0.27 to +0.12 respectively, so even where significant they are small and of inconsistent sign. PD-L1 was robust in 7 of 33, all positive (BLCA, BRCA, KICH, KIRC, LIHC, PAAD, PCPG; median rho +0.17), and TGF-β1 in 6 of 33.</w:t>
+      </w:r>
+    </w:p>
+    <w:p>
+      <w:pPr>
+        <w:pStyle w:val="BodyText"/>
+      </w:pPr>
+      <w:r>
+        <w:t xml:space="preserve">This distinction is biologically coherent. B7-H3, CD73 and CD39 are expressed by tumour cells themselves, whereas PD-1, CTLA-4, LAG-3 and TIGIT are expressed principally by infiltrating lymphocytes. A tumour-cell-expressed gene such as NCL would be expected to covary with the former and not with the latter. Given the inverse relationship between NCL and immune content described above, to correlate negatively rather than positively with lymphocyte-restricted transcripts. That the observed pattern matches this expectation, and persists after adjustment for proliferation, argues that it is not merely an artefact of tumour cellularity.</w:t>
       </w:r>
     </w:p>
     <w:p>
@@ -2028,7 +1964,7 @@
         <w:pStyle w:val="BodyText"/>
       </w:pPr>
       <w:r>
-        <w:t xml:space="preserve">Two features of this result matter for interpretation. First, it recovers NCL’s established biology — ribosome biogenesis, RNA processing, chromatin function — from an unsupervised, correlation-ranked analysis, which supports the validity of the ranking statistic. Second, and more importantly,</w:t>
+        <w:t xml:space="preserve">Two features of this result matter for interpretation. First, it recovers NCL’s established biology (ribosome biogenesis, RNA processing and chromatin function) from an unsupervised, correlation-ranked analysis, which supports the validity of the ranking statistic. Second, and more importantly,</w:t>
       </w:r>
       <w:r>
         <w:t xml:space="preserve"> </w:t>
@@ -2193,7 +2129,7 @@
         <w:pStyle w:val="BodyText"/>
       </w:pPr>
       <w:r>
-        <w:t xml:space="preserve">The practical implication is specific. If NCL is to be used prognostically, the measurement must resolve subcellular localisation — which means immunohistochemistry or an equivalent spatial assay, not bulk expression. Reports of transcript-level NCL prognostic value in individual cancers, including our own earlier analysis, should be interpreted with that constraint in mind, particularly where clinical covariates were not modelled: the attenuation we observe between univariate and adjusted models is exactly what one expects of a proliferation-coupled gene, since proliferation is already embedded in grade and stage.</w:t>
+        <w:t xml:space="preserve">The practical implication is specific. If NCL is to be used prognostically, the measurement must resolve subcellular localisation, which means immunohistochemistry or an equivalent spatial assay rather than bulk expression. Reports of transcript-level NCL prognostic value in individual cancers, including our own earlier analysis, should be interpreted with that constraint in mind, particularly where clinical covariates were not modelled: the attenuation we observe between univariate and adjusted models is exactly what one expects of a proliferation-coupled gene, since proliferation is already embedded in grade and stage.</w:t>
       </w:r>
     </w:p>
     <w:p>
@@ -2219,7 +2155,7 @@
         <w:pStyle w:val="FirstParagraph"/>
       </w:pPr>
       <w:r>
-        <w:t xml:space="preserve">The most robust immune finding is the association between NCL and B7-H3 (CD276), positive in 21 of 33 cancers after adjustment for both purity and proliferation, and negative in none. B7-H3 is an attractive comparison for NCL: both are broadly overexpressed across carcinomas, both reach the tumour-cell surface, and both are being pursued as surface-targeting opportunities. B7-H3 is currently the subject of extensive clinical development, including antibody–drug conjugates and CAR-T approaches, and is notable for being expressed in tumours that are not inflamed — the immune-excluded setting in which conventional PD-1/PD-L1 blockade performs poorly.</w:t>
+        <w:t xml:space="preserve">The most robust immune finding is the association between NCL and B7-H3 (CD276), positive in 21 of 33 cancers after adjustment for both purity and proliferation, and negative in none. B7-H3 is an attractive comparison for NCL: both are broadly overexpressed across carcinomas, both reach the tumour-cell surface, and both are being pursued as surface-targeting opportunities. B7-H3 is currently the subject of extensive clinical development, including antibody–drug conjugates and CAR-T approaches, and is notable for being expressed in tumours that are not inflamed, the immune-excluded setting in which conventional PD-1/PD-L1 blockade performs poorly.</w:t>
       </w:r>
       <w:r>
         <w:rPr>
@@ -2245,7 +2181,7 @@
         <w:t xml:space="preserve"> </w:t>
       </w:r>
       <w:r>
-        <w:t xml:space="preserve">We emphasise that this is an association-level observation and a hypothesis for testing, not a demonstrated mechanism; nothing in these data establishes that NCL regulates B7-H3 or that either is causal for the immune phenotype. The relevant experiment — perturbing NCL and measuring B7-H3 and immune composition — has not been performed here.</w:t>
+        <w:t xml:space="preserve">We emphasise that this is an association-level observation and a hypothesis for testing, not a demonstrated mechanism; nothing in these data establishes that NCL regulates B7-H3 or that either is causal for the immune phenotype. The relevant experiment, perturbing NCL and measuring B7-H3 and immune composition, has not been performed here.</w:t>
       </w:r>
     </w:p>
     <w:bookmarkEnd w:id="34"/>
@@ -2279,7 +2215,7 @@
         <w:pStyle w:val="BodyText"/>
       </w:pPr>
       <w:r>
-        <w:t xml:space="preserve">This is also why we regard the B7-H3 result as the most interesting finding rather than a corollary of proliferation. Proliferation is the dominant axis of NCL covariation, so an immune association that persists after explicit adjustment for a proliferation score — as the B7-H3, CD73 and CD39 associations do, while most T-cell checkpoint associations do not — is not simply a restatement of that axis.</w:t>
+        <w:t xml:space="preserve">This is also why we regard the B7-H3 result as the most interesting finding rather than a corollary of proliferation. Proliferation is the dominant axis of NCL covariation, so an immune association that persists after explicit adjustment for a proliferation score, as the B7-H3, CD73 and CD39 associations do while most T-cell checkpoint associations do not, is not simply a restatement of that axis.</w:t>
       </w:r>
     </w:p>
     <w:bookmarkEnd w:id="35"/>
@@ -2329,7 +2265,7 @@
         <w:pStyle w:val="BodyText"/>
       </w:pPr>
       <w:r>
-        <w:t xml:space="preserve">The second concerns the choice of normal comparator. In kidney and thyroid cancers the direction of NCL dysregulation depends on whether GTEx or adjacent normal tissue is used. Neither is simply correct: adjacent normal tissue shares the patient’s genetic background and exposures but is subject to field effects and surgical ischaemia, while GTEx tissue is unaffected by the tumour but post-mortem and from different individuals. For genes sensitive to metabolic and ischaemic state — which includes most of the ribosome-biogenesis machinery — this choice is consequential and should be reported rather than made silently.</w:t>
+        <w:t xml:space="preserve">The second concerns the choice of normal comparator. In kidney and thyroid cancers the direction of NCL dysregulation depends on whether GTEx or adjacent normal tissue is used. Neither is simply correct: adjacent normal tissue shares the patient’s genetic background and exposures but is subject to field effects and surgical ischaemia, while GTEx tissue is unaffected by the tumour but post-mortem and from different individuals. For genes sensitive to metabolic and ischaemic state, which includes most of the ribosome-biogenesis machinery, this choice is consequential and should be reported rather than made silently.</w:t>
       </w:r>
     </w:p>
     <w:bookmarkEnd w:id="36"/>
@@ -2348,15 +2284,15 @@
         <w:pStyle w:val="FirstParagraph"/>
       </w:pPr>
       <w:r>
-        <w:t xml:space="preserve">The central limitation is that this study generates no new experimental data. We have validated as far as is possible computationally, in an independent patient series measured on an orthogonal platform at the protein level with paired adjacent normal tissue (CPTAC). This is a genuine and reasonably stringent form of external validation, and it substantiates the overexpression claim. It is not, however, a substitute for functional experimentation, and none of the mechanistic hypotheses advanced in Section 4.2 is tested by it. The association between NCL and B7-H3 in particular requires perturbation experiments — NCL knockdown or overexpression with measurement of B7-H3 and of immune composition — before any regulatory relationship can be claimed. We state plainly that this work does not provide that evidence.</w:t>
-      </w:r>
-    </w:p>
-    <w:p>
-      <w:pPr>
-        <w:pStyle w:val="BodyText"/>
-      </w:pPr>
-      <w:r>
-        <w:t xml:space="preserve">Further limitations follow from the data sources. Transcriptome deconvolution infers cell composition from bulk expression and is not a measurement of infiltration; the poor cross-algorithm concordance documented in Section 3.5 is itself evidence of this limitation, and single-cell or spatial data would be required to resolve the cell-type associations convincingly. Six TCGA–GTEx tissue pairings are approximate and are flagged as such; three cancers have no acceptable GTEx counterpart. Several cohorts are small — CHOL (36 tumours), KICH (65), UCS (57) — so that the absence of a significant association in those cancers reflects limited power as much as absence of effect, and KICH in particular could not be modelled for overall survival. Stage and grade are unavailable for some cancers, so the covariate set differs between models; the covariates used are recorded for every model. The proportional-hazards assumption was violated for the NCL term in 10 of 74 models, and those hazard ratios summarise time-varying effects. Finally, TCGA is predominantly composed of treatment-naive primary resections from a limited set of populations, and prognostic associations derived from it need not transfer to treated, metastatic or differently ascertained populations.</w:t>
+        <w:t xml:space="preserve">The central limitation is that this study generates no new experimental data. We have validated as far as is possible computationally, in an independent patient series measured on an orthogonal platform at the protein level with paired adjacent normal tissue (CPTAC). This is a genuine and reasonably stringent form of external validation, and it substantiates the overexpression claim. It is not, however, a substitute for functional experimentation, and none of the mechanistic hypotheses advanced in Section 4.2 is tested by it. The association between NCL and B7-H3 in particular requires perturbation experiments, namely NCL knockdown or overexpression with measurement of B7-H3 and of immune composition, before any regulatory relationship can be claimed. We state plainly that this work does not provide that evidence.</w:t>
+      </w:r>
+    </w:p>
+    <w:p>
+      <w:pPr>
+        <w:pStyle w:val="BodyText"/>
+      </w:pPr>
+      <w:r>
+        <w:t xml:space="preserve">Further limitations follow from the data sources. Transcriptome deconvolution infers cell composition from bulk expression and is not a measurement of infiltration; the poor cross-algorithm concordance documented in Section 3.5 is itself evidence of this limitation, and single-cell or spatial data would be required to resolve the cell-type associations convincingly. Six TCGA–GTEx tissue pairings are approximate and are flagged as such; three cancers have no acceptable GTEx counterpart. Several cohorts are small, including CHOL (36 tumours), KICH (65) and UCS (57), so that the absence of a significant association in those cancers reflects limited power as much as absence of effect, and KICH in particular could not be modelled for overall survival. Stage and grade are unavailable for some cancers, so the covariate set differs between models; the covariates used are recorded for every model. The proportional-hazards assumption was violated for the NCL term in 10 of 74 models, and those hazard ratios summarise time-varying effects. Finally, TCGA is predominantly composed of treatment-naive primary resections from a limited set of populations, and prognostic associations derived from it need not transfer to treated, metastatic or differently ascertained populations.</w:t>
       </w:r>
     </w:p>
     <w:bookmarkEnd w:id="38"/>
@@ -3263,7 +3199,7 @@
         <w:t xml:space="preserve"> </w:t>
       </w:r>
       <w:r>
-        <w:t xml:space="preserve">for the same cell type in the same cancer, and the number with no or insufficient signal. Each bar totals the 33 cancers analysed. What differs between cell types is the number of algorithms available to resolve them, ranging from two to seven — lowest for cancer-associated fibroblast, endothelial cell and macrophage (at most three) and highest for CD8⁺ T cell (up to seven). The algorithm count for every cancer and cell type is given in Supplementary Table S6. (b) Correlation between NCL and the xCell immune, stromal and microenvironment scores in each cancer; cancers are ordered by microenvironment score. Points to the left of zero indicate that NCL-high tumours are immune- or stroma-poor. (c) Distribution of purity-adjusted partial Spearman correlations between NCL and infiltration estimates, separately for each of the seven deconvolution algorithms, pooled over all cancers and cell types; the spread illustrates how much the estimate depends on the algorithm chosen.</w:t>
+        <w:t xml:space="preserve">for the same cell type in the same cancer, and the number with no or insufficient signal. Each bar totals the 33 cancers analysed. What differs between cell types is the number of algorithms available to resolve them, ranging from two to seven: lowest for cancer-associated fibroblast, endothelial cell and macrophage (at most three) and highest for CD8⁺ T cell (up to seven). The algorithm count for every cancer and cell type is given in Supplementary Table S6. (b) Correlation between NCL and the xCell immune, stromal and microenvironment scores in each cancer; cancers are ordered by microenvironment score. Points to the left of zero indicate that NCL-high tumours are immune- or stroma-poor. (c) Distribution of purity-adjusted partial Spearman correlations between NCL and infiltration estimates, separately for each of the seven deconvolution algorithms, pooled over all cancers and cell types; the spread illustrates how much the estimate depends on the algorithm chosen.</w:t>
       </w:r>
     </w:p>
     <w:p>
@@ -3349,7 +3285,7 @@
         <w:t xml:space="preserve"> </w:t>
       </w:r>
       <w:r>
-        <w:t xml:space="preserve">Normalised enrichment scores from pre-ranked GSEA of genes ranked by within-cancer correlation with NCL, for Hallmark and Reactome gene sets showing consistent direction across cancers. The sixteen most frequently significant direction-consistent gene sets are shown for each collection. The fraction beside each pathway (e.g. 32/32, 26/32) is the number of the 32 analysable cancers in which that gene set reached q&lt;0.05, out of the total tested; bar length is the median NES across the cancers in which it was significant. Cancers not counted are those in which the set did not reach significance, not those with opposite-direction enrichment — no gene set shown here was significantly enriched in opposing directions in different cancers. Section 3.9 names the exceptions for the near-complete sets, and the full per-cancer results are in Supplementary Table S10.</w:t>
+        <w:t xml:space="preserve">Normalised enrichment scores from pre-ranked GSEA of genes ranked by within-cancer correlation with NCL, for Hallmark and Reactome gene sets showing consistent direction across cancers. The sixteen most frequently significant direction-consistent gene sets are shown for each collection. The fraction beside each pathway (e.g. 32/32, 26/32) is the number of the 32 analysable cancers in which that gene set reached q&lt;0.05, out of the total tested; bar length is the median NES across the cancers in which it was significant. Cancers not counted are those in which the set did not reach significance, not those with opposite-direction enrichment; no gene set shown here was significantly enriched in opposing directions in different cancers. Section 3.9 names the exceptions for the near-complete sets, and the full per-cancer results are in Supplementary Table S10.</w:t>
       </w:r>
     </w:p>
     <w:bookmarkEnd w:id="41"/>

</xml_diff>

<commit_message>
Add submission manuscript with figures and tables embedded
13_build_submission.py renders publication-formatted Tables 1-6 from the
result tables and places each figure image beneath its legend, so the
DOCX carries the actual figures and tables rather than captions alone.

Figure-to-legend mapping is asserted at build time against a keyword in
each legend, so a renamed or missing figure fails loudly. Verified in the
built DOCX by walking the document body in order and matching each
embedded image to its source by SHA-256.

Code availability given its own declaration with the repository URL.

Co-Authored-By: Claude Opus 5 <noreply@anthropic.com>
</commit_message>
<xml_diff>
--- a/manuscript/manuscript_revised.docx
+++ b/manuscript/manuscript_revised.docx
@@ -1552,7 +1552,7 @@
         <w:t xml:space="preserve"> </w:t>
       </w:r>
       <w:r>
-        <w:t xml:space="preserve">before use, including a null-calibration check confirming a 5.7% type-I error rate for the trend test under the null and confirmation that a non-monotonic pattern is not reported as a trend. The complete workflow, environment specification and verification suite are provided in the accompanying repository.</w:t>
+        <w:t xml:space="preserve">before use, including a null-calibration check confirming a 5.7% type-I error rate for the trend test under the null and confirmation that a non-monotonic pattern is not reported as a trend. The complete workflow, environment specification, verification suite, run manifest and all intermediate result tables are openly available at https://github.com/ApexBlue11/ncl-pancancer-analysis.</w:t>
       </w:r>
     </w:p>
     <w:bookmarkEnd w:id="21"/>
@@ -2419,7 +2419,25 @@
         <w:t xml:space="preserve"> </w:t>
       </w:r>
       <w:r>
-        <w:t xml:space="preserve">Python package. All analysis code, the complete computational environment specification, intermediate result tables and a step-by-step methodology document are available at https://github.com/ApexBlue11/ncl-pancancer-analysis. No new data were generated.</w:t>
+        <w:t xml:space="preserve">Python package. No new data were generated by this study.</w:t>
+      </w:r>
+    </w:p>
+    <w:p>
+      <w:pPr>
+        <w:pStyle w:val="BodyText"/>
+      </w:pPr>
+      <w:r>
+        <w:rPr>
+          <w:b/>
+          <w:bCs/>
+        </w:rPr>
+        <w:t xml:space="preserve">Code availability:</w:t>
+      </w:r>
+      <w:r>
+        <w:t xml:space="preserve"> </w:t>
+      </w:r>
+      <w:r>
+        <w:t xml:space="preserve">All analysis code, the pinned software environment, the run manifest recording input checksums and package versions, every intermediate result table and a step-by-step methodology document are openly available at https://github.com/ApexBlue11/ncl-pancancer-analysis. The pipeline reproduces every number and figure reported here from public data.</w:t>
       </w:r>
     </w:p>
     <w:p>

</xml_diff>

<commit_message>
Update repository URL to the canonical name
Co-Authored-By: Claude Opus 5 <noreply@anthropic.com>
</commit_message>
<xml_diff>
--- a/manuscript/manuscript_revised.docx
+++ b/manuscript/manuscript_revised.docx
@@ -1552,7 +1552,7 @@
         <w:t xml:space="preserve"> </w:t>
       </w:r>
       <w:r>
-        <w:t xml:space="preserve">before use, including a null-calibration check confirming a 5.7% type-I error rate for the trend test under the null and confirmation that a non-monotonic pattern is not reported as a trend. The complete workflow, environment specification, verification suite, run manifest and all intermediate result tables are openly available at https://github.com/ApexBlue11/ncl-pancancer-analysis.</w:t>
+        <w:t xml:space="preserve">before use, including a null-calibration check confirming a 5.7% type-I error rate for the trend test under the null and confirmation that a non-monotonic pattern is not reported as a trend. The complete workflow, environment specification, verification suite, run manifest and all intermediate result tables are openly available at https://github.com/ApexBlue11/NCL-PanCancer-Analysis.</w:t>
       </w:r>
     </w:p>
     <w:bookmarkEnd w:id="21"/>
@@ -2437,7 +2437,7 @@
         <w:t xml:space="preserve"> </w:t>
       </w:r>
       <w:r>
-        <w:t xml:space="preserve">All analysis code, the pinned software environment, the run manifest recording input checksums and package versions, every intermediate result table and a step-by-step methodology document are openly available at https://github.com/ApexBlue11/ncl-pancancer-analysis. The pipeline reproduces every number and figure reported here from public data.</w:t>
+        <w:t xml:space="preserve">All analysis code, the pinned software environment, the run manifest recording input checksums and package versions, every intermediate result table and a step-by-step methodology document are openly available at https://github.com/ApexBlue11/NCL-PanCancer-Analysis. The pipeline reproduces every number and figure reported here from public data.</w:t>
       </w:r>
     </w:p>
     <w:p>

</xml_diff>

<commit_message>
Materialise supplementary tables under their S-numbers
The result tables existed only under working names (T1..T10), so locating
a table cited as S5 required consulting an index. All eleven supplementary
tables are now written under the numbers the manuscript cites:

  results/supplementary/S1..S11              one file per table
  Supplementary_Tables_S1-S10.xlsx           multi-sheet workbook
  results/supplementary/README.md            index with row counts

S11 (58,581 x 33) is distributed only as a compressed TSV, being too large
for the workbook.

The set is derived from the analysis outputs rather than copied by hand.
Workbook sheets verified against their sources (0 row-count mismatches);
all 11 filenames cited in the manuscript resolve to files on disk.

Co-Authored-By: Claude Opus 5 <noreply@anthropic.com>
</commit_message>
<xml_diff>
--- a/manuscript/manuscript_revised.docx
+++ b/manuscript/manuscript_revised.docx
@@ -3485,7 +3485,7 @@
         <w:rPr>
           <w:rStyle w:val="VerbatimChar"/>
         </w:rPr>
-        <w:t xml:space="preserve">T1_differential_expression.tsv</w:t>
+        <w:t xml:space="preserve">S2_differential_expression.tsv</w:t>
       </w:r>
       <w:r>
         <w:t xml:space="preserve">).</w:t>
@@ -3512,7 +3512,7 @@
         <w:rPr>
           <w:rStyle w:val="VerbatimChar"/>
         </w:rPr>
-        <w:t xml:space="preserve">T2_stage_association.tsv</w:t>
+        <w:t xml:space="preserve">S3_stage_association.tsv</w:t>
       </w:r>
       <w:r>
         <w:t xml:space="preserve">).</w:t>
@@ -3539,7 +3539,7 @@
         <w:rPr>
           <w:rStyle w:val="VerbatimChar"/>
         </w:rPr>
-        <w:t xml:space="preserve">T3_survival.tsv</w:t>
+        <w:t xml:space="preserve">S4_survival.tsv</w:t>
       </w:r>
       <w:r>
         <w:t xml:space="preserve">).</w:t>
@@ -3566,7 +3566,7 @@
         <w:rPr>
           <w:rStyle w:val="VerbatimChar"/>
         </w:rPr>
-        <w:t xml:space="preserve">T4_immune_infiltration.tsv</w:t>
+        <w:t xml:space="preserve">S5_immune_infiltration.tsv</w:t>
       </w:r>
       <w:r>
         <w:t xml:space="preserve">).</w:t>
@@ -3593,7 +3593,7 @@
         <w:rPr>
           <w:rStyle w:val="VerbatimChar"/>
         </w:rPr>
-        <w:t xml:space="preserve">T5_algorithm_concordance.tsv</w:t>
+        <w:t xml:space="preserve">S6_algorithm_concordance.tsv</w:t>
       </w:r>
       <w:r>
         <w:t xml:space="preserve">).</w:t>
@@ -3620,7 +3620,7 @@
         <w:rPr>
           <w:rStyle w:val="VerbatimChar"/>
         </w:rPr>
-        <w:t xml:space="preserve">T6_checkpoints.tsv</w:t>
+        <w:t xml:space="preserve">S7_immune_checkpoints.tsv</w:t>
       </w:r>
       <w:r>
         <w:t xml:space="preserve">).</w:t>
@@ -3647,7 +3647,7 @@
         <w:rPr>
           <w:rStyle w:val="VerbatimChar"/>
         </w:rPr>
-        <w:t xml:space="preserve">T8_genomic_scores.tsv</w:t>
+        <w:t xml:space="preserve">S8_genomic_and_immune_scores.tsv</w:t>
       </w:r>
       <w:r>
         <w:t xml:space="preserve">).</w:t>
@@ -3674,7 +3674,7 @@
         <w:rPr>
           <w:rStyle w:val="VerbatimChar"/>
         </w:rPr>
-        <w:t xml:space="preserve">T7_cptac_validation.tsv</w:t>
+        <w:t xml:space="preserve">S9_cptac_validation.tsv</w:t>
       </w:r>
       <w:r>
         <w:t xml:space="preserve">).</w:t>
@@ -3701,7 +3701,7 @@
         <w:rPr>
           <w:rStyle w:val="VerbatimChar"/>
         </w:rPr>
-        <w:t xml:space="preserve">T10_gsea_per_cancer.tsv.gz</w:t>
+        <w:t xml:space="preserve">S10_gsea_per_cancer.tsv.gz</w:t>
       </w:r>
       <w:r>
         <w:t xml:space="preserve">).</w:t>
@@ -3728,7 +3728,7 @@
         <w:rPr>
           <w:rStyle w:val="VerbatimChar"/>
         </w:rPr>
-        <w:t xml:space="preserve">T9_ncl_gene_correlations.tsv.gz</w:t>
+        <w:t xml:space="preserve">S11_ncl_gene_correlations.tsv.gz</w:t>
       </w:r>
       <w:r>
         <w:t xml:space="preserve">).</w:t>
@@ -3748,25 +3748,13 @@
         <w:rPr>
           <w:rStyle w:val="VerbatimChar"/>
         </w:rPr>
-        <w:t xml:space="preserve">results/tables/</w:t>
-      </w:r>
-      <w:r>
-        <w:t xml:space="preserve"> </w:t>
-      </w:r>
-      <w:r>
-        <w:t xml:space="preserve">of the accompanying repository; the same mapping is given in</w:t>
-      </w:r>
-      <w:r>
-        <w:t xml:space="preserve"> </w:t>
-      </w:r>
-      <w:r>
-        <w:rPr>
-          <w:rStyle w:val="VerbatimChar"/>
-        </w:rPr>
-        <w:t xml:space="preserve">results/tables/SUPPLEMENTARY_INDEX.md</w:t>
-      </w:r>
-      <w:r>
-        <w:t xml:space="preserve">.</w:t>
+        <w:t xml:space="preserve">results/supplementary/</w:t>
+      </w:r>
+      <w:r>
+        <w:t xml:space="preserve"> </w:t>
+      </w:r>
+      <w:r>
+        <w:t xml:space="preserve">of the accompanying repository, which also contains all of S1 to S10 as a single multi-sheet workbook.</w:t>
       </w:r>
     </w:p>
     <w:bookmarkEnd w:id="42"/>

</xml_diff>